<commit_message>
Name Uram Enerel NGO as legal host; add the two-organization framing
Co-Authored-By: Claude Fable 5.1 <noreply@anthropic.com>
</commit_message>
<xml_diff>
--- a/docs/01-sponsorship-proposal.docx
+++ b/docs/01-sponsorship-proposal.docx
@@ -25,7 +25,7 @@
         <w:pStyle w:val="FirstParagraph"/>
       </w:pPr>
       <w:r>
-        <w:t xml:space="preserve">Prepared October 7, 2026. Square brackets mark facts to fill in before this goes to a company.</w:t>
+        <w:t xml:space="preserve">Prepared October 7, 2026. Square brackets mark facts to fill in before this goes to a company: the government body and form of recognition, Uram Enerel's registration details, the venue, team numbers, contacts.</w:t>
       </w:r>
     </w:p>
     <w:p>
@@ -142,7 +142,36 @@
         <w:t xml:space="preserve"> </w:t>
       </w:r>
       <w:r>
-        <w:t xml:space="preserve">Organized by [NGO name], a registered Mongolian NGO [founded year, field], together with a student organizing team of [N] with experience running [MUN conferences / events for N+ participants]. Recognized by [government body]. Responsible adult: [name, title].</w:t>
+        <w:t xml:space="preserve">A collaboration between two organizations.</w:t>
+      </w:r>
+      <w:r>
+        <w:t xml:space="preserve"> </w:t>
+      </w:r>
+      <w:r>
+        <w:rPr>
+          <w:b/>
+          <w:bCs/>
+        </w:rPr>
+        <w:t xml:space="preserve">Hackathon Mongolia</w:t>
+      </w:r>
+      <w:r>
+        <w:t xml:space="preserve"> </w:t>
+      </w:r>
+      <w:r>
+        <w:t xml:space="preserve">is a student-run organizing collective (github.com/Hackathon-Mongolia) that designs and runs the program.</w:t>
+      </w:r>
+      <w:r>
+        <w:t xml:space="preserve"> </w:t>
+      </w:r>
+      <w:r>
+        <w:rPr>
+          <w:b/>
+          <w:bCs/>
+        </w:rPr>
+        <w:t xml:space="preserve">Uram Enerel NGO</w:t>
+      </w:r>
+      <w:r>
+        <w:t xml:space="preserve">, known publicly as Uram Care, is a registered Mongolian youth health NGO with 1,500+ volunteers and 15+ school chapters across Mongolia; it is the legal host, holds the money, and brings its school network and health expertise. Uram Enerel is recognized by [government body]. The organizing team of [N] has run [N] Model United Nations conferences for [N]+ delegates. Responsible adult: [name, title].</w:t>
       </w:r>
     </w:p>
     <w:p>
@@ -758,17 +787,7 @@
         <w:pStyle w:val="FirstParagraph"/>
       </w:pPr>
       <w:r>
-        <w:rPr>
-          <w:b/>
-          <w:bCs/>
-        </w:rPr>
-        <w:t xml:space="preserve">[NGO name]</w:t>
-      </w:r>
-      <w:r>
-        <w:t xml:space="preserve"> </w:t>
-      </w:r>
-      <w:r>
-        <w:t xml:space="preserve">— registered NGO, [registration year], [one sentence on its mission and past programs, with one number]. The NGO is the legal host: it signs sponsorship contracts, receives funds, pays vendors, issues receipts and reports.</w:t>
+        <w:t xml:space="preserve">Touch Grass is run by two organizations with clear roles.</w:t>
       </w:r>
     </w:p>
     <w:p>
@@ -780,13 +799,13 @@
           <w:b/>
           <w:bCs/>
         </w:rPr>
-        <w:t xml:space="preserve">Organizing team</w:t>
-      </w:r>
-      <w:r>
-        <w:t xml:space="preserve"> </w:t>
-      </w:r>
-      <w:r>
-        <w:t xml:space="preserve">— [N] students led by [co-organizer name] and Anar Tuvshinbayar. The team has organized [N] Model United Nations conferences for [N]+ delegates [and other events]. Teams: logistics, finance, marketing, operations.</w:t>
+        <w:t xml:space="preserve">Hackathon Mongolia</w:t>
+      </w:r>
+      <w:r>
+        <w:t xml:space="preserve"> </w:t>
+      </w:r>
+      <w:r>
+        <w:t xml:space="preserve">— a student-run organizing collective, not a registered entity, which is why no contract or money goes through it. It owns the program: the theme and tracks, the problem bank, registration, mentors, judges and rubric, the run-of-show, and these documents. Its public home is github.com/Hackathon-Mongolia. Led by Anar Tuvshinbayar and [co-organizer name]. The team of [N] has organized [N] Model United Nations conferences for [N]+ delegates.</w:t>
       </w:r>
     </w:p>
     <w:p>
@@ -798,13 +817,13 @@
           <w:b/>
           <w:bCs/>
         </w:rPr>
-        <w:t xml:space="preserve">Government recognition</w:t>
-      </w:r>
-      <w:r>
-        <w:t xml:space="preserve"> </w:t>
-      </w:r>
-      <w:r>
-        <w:t xml:space="preserve">— [body, form of recognition: letter / co-organizer / patron]. [Attach or reference the letter.]</w:t>
+        <w:t xml:space="preserve">Uram Enerel NGO (Uram Care)</w:t>
+      </w:r>
+      <w:r>
+        <w:t xml:space="preserve"> </w:t>
+      </w:r>
+      <w:r>
+        <w:t xml:space="preserve">— a registered Mongolian youth health NGO and the event's legal host. It signs the sponsorship and venue contracts, receives funds, pays vendors, issues e-barimt receipts and reports. It also brings what a health hackathon needs: a network of 1,500+ volunteers and 15+ school chapters across Mongolia for participant recruitment, health professionals for the judging panels, and a track record in youth health programs: health and wellbeing classes, health kits, awareness campaigns, community diagnostic initiatives, and 8,000+ handmade get-well cards delivered to patients. Uram Enerel is recognized by [government body: fill in the exact body and the form of recognition]. [Registration number, year founded, director.]</w:t>
       </w:r>
     </w:p>
     <w:p>
@@ -1525,7 +1544,7 @@
         <w:pStyle w:val="FirstParagraph"/>
       </w:pPr>
       <w:r>
-        <w:t xml:space="preserve">Budget for 220 participants over 24 hours, in MNT. All payments go through [NGO]'s account with receipts, and the itemized ledger is shared with every sponsor in the final report.</w:t>
+        <w:t xml:space="preserve">Budget for 220 participants over 24 hours, in MNT. All payments go through Uram Enerel's account with receipts, and the itemized ledger is shared with every sponsor in the final report.</w:t>
       </w:r>
     </w:p>
     <w:tbl>
@@ -1948,7 +1967,7 @@
         </w:numPr>
       </w:pPr>
       <w:r>
-        <w:t xml:space="preserve">[NGO] sends a one-page sponsorship contract: amount, payment date, the exact benefits of your tier, logo usage, refund or roll-over if the event is cancelled, and no control over judging or program.</w:t>
+        <w:t xml:space="preserve">Uram Enerel sends a one-page sponsorship contract: amount, payment date, the exact benefits of your tier, logo usage, refund or roll-over if the event is cancelled, and no control over judging or program.</w:t>
       </w:r>
     </w:p>
     <w:p>
@@ -1960,7 +1979,7 @@
         </w:numPr>
       </w:pPr>
       <w:r>
-        <w:t xml:space="preserve">[NGO] invoices the sponsorship as advertising services and issues an e-barimt receipt. Under Article 19 of the Law on Advertising, a sponsor's contribution to an advertising distributor under contract is counted as advertising payment, so it books as an ordinary marketing expense rather than a non-deductible donation. Product prizes are welcome and avoid prize-tax paperwork; cash prizes paid to winners carry 5 percent personal income tax, which [NGO] withholds and remits.</w:t>
+        <w:t xml:space="preserve">Uram Enerel invoices the sponsorship as advertising services and issues an e-barimt receipt. Under Article 19 of the Law on Advertising, a sponsor's contribution to an advertising distributor under contract is counted as advertising payment, so it books as an ordinary marketing expense rather than a non-deductible donation. Product prizes are welcome and avoid prize-tax paperwork; cash prizes paid to winners carry 5 percent personal income tax, which Uram Enerel withholds and remits.</w:t>
       </w:r>
     </w:p>
     <w:p>
@@ -2014,7 +2033,7 @@
         <w:t xml:space="preserve"> </w:t>
       </w:r>
       <w:r>
-        <w:t xml:space="preserve">[NGO name, address, registration number, bank]</w:t>
+        <w:t xml:space="preserve">Uram Enerel NGO (Uram Care), [address, registration number, bank]</w:t>
       </w:r>
     </w:p>
     <w:p>
@@ -2049,7 +2068,7 @@
         <w:t xml:space="preserve"> </w:t>
       </w:r>
       <w:r>
-        <w:t xml:space="preserve">"We are running Touch Grass, Mongolia's first student-led health and environment hackathon: 220 students, 24 hours, November 7 to 8. Teams build working prototypes for six specific problems: children's exposure to winter air pollution, carbon monoxide poisoning from briquettes, contaminated well water in ger districts, waste, dzud and cold-wave health risks, and connecting environmental data to hospitals. The event is hosted by [NGO], recognized by [government body], and judged by engineers and doctors. We are asking [company] to be the [tier] sponsor at [amount]. You get your name on a track, a judge seat, a workshop with 220 students, the winning prototypes first, and a report with numbers within a week. Commitments close October 25."</w:t>
+        <w:t xml:space="preserve">"We are running Touch Grass, Mongolia's first student-led health and environment hackathon: 220 students, 24 hours, November 7 to 8. Teams build working prototypes for six specific problems: children's exposure to winter air pollution, carbon monoxide poisoning from briquettes, contaminated well water in ger districts, waste, dzud and cold-wave health risks, and connecting environmental data to hospitals. The event is a collaboration between Hackathon Mongolia, our student organizing collective, and Uram Enerel NGO, a registered youth health NGO with 15 school chapters that hosts it legally and is recognized by [government body]. It is judged by engineers and doctors. We are asking [company] to be the [tier] sponsor at [amount]. You get your name on a track, a judge seat, a workshop with 220 students, the winning prototypes first, and a report with numbers within a week. Commitments close October 25."</w:t>
       </w:r>
     </w:p>
     <w:p>
@@ -2083,7 +2102,7 @@
         <w:t xml:space="preserve"> </w:t>
       </w:r>
       <w:r>
-        <w:t xml:space="preserve">You pay [NGO], a registered NGO, under a sponsorship contract, and receive an e-barimt invoice for advertising services. Plain donations are not deductible for companies, so we structure it as advertising, which is deductible.</w:t>
+        <w:t xml:space="preserve">You pay Uram Enerel, a registered NGO, under a sponsorship contract, and receive an e-barimt invoice for advertising services. Plain donations are not deductible for companies, so we structure it as advertising, which is deductible.</w:t>
       </w:r>
     </w:p>
     <w:p>
@@ -2273,7 +2292,7 @@
         <w:pStyle w:val="BlockText"/>
       </w:pPr>
       <w:r>
-        <w:t xml:space="preserve">[NGO] and a student organizing team are running Touch Grass, a 24-hour hackathon on November 7–8, 2026 for 220+ students, on the health problems caused by Ulaanbaatar's environment: winter air pollution and children's lungs, carbon monoxide poisoning, contaminated water and soil in ger districts, waste, and climate shocks. Teams build working prototypes in six tracks, judged by engineers and doctors. The event is recognized by [government body].</w:t>
+        <w:t xml:space="preserve">Uram Enerel NGO (Uram Care) and the Hackathon Mongolia student collective are running Touch Grass, a 24-hour hackathon on November 7–8, 2026 for 220+ students, on the health problems caused by Ulaanbaatar's environment: winter air pollution and children's lungs, carbon monoxide poisoning, contaminated water and soil in ger districts, waste, and climate shocks. Teams build working prototypes in six tracks, judged by engineers and doctors. The event is recognized by [government body].</w:t>
       </w:r>
     </w:p>
     <w:p>
@@ -2281,7 +2300,7 @@
         <w:pStyle w:val="BlockText"/>
       </w:pPr>
       <w:r>
-        <w:t xml:space="preserve">We are asking [company] to be our [tier] sponsor at [amount] MNT, or to provide [meals / the venue / merchandise / prizes] in kind. In return: [two or three benefits]. Sponsorship is contracted and invoiced through [NGO] as advertising services.</w:t>
+        <w:t xml:space="preserve">We are asking [company] to be our [tier] sponsor at [amount] MNT, or to provide [meals / the venue / merchandise / prizes] in kind. In return: [two or three benefits]. Sponsorship is contracted and invoiced through Uram Enerel NGO as advertising services.</w:t>
       </w:r>
     </w:p>
     <w:p>
@@ -2372,7 +2391,39 @@
         <w:t xml:space="preserve"> </w:t>
       </w:r>
       <w:r>
-        <w:t xml:space="preserve">[ТББ-ын нэр] ТББ болон [N] хүний бүрэлдэхүүнтэй сурагч, оюутны зохион байгуулагчдын баг. [Төрийн байгууллага]-ын дэмжлэгтэй. Хариуцах насанд хүрсэн хүн: [нэр, албан тушаал].</w:t>
+        <w:t xml:space="preserve">Хоёр байгууллагын хамтын ажиллагаа:</w:t>
+      </w:r>
+      <w:r>
+        <w:t xml:space="preserve"> </w:t>
+      </w:r>
+      <w:r>
+        <w:rPr>
+          <w:b/>
+          <w:bCs/>
+        </w:rPr>
+        <w:t xml:space="preserve">Hackathon Mongolia</w:t>
+      </w:r>
+      <w:r>
+        <w:t xml:space="preserve"> </w:t>
+      </w:r>
+      <w:r>
+        <w:t xml:space="preserve">— хөтөлбөр, чиглэл, шүүлт, бүртгэлийг хариуцах сурагч, оюутны зохион байгуулагчдын нэгдэл;</w:t>
+      </w:r>
+      <w:r>
+        <w:t xml:space="preserve"> </w:t>
+      </w:r>
+      <w:r>
+        <w:rPr>
+          <w:b/>
+          <w:bCs/>
+        </w:rPr>
+        <w:t xml:space="preserve">Урам Энэрэл ТББ (Uram Care)</w:t>
+      </w:r>
+      <w:r>
+        <w:t xml:space="preserve"> </w:t>
+      </w:r>
+      <w:r>
+        <w:t xml:space="preserve">— улсын бүртгэлтэй, залуучуудын эрүүл мэндийн чиглэлийн ТББ, Монгол даяар 1,500 гаруй сайн дурынхан, 15 гаруй сургуулийн салбартай; гэрээ, санхүү, тайланг хариуцах хууль ёсны зохион байгуулагч. [Төрийн байгууллага]-ын дэмжлэгтэй. Хариуцах насанд хүрсэн хүн: [нэр, албан тушаал].</w:t>
       </w:r>
     </w:p>
     <w:p>
@@ -2444,7 +2495,7 @@
         <w:t xml:space="preserve"> </w:t>
       </w:r>
       <w:r>
-        <w:t xml:space="preserve">Гэрээг [ТББ] байгуулж, зар сурталчилгааны үйлчилгээний нэхэмжлэх, и-баримт олгоно (Зар сурталчилгааны тухай хуулийн 19 дүгээр зүйл). Санхүүгийн тайланг ивээн тэтгэгч бүрт хүргүүлнэ.</w:t>
+        <w:t xml:space="preserve">Гэрээг Урам Энэрэл ТББ байгуулж, зар сурталчилгааны үйлчилгээний нэхэмжлэх, и-баримт олгоно (Зар сурталчилгааны тухай хуулийн 19 дүгээр зүйл). Санхүүгийн тайланг ивээн тэтгэгч бүрт хүргүүлнэ.</w:t>
       </w:r>
     </w:p>
     <w:p>

</xml_diff>

<commit_message>
Shorten proposal into sponsor Part A and organizer Part B; national framing; prize pool 5M and up
Co-Authored-By: Claude Fable 5.1 <noreply@anthropic.com>
</commit_message>
<xml_diff>
--- a/docs/01-sponsorship-proposal.docx
+++ b/docs/01-sponsorship-proposal.docx
@@ -2,7 +2,7 @@
 <file path=word/document.xml><?xml version="1.0" encoding="utf-8"?>
 <w:document xmlns:w="http://schemas.openxmlformats.org/wordprocessingml/2006/main" xmlns:m="http://schemas.openxmlformats.org/officeDocument/2006/math" xmlns:r="http://schemas.openxmlformats.org/officeDocument/2006/relationships" xmlns:o="urn:schemas-microsoft-com:office:office" xmlns:v="urn:schemas-microsoft-com:vml" xmlns:w10="urn:schemas-microsoft-com:office:word" xmlns:a="http://schemas.openxmlformats.org/drawingml/2006/main" xmlns:pic="http://schemas.openxmlformats.org/drawingml/2006/picture" xmlns:wp="http://schemas.openxmlformats.org/drawingml/2006/wordprocessingDrawing">
   <w:body>
-    <w:bookmarkStart w:id="20" w:name="touch-grass--sponsorship-proposal"/>
+    <w:bookmarkStart w:id="10" w:name="touch-grass--sponsorship-proposal"/>
     <w:p>
       <w:pPr>
         <w:pStyle w:val="Heading1"/>
@@ -11,13 +11,13 @@
         <w:t xml:space="preserve">Touch Grass — Sponsorship Proposal</w:t>
       </w:r>
     </w:p>
-    <w:bookmarkStart w:id="9" w:name="Xcbc9f29e7cbf379d065903c986a7836d4110f1e"/>
+    <w:bookmarkStart w:id="9" w:name="Xe6c72dad6ae59970a7b54074d2d71b68b754772"/>
     <w:p>
       <w:pPr>
         <w:pStyle w:val="Heading2"/>
       </w:pPr>
       <w:r>
-        <w:t xml:space="preserve">A 24-hour youth hackathon on health and the environment · Ulaanbaatar · November 7–8, 2026</w:t>
+        <w:t xml:space="preserve">A 24-hour youth hackathon on health and the environment · Mongolia · November 7–8, 2026</w:t>
       </w:r>
     </w:p>
     <w:p>
@@ -25,7 +25,7 @@
         <w:pStyle w:val="FirstParagraph"/>
       </w:pPr>
       <w:r>
-        <w:t xml:space="preserve">Prepared October 7, 2026. Square brackets mark facts to fill in before this goes to a company: the government body and form of recognition, Uram Enerel's registration details, the venue, team numbers, contacts.</w:t>
+        <w:t xml:space="preserve">Part A is for companies. Part B is for the organizing team only; cut it before the document leaves the team. Square brackets are facts still to fill in.</w:t>
       </w:r>
     </w:p>
     <w:p>
@@ -36,13 +36,23 @@
       </w:r>
     </w:p>
     <w:bookmarkEnd w:id="9"/>
-    <w:bookmarkStart w:id="10" w:name="X2c2555e6d11f7af5c84fa8db88169c54243bc5f"/>
+    <w:bookmarkEnd w:id="10"/>
+    <w:bookmarkStart w:id="18" w:name="part-a--for-sponsors"/>
+    <w:p>
+      <w:pPr>
+        <w:pStyle w:val="Heading1"/>
+      </w:pPr>
+      <w:r>
+        <w:t xml:space="preserve">Part A · For sponsors</w:t>
+      </w:r>
+    </w:p>
+    <w:bookmarkStart w:id="11" w:name="touch-grass-in-one-page"/>
     <w:p>
       <w:pPr>
         <w:pStyle w:val="Heading2"/>
       </w:pPr>
       <w:r>
-        <w:t xml:space="preserve">1. One-page summary</w:t>
+        <w:t xml:space="preserve">Touch Grass in one page</w:t>
       </w:r>
     </w:p>
     <w:p>
@@ -54,23 +64,13 @@
           <w:b/>
           <w:bCs/>
         </w:rPr>
-        <w:t xml:space="preserve">Name:</w:t>
+        <w:t xml:space="preserve">The name.</w:t>
       </w:r>
       <w:r>
         <w:t xml:space="preserve"> </w:t>
       </w:r>
       <w:r>
-        <w:t xml:space="preserve">Touch Grass. The internet's phrase for "go outside," aimed at a city where going outside is a health decision. Working line:</w:t>
-      </w:r>
-      <w:r>
-        <w:t xml:space="preserve"> </w:t>
-      </w:r>
-      <w:r>
-        <w:rPr>
-          <w:i/>
-          <w:iCs/>
-        </w:rPr>
-        <w:t xml:space="preserve">the air we breathe, the water we drink, the ground we live on, the winters we survive.</w:t>
+        <w:t xml:space="preserve">Touch Grass is the internet's way of saying "go outside." In Mongolia, going outside is a health decision: the air in winter, the water in the well, the ground children play on, the cold that kills livestock and the people who depend on them. The name says the thesis in two words.</w:t>
       </w:r>
     </w:p>
     <w:p>
@@ -82,13 +82,13 @@
           <w:b/>
           <w:bCs/>
         </w:rPr>
-        <w:t xml:space="preserve">What:</w:t>
+        <w:t xml:space="preserve">What.</w:t>
       </w:r>
       <w:r>
         <w:t xml:space="preserve"> </w:t>
       </w:r>
       <w:r>
-        <w:t xml:space="preserve">A 24-hour hackathon where 220+ young people in about 55 teams build working prototypes for the health problems Ulaanbaatar's environment causes: polluted air and children's lungs, carbon monoxide in ger-district homes, contaminated soil and well water, waste, and the health shocks of a changing climate. Teams start Saturday 13:00 and submit Sunday 13:00. Professional judges score every team; the best team in each of six tracks presents on stage; prizes follow.</w:t>
+        <w:t xml:space="preserve">A 24-hour hackathon where 220+ young people in about 55 teams build working prototypes for health problems with an environmental cause. Six tracks, 24 specific problem statements, any technology. Teams start Saturday 13:00 and submit Sunday 13:00; professional judges score every team; the best in each track presents on stage.</w:t>
       </w:r>
     </w:p>
     <w:p>
@@ -100,13 +100,13 @@
           <w:b/>
           <w:bCs/>
         </w:rPr>
-        <w:t xml:space="preserve">When:</w:t>
+        <w:t xml:space="preserve">When and where.</w:t>
       </w:r>
       <w:r>
         <w:t xml:space="preserve"> </w:t>
       </w:r>
       <w:r>
-        <w:t xml:space="preserve">Saturday November 7 to Sunday November 8, 2026. Doors open 11:00 Saturday, awards 16:20 Sunday.</w:t>
+        <w:t xml:space="preserve">Saturday November 7 to Sunday November 8, 2026, at [venue]. Doors 11:00 Saturday, awards 16:20 Sunday.</w:t>
       </w:r>
     </w:p>
     <w:p>
@@ -118,31 +118,13 @@
           <w:b/>
           <w:bCs/>
         </w:rPr>
-        <w:t xml:space="preserve">Where:</w:t>
+        <w:t xml:space="preserve">Who runs it.</w:t>
       </w:r>
       <w:r>
         <w:t xml:space="preserve"> </w:t>
       </w:r>
       <w:r>
-        <w:t xml:space="preserve">[venue], Ulaanbaatar. Confirmed by October 14.</w:t>
-      </w:r>
-    </w:p>
-    <w:p>
-      <w:pPr>
-        <w:pStyle w:val="BodyText"/>
-      </w:pPr>
-      <w:r>
-        <w:rPr>
-          <w:b/>
-          <w:bCs/>
-        </w:rPr>
-        <w:t xml:space="preserve">Who:</w:t>
-      </w:r>
-      <w:r>
-        <w:t xml:space="preserve"> </w:t>
-      </w:r>
-      <w:r>
-        <w:t xml:space="preserve">A collaboration between two organizations.</w:t>
+        <w:t xml:space="preserve">Two organizations.</w:t>
       </w:r>
       <w:r>
         <w:t xml:space="preserve"> </w:t>
@@ -155,10 +137,7 @@
         <w:t xml:space="preserve">Hackathon Mongolia</w:t>
       </w:r>
       <w:r>
-        <w:t xml:space="preserve"> </w:t>
-      </w:r>
-      <w:r>
-        <w:t xml:space="preserve">is a student-run organizing collective (github.com/Hackathon-Mongolia) that designs and runs the program.</w:t>
+        <w:t xml:space="preserve">, a student-run organizing collective, designs and runs the program.</w:t>
       </w:r>
       <w:r>
         <w:t xml:space="preserve"> </w:t>
@@ -171,7 +150,7 @@
         <w:t xml:space="preserve">Uram Enerel NGO</w:t>
       </w:r>
       <w:r>
-        <w:t xml:space="preserve">, known publicly as Uram Care, is a registered Mongolian youth health NGO with 1,500+ volunteers and 15+ school chapters across Mongolia; it is the legal host, holds the money, and brings its school network and health expertise. Uram Enerel is recognized by [government body]. The organizing team of [N] has run [N] Model United Nations conferences for [N]+ delegates. Responsible adult: [name, title].</w:t>
+        <w:t xml:space="preserve">, known as Uram Care, a registered youth health NGO with 1,500+ volunteers and 15+ school chapters across Mongolia, is the legal host: contracts, funds, receipts, reporting. Recognized by [government body]. Responsible adult on site: [name, title].</w:t>
       </w:r>
     </w:p>
     <w:p>
@@ -183,13 +162,13 @@
           <w:b/>
           <w:bCs/>
         </w:rPr>
-        <w:t xml:space="preserve">Who comes:</w:t>
+        <w:t xml:space="preserve">Who comes.</w:t>
       </w:r>
       <w:r>
         <w:t xml:space="preserve"> </w:t>
       </w:r>
       <w:r>
-        <w:t xml:space="preserve">High school and university students aged 16 to 24, free of charge. Target 220 attending from 25+ schools and universities. Mentors from industry and universities; a judging panel of engineers, doctors, environmental scientists and sponsor representatives.</w:t>
+        <w:t xml:space="preserve">High school and university students aged 16 to 24, free of charge, from 25+ institutions. Mentors from industry and universities; a judging panel of engineers, doctors, environmental scientists and sponsor representatives.</w:t>
       </w:r>
     </w:p>
     <w:p>
@@ -201,13 +180,13 @@
           <w:b/>
           <w:bCs/>
         </w:rPr>
-        <w:t xml:space="preserve">The ask:</w:t>
+        <w:t xml:space="preserve">The ask.</w:t>
       </w:r>
       <w:r>
         <w:t xml:space="preserve"> </w:t>
       </w:r>
       <w:r>
-        <w:t xml:space="preserve">A title sponsor at 20,000,000 MNT, a venue partner at 20,000,000 MNT or the hall in kind, six track sponsors at 5,000,000 MNT each, a food sponsor at 10,000,000 MNT or catering in kind, and merchandise and prize-pool sponsors. Total budget about 63,000,000 MNT, of which 15,000,000 MNT is the cash prize pool for the top three teams. Commitments close</w:t>
+        <w:t xml:space="preserve">A title sponsor at 20,000,000 MNT, a venue partner at 20,000,000 MNT or the hall in kind, six track sponsors at 5,000,000 MNT each, a food sponsor at 10,000,000 MNT or catering in kind, and merchandise and prize-pool sponsors. The prize pool for the top three teams starts at 5,000,000 MNT and grows with sponsor commitments.</w:t>
       </w:r>
       <w:r>
         <w:t xml:space="preserve"> </w:t>
@@ -217,171 +196,96 @@
           <w:b/>
           <w:bCs/>
         </w:rPr>
-        <w:t xml:space="preserve">October 25, 2026</w:t>
-      </w:r>
-      <w:r>
-        <w:t xml:space="preserve">.</w:t>
-      </w:r>
-    </w:p>
-    <w:p>
-      <w:pPr>
-        <w:pStyle w:val="BodyText"/>
+        <w:t xml:space="preserve">Commitments close October 25, 2026.</w:t>
+      </w:r>
+    </w:p>
+    <w:p>
+      <w:r>
+        <w:pict>
+          <v:rect style="width:0;height:1.5pt" o:hralign="center" o:hrstd="t" o:hr="t"/>
+        </w:pict>
+      </w:r>
+    </w:p>
+    <w:bookmarkEnd w:id="11"/>
+    <w:bookmarkStart w:id="12" w:name="why-this-hackathon"/>
+    <w:p>
+      <w:pPr>
+        <w:pStyle w:val="Heading2"/>
+      </w:pPr>
+      <w:r>
+        <w:t xml:space="preserve">Why this hackathon</w:t>
+      </w:r>
+    </w:p>
+    <w:p>
+      <w:pPr>
+        <w:pStyle w:val="FirstParagraph"/>
       </w:pPr>
       <w:r>
         <w:rPr>
           <w:b/>
           <w:bCs/>
         </w:rPr>
-        <w:t xml:space="preserve">Why you:</w:t>
+        <w:t xml:space="preserve">Health and environment is where Mongolia's biggest problems meet.</w:t>
       </w:r>
       <w:r>
         <w:t xml:space="preserve"> </w:t>
       </w:r>
       <w:r>
-        <w:t xml:space="preserve">Your logo on 55 prototypes aimed at problems your customers and employees live with every winter, a day with the most motivated young technical talent in the country, a judge seat, and a written report with numbers and photographs within a week.</w:t>
-      </w:r>
-    </w:p>
-    <w:p>
-      <w:r>
-        <w:pict>
-          <v:rect style="width:0;height:1.5pt" o:hralign="center" o:hrstd="t" o:hr="t"/>
-        </w:pict>
-      </w:r>
-    </w:p>
-    <w:bookmarkEnd w:id="10"/>
-    <w:bookmarkStart w:id="11" w:name="X74a6ddac9a5621dfffa02a4adceac7ca95566cf"/>
-    <w:p>
-      <w:pPr>
-        <w:pStyle w:val="Heading2"/>
-      </w:pPr>
-      <w:r>
-        <w:t xml:space="preserve">2. Why this hackathon</w:t>
-      </w:r>
-    </w:p>
-    <w:p>
-      <w:pPr>
-        <w:pStyle w:val="FirstParagraph"/>
-      </w:pPr>
-      <w:r>
-        <w:t xml:space="preserve">Ulaanbaatar is one of the few capitals where the environment is a direct, measurable cause of illness, and almost none of the city's young technical talent has been pointed at it.</w:t>
-      </w:r>
-    </w:p>
-    <w:p>
-      <w:pPr>
-        <w:pStyle w:val="Compact"/>
-        <w:numPr>
-          <w:ilvl w:val="0"/>
-          <w:numId w:val="1001"/>
-        </w:numPr>
+        <w:t xml:space="preserve">Four in five deaths in Mongolia are from noncommunicable diseases, and the environment people live in drives much of that: the smoke they breathe in winter, the water they draw, the cold and the dzud that have hit herders six times in a decade and killed 8.1 million animals in one winter. The country has warmed 1.59 degrees since 2005, nearly three times the global rate. These are not city problems or countryside problems. They are the national condition.</w:t>
+      </w:r>
+    </w:p>
+    <w:p>
+      <w:pPr>
+        <w:pStyle w:val="BodyText"/>
       </w:pPr>
       <w:r>
         <w:rPr>
           <w:b/>
           <w:bCs/>
         </w:rPr>
-        <w:t xml:space="preserve">Air.</w:t>
+        <w:t xml:space="preserve">The data is open and nobody young is building on it.</w:t>
       </w:r>
       <w:r>
         <w:t xml:space="preserve"> </w:t>
       </w:r>
       <w:r>
-        <w:t xml:space="preserve">On the coldest days, daily PM2.5 in Ulaanbaatar has reached 687 micrograms per cubic metre, 27 times the WHO guideline. Pneumonia is the second leading cause of death for Mongolian children under five, and admissions rise with the particle count. The 2025 annual average fell to 17.9 from 25.7 the year before, which shows the problem moves when the city acts.</w:t>
-      </w:r>
-    </w:p>
-    <w:p>
-      <w:pPr>
-        <w:pStyle w:val="Compact"/>
-        <w:numPr>
-          <w:ilvl w:val="0"/>
-          <w:numId w:val="1001"/>
-        </w:numPr>
+        <w:t xml:space="preserve">Air-quality stations publish hourly. The National Statistics Office has an open API. Health indicators are public. Mongolia's students win medals at the informatics olympiads every year and then build nothing with this data, because nobody has asked them to.</w:t>
+      </w:r>
+    </w:p>
+    <w:p>
+      <w:pPr>
+        <w:pStyle w:val="BodyText"/>
       </w:pPr>
       <w:r>
         <w:rPr>
           <w:b/>
           <w:bCs/>
         </w:rPr>
-        <w:t xml:space="preserve">Heat.</w:t>
+        <w:t xml:space="preserve">A hackathon is the fastest way to ask.</w:t>
       </w:r>
       <w:r>
         <w:t xml:space="preserve"> </w:t>
       </w:r>
       <w:r>
-        <w:t xml:space="preserve">After raw coal was banned in 2019, acute carbon monoxide poisoning cases rose as much as 50-fold. A parliamentary working group counted 779 deaths from carbon monoxide between 2017 and 2024.</w:t>
-      </w:r>
-    </w:p>
-    <w:p>
-      <w:pPr>
-        <w:pStyle w:val="Compact"/>
-        <w:numPr>
-          <w:ilvl w:val="0"/>
-          <w:numId w:val="1001"/>
-        </w:numPr>
+        <w:t xml:space="preserve">In 24 hours, 220 students become 55 prototypes aimed at 24 named problems, each judged by people who work on that problem. Some prototypes die on Sunday. Some become projects, startups, theses. All of them put a generation's attention on the problems a sponsor's customers live with.</w:t>
+      </w:r>
+    </w:p>
+    <w:p>
+      <w:pPr>
+        <w:pStyle w:val="BodyText"/>
       </w:pPr>
       <w:r>
         <w:rPr>
           <w:b/>
           <w:bCs/>
         </w:rPr>
-        <w:t xml:space="preserve">Ground and water.</w:t>
+        <w:t xml:space="preserve">Nobody has done this.</w:t>
       </w:r>
       <w:r>
         <w:t xml:space="preserve"> </w:t>
       </w:r>
       <w:r>
-        <w:t xml:space="preserve">The city's seven districts hold about 145,000 pit latrines. A study found 88 percent of ger-area soils bacterially contaminated and E. coli in a 47-metre well, and linked soil contamination to diarrhoeal disease in children under five. Heavy-metal risk to children exceeds permissible limits near industrial sites.</w:t>
-      </w:r>
-    </w:p>
-    <w:p>
-      <w:pPr>
-        <w:pStyle w:val="Compact"/>
-        <w:numPr>
-          <w:ilvl w:val="0"/>
-          <w:numId w:val="1001"/>
-        </w:numPr>
-      </w:pPr>
-      <w:r>
-        <w:rPr>
-          <w:b/>
-          <w:bCs/>
-        </w:rPr>
-        <w:t xml:space="preserve">Waste.</w:t>
-      </w:r>
-      <w:r>
-        <w:t xml:space="preserve"> </w:t>
-      </w:r>
-      <w:r>
-        <w:t xml:space="preserve">The city produces thousands of tonnes of waste a day; about a fifth is recycled and 7 percent is illegally dumped, mostly in the ger areas with the fewest services.</w:t>
-      </w:r>
-    </w:p>
-    <w:p>
-      <w:pPr>
-        <w:pStyle w:val="Compact"/>
-        <w:numPr>
-          <w:ilvl w:val="0"/>
-          <w:numId w:val="1001"/>
-        </w:numPr>
-      </w:pPr>
-      <w:r>
-        <w:rPr>
-          <w:b/>
-          <w:bCs/>
-        </w:rPr>
-        <w:t xml:space="preserve">Climate.</w:t>
-      </w:r>
-      <w:r>
-        <w:t xml:space="preserve"> </w:t>
-      </w:r>
-      <w:r>
-        <w:t xml:space="preserve">Mongolia has warmed 1.59 degrees since 2005, nearly three times the global rate. Six major dzuds in a decade; 8.1 million animals died in the winter of 2023 to 2024, with consequences for the health, income and mental health of a third of the population.</w:t>
-      </w:r>
-    </w:p>
-    <w:p>
-      <w:pPr>
-        <w:pStyle w:val="FirstParagraph"/>
-      </w:pPr>
-      <w:r>
-        <w:t xml:space="preserve">The data exists and is open: air-quality stations publish hourly, the National Statistics Office has an open API, health indicators are public. What is missing is people building on it. Mongolia has had hackathons on mining data, health tech and air pollution, run by the World Bank, IFC, UNICEF and the city, but none has been student-led, none has combined health and environment, and nothing independent has passed 150 participants since 2021. This is the first at this scale.</w:t>
+        <w:t xml:space="preserve">Mongolia has had hackathons on mining data, health tech and air pollution, run by the World Bank, IFC, UNICEF and the city. None was student-led, none combined health and environment, and nothing independent has passed 150 participants since 2021. Touch Grass is the first at this scale, and the companies on it are the first names attached.</w:t>
       </w:r>
     </w:p>
     <w:p>
@@ -391,14 +295,14 @@
         </w:pict>
       </w:r>
     </w:p>
-    <w:bookmarkEnd w:id="11"/>
-    <w:bookmarkStart w:id="12" w:name="X17aa535c65a9c995abd8916ee7cac0933cb300f"/>
+    <w:bookmarkEnd w:id="12"/>
+    <w:bookmarkStart w:id="13" w:name="the-event"/>
     <w:p>
       <w:pPr>
         <w:pStyle w:val="Heading2"/>
       </w:pPr>
       <w:r>
-        <w:t xml:space="preserve">3. The event</w:t>
+        <w:t xml:space="preserve">The event</w:t>
       </w:r>
     </w:p>
     <w:tbl>
@@ -451,7 +355,7 @@
               <w:pStyle w:val="Compact"/>
             </w:pPr>
             <w:r>
-              <w:t xml:space="preserve">24-hour hackathon, in person, overnight at the venue with adult supervision; teams of 2 to 4</w:t>
+              <w:t xml:space="preserve">24 hours in person, overnight at the venue with adult supervision; teams of 2 to 4</w:t>
             </w:r>
           </w:p>
         </w:tc>
@@ -499,7 +403,7 @@
               <w:pStyle w:val="Compact"/>
             </w:pPr>
             <w:r>
-              <w:t xml:space="preserve">220+ students aged 16 to 24, free entry, parental consent for under-18s</w:t>
+              <w:t xml:space="preserve">220+ students aged 16 to 24; free entry; parental consent for under-18s</w:t>
             </w:r>
           </w:p>
         </w:tc>
@@ -523,7 +427,7 @@
               <w:pStyle w:val="Compact"/>
             </w:pPr>
             <w:r>
-              <w:t xml:space="preserve">six, each a specific health problem with an environmental cause; each team claims one problem statement, so no two projects are the same</w:t>
+              <w:t xml:space="preserve">six; each team claims one of 24 problem statements, so no two projects are the same</w:t>
             </w:r>
           </w:p>
         </w:tc>
@@ -547,7 +451,7 @@
               <w:pStyle w:val="Compact"/>
             </w:pPr>
             <w:r>
-              <w:t xml:space="preserve">two workshops Saturday (where the data is; how to demo), mentor hours, a night mentor on call</w:t>
+              <w:t xml:space="preserve">two workshops Saturday, mentor hours, a night mentor on call</w:t>
             </w:r>
           </w:p>
         </w:tc>
@@ -571,7 +475,7 @@
               <w:pStyle w:val="Compact"/>
             </w:pPr>
             <w:r>
-              <w:t xml:space="preserve">one panel of three judges per track visits every team in its track Sunday 13:30 to 15:00; six track winners plus two wildcards present on stage; full panel picks the overall top three</w:t>
+              <w:t xml:space="preserve">one three-judge panel per track visits every team; six track winners plus two wildcards present on stage; the full panel picks the top three</w:t>
             </w:r>
           </w:p>
         </w:tc>
@@ -595,7 +499,7 @@
               <w:pStyle w:val="Compact"/>
             </w:pPr>
             <w:r>
-              <w:t xml:space="preserve">55 prototypes with public project pages, a results post, a report to sponsors and partners, photos and video</w:t>
+              <w:t xml:space="preserve">55 prototypes with public project pages, results post, photos and video, a report to sponsors within a week</w:t>
             </w:r>
           </w:p>
         </w:tc>
@@ -628,141 +532,19 @@
     <w:p>
       <w:pPr>
         <w:pStyle w:val="BodyText"/>
-      </w:pPr>
-      <w:r>
-        <w:t xml:space="preserve">The six tracks and the problem bank are in the companion document "Theme, Tracks, Judging and Agenda." In one line each:</w:t>
-      </w:r>
-    </w:p>
-    <w:p>
-      <w:pPr>
-        <w:pStyle w:val="Compact"/>
-        <w:numPr>
-          <w:ilvl w:val="0"/>
-          <w:numId w:val="1002"/>
-        </w:numPr>
       </w:pPr>
       <w:r>
         <w:rPr>
           <w:b/>
           <w:bCs/>
         </w:rPr>
-        <w:t xml:space="preserve">Clean air, healthy lungs</w:t>
+        <w:t xml:space="preserve">The six tracks.</w:t>
       </w:r>
       <w:r>
         <w:t xml:space="preserve"> </w:t>
       </w:r>
       <w:r>
-        <w:t xml:space="preserve">— exposure, alerts and protection for children, schools and ger households.</w:t>
-      </w:r>
-    </w:p>
-    <w:p>
-      <w:pPr>
-        <w:pStyle w:val="Compact"/>
-        <w:numPr>
-          <w:ilvl w:val="0"/>
-          <w:numId w:val="1002"/>
-        </w:numPr>
-      </w:pPr>
-      <w:r>
-        <w:rPr>
-          <w:b/>
-          <w:bCs/>
-        </w:rPr>
-        <w:t xml:space="preserve">Safe heat</w:t>
-      </w:r>
-      <w:r>
-        <w:t xml:space="preserve"> </w:t>
-      </w:r>
-      <w:r>
-        <w:t xml:space="preserve">— preventing carbon monoxide poisoning in homes heated with briquettes.</w:t>
-      </w:r>
-    </w:p>
-    <w:p>
-      <w:pPr>
-        <w:pStyle w:val="Compact"/>
-        <w:numPr>
-          <w:ilvl w:val="0"/>
-          <w:numId w:val="1002"/>
-        </w:numPr>
-      </w:pPr>
-      <w:r>
-        <w:rPr>
-          <w:b/>
-          <w:bCs/>
-        </w:rPr>
-        <w:t xml:space="preserve">Ground and water</w:t>
-      </w:r>
-      <w:r>
-        <w:t xml:space="preserve"> </w:t>
-      </w:r>
-      <w:r>
-        <w:t xml:space="preserve">— pit latrines, soil, well water and children's diarrhoeal disease in ger districts.</w:t>
-      </w:r>
-    </w:p>
-    <w:p>
-      <w:pPr>
-        <w:pStyle w:val="Compact"/>
-        <w:numPr>
-          <w:ilvl w:val="0"/>
-          <w:numId w:val="1002"/>
-        </w:numPr>
-      </w:pPr>
-      <w:r>
-        <w:rPr>
-          <w:b/>
-          <w:bCs/>
-        </w:rPr>
-        <w:t xml:space="preserve">Waste and health</w:t>
-      </w:r>
-      <w:r>
-        <w:t xml:space="preserve"> </w:t>
-      </w:r>
-      <w:r>
-        <w:t xml:space="preserve">— collection, sorting, hazardous household waste and the people who live with it.</w:t>
-      </w:r>
-    </w:p>
-    <w:p>
-      <w:pPr>
-        <w:pStyle w:val="Compact"/>
-        <w:numPr>
-          <w:ilvl w:val="0"/>
-          <w:numId w:val="1002"/>
-        </w:numPr>
-      </w:pPr>
-      <w:r>
-        <w:rPr>
-          <w:b/>
-          <w:bCs/>
-        </w:rPr>
-        <w:t xml:space="preserve">Climate shocks</w:t>
-      </w:r>
-      <w:r>
-        <w:t xml:space="preserve"> </w:t>
-      </w:r>
-      <w:r>
-        <w:t xml:space="preserve">— dzud, cold waves and heat: early warning and health support for herders and the vulnerable.</w:t>
-      </w:r>
-    </w:p>
-    <w:p>
-      <w:pPr>
-        <w:pStyle w:val="Compact"/>
-        <w:numPr>
-          <w:ilvl w:val="0"/>
-          <w:numId w:val="1002"/>
-        </w:numPr>
-      </w:pPr>
-      <w:r>
-        <w:rPr>
-          <w:b/>
-          <w:bCs/>
-        </w:rPr>
-        <w:t xml:space="preserve">Health data and early warning</w:t>
-      </w:r>
-      <w:r>
-        <w:t xml:space="preserve"> </w:t>
-      </w:r>
-      <w:r>
-        <w:t xml:space="preserve">— linking environmental data to hospitals and public health.</w:t>
+        <w:t xml:space="preserve">Clean air and healthy lungs · Safe heat: carbon monoxide in heated homes · Ground and water: latrines, soil and wells · Waste and health · Climate shocks: dzud, cold waves and heat · Health data and early warning. The problem bank and judging rubric are in the companion document.</w:t>
       </w:r>
     </w:p>
     <w:p>
@@ -772,111 +554,14 @@
         </w:pict>
       </w:r>
     </w:p>
-    <w:bookmarkEnd w:id="12"/>
-    <w:bookmarkStart w:id="13" w:name="X545b9bbbbf8a0d38e3953413d92f13827076914"/>
+    <w:bookmarkEnd w:id="13"/>
+    <w:bookmarkStart w:id="14" w:name="sponsorship-tiers"/>
     <w:p>
       <w:pPr>
         <w:pStyle w:val="Heading2"/>
       </w:pPr>
       <w:r>
-        <w:t xml:space="preserve">4. Who is behind it</w:t>
-      </w:r>
-    </w:p>
-    <w:p>
-      <w:pPr>
-        <w:pStyle w:val="FirstParagraph"/>
-      </w:pPr>
-      <w:r>
-        <w:t xml:space="preserve">Touch Grass is run by two organizations with clear roles.</w:t>
-      </w:r>
-    </w:p>
-    <w:p>
-      <w:pPr>
-        <w:pStyle w:val="BodyText"/>
-      </w:pPr>
-      <w:r>
-        <w:rPr>
-          <w:b/>
-          <w:bCs/>
-        </w:rPr>
-        <w:t xml:space="preserve">Hackathon Mongolia</w:t>
-      </w:r>
-      <w:r>
-        <w:t xml:space="preserve"> </w:t>
-      </w:r>
-      <w:r>
-        <w:t xml:space="preserve">— a student-run organizing collective, not a registered entity, which is why no contract or money goes through it. It owns the program: the theme and tracks, the problem bank, registration, mentors, judges and rubric, the run-of-show, and these documents. Its public home is github.com/Hackathon-Mongolia. Led by Anar Tuvshinbayar and [co-organizer name]. The team of [N] has organized [N] Model United Nations conferences for [N]+ delegates.</w:t>
-      </w:r>
-    </w:p>
-    <w:p>
-      <w:pPr>
-        <w:pStyle w:val="BodyText"/>
-      </w:pPr>
-      <w:r>
-        <w:rPr>
-          <w:b/>
-          <w:bCs/>
-        </w:rPr>
-        <w:t xml:space="preserve">Uram Enerel NGO (Uram Care)</w:t>
-      </w:r>
-      <w:r>
-        <w:t xml:space="preserve"> </w:t>
-      </w:r>
-      <w:r>
-        <w:t xml:space="preserve">— a registered Mongolian youth health NGO and the event's legal host. It signs the sponsorship and venue contracts, receives funds, pays vendors, issues e-barimt receipts and reports. It also brings what a health hackathon needs: a network of 1,500+ volunteers and 15+ school chapters across Mongolia for participant recruitment, health professionals for the judging panels, and a track record in youth health programs: health and wellbeing classes, health kits, awareness campaigns, community diagnostic initiatives, and 8,000+ handmade get-well cards delivered to patients. Uram Enerel is recognized by [government body: fill in the exact body and the form of recognition]. [Registration number, year founded, director.]</w:t>
-      </w:r>
-    </w:p>
-    <w:p>
-      <w:pPr>
-        <w:pStyle w:val="BodyText"/>
-      </w:pPr>
-      <w:r>
-        <w:rPr>
-          <w:b/>
-          <w:bCs/>
-        </w:rPr>
-        <w:t xml:space="preserve">Responsible adult</w:t>
-      </w:r>
-      <w:r>
-        <w:t xml:space="preserve"> </w:t>
-      </w:r>
-      <w:r>
-        <w:t xml:space="preserve">— [name, title, organization], present throughout the event and on call overnight.</w:t>
-      </w:r>
-    </w:p>
-    <w:p>
-      <w:pPr>
-        <w:pStyle w:val="BodyText"/>
-      </w:pPr>
-      <w:r>
-        <w:rPr>
-          <w:b/>
-          <w:bCs/>
-        </w:rPr>
-        <w:t xml:space="preserve">Advisors and judges (confirmed so far)</w:t>
-      </w:r>
-      <w:r>
-        <w:t xml:space="preserve"> </w:t>
-      </w:r>
-      <w:r>
-        <w:t xml:space="preserve">— [names, titles]. Target panel: 18 judges across engineering, medicine, environmental science and the sponsor companies; 20 mentors.</w:t>
-      </w:r>
-    </w:p>
-    <w:p>
-      <w:r>
-        <w:pict>
-          <v:rect style="width:0;height:1.5pt" o:hralign="center" o:hrstd="t" o:hr="t"/>
-        </w:pict>
-      </w:r>
-    </w:p>
-    <w:bookmarkEnd w:id="13"/>
-    <w:bookmarkStart w:id="14" w:name="X4c48baa039a909d028a99e0c827e5579303a5dc"/>
-    <w:p>
-      <w:pPr>
-        <w:pStyle w:val="Heading2"/>
-      </w:pPr>
-      <w:r>
-        <w:t xml:space="preserve">5. Sponsorship tiers</w:t>
+        <w:t xml:space="preserve">Sponsorship tiers</w:t>
       </w:r>
     </w:p>
     <w:tbl>
@@ -913,7 +598,7 @@
               <w:pStyle w:val="Compact"/>
             </w:pPr>
             <w:r>
-              <w:t xml:space="preserve">Amount (MNT)</w:t>
+              <w:t xml:space="preserve">MNT</w:t>
             </w:r>
           </w:p>
         </w:tc>
@@ -985,7 +670,7 @@
               <w:pStyle w:val="Compact"/>
             </w:pPr>
             <w:r>
-              <w:t xml:space="preserve">Event named "Touch Grass presented by [You]"; logo first on every surface including the stage, the countdown screen and all 220 t-shirts; 5-minute opening slot; one judge on the final panel; you present the first prize; first access to the winning teams; opt-in CVs of participants; your brief considered when the problem bank is finalized</w:t>
+              <w:t xml:space="preserve">"Touch Grass presented by [You]"; logo first everywhere including all 220 t-shirts; 5-minute opening slot; judge on the final panel; you present first prize; first access to winning teams; opt-in participant CVs</w:t>
             </w:r>
           </w:p>
         </w:tc>
@@ -1035,7 +720,7 @@
               <w:pStyle w:val="Compact"/>
             </w:pPr>
             <w:r>
-              <w:t xml:space="preserve">"Hosted at [You]"; logo on every table card and all signage; the venue's name in every announcement, post and media mention; opening remarks; option to brand a room</w:t>
+              <w:t xml:space="preserve">"Hosted at [You]"; logo on every table card and all signage; named in every announcement; opening remarks</w:t>
             </w:r>
           </w:p>
         </w:tc>
@@ -1085,7 +770,7 @@
               <w:pStyle w:val="Compact"/>
             </w:pPr>
             <w:r>
-              <w:t xml:space="preserve">One of the six tracks carries your name; you set or co-write the track's problem statements; one judge on the track panel; a 15-minute workshop on Saturday; your logo on the track's signage, site and results; you present the track award on stage</w:t>
+              <w:t xml:space="preserve">a track carries your name; you co-write its problem statements; a judge on its panel; a 15-minute workshop; you present the track award</w:t>
             </w:r>
           </w:p>
         </w:tc>
@@ -1135,7 +820,7 @@
               <w:pStyle w:val="Compact"/>
             </w:pPr>
             <w:r>
-              <w:t xml:space="preserve">"Meals by [You]" at every meal, five meals over 24 hours plus snacks; logo on site and stage; thanks from the stage at each meal</w:t>
+              <w:t xml:space="preserve">"Meals by [You]" at five meals; logo on site and stage; thanks at each meal</w:t>
             </w:r>
           </w:p>
         </w:tc>
@@ -1163,7 +848,7 @@
               <w:pStyle w:val="Compact"/>
             </w:pPr>
             <w:r>
-              <w:t xml:space="preserve">in kind: 220 t-shirts, stickers, badges, or 4,500,000</w:t>
+              <w:t xml:space="preserve">220 t-shirts and stickers in kind, or 4,500,000</w:t>
             </w:r>
           </w:p>
         </w:tc>
@@ -1185,7 +870,7 @@
               <w:pStyle w:val="Compact"/>
             </w:pPr>
             <w:r>
-              <w:t xml:space="preserve">Your logo on the shirt sleeve or back with the title sponsor's; stickers carry your mark; "Merch by [You]" on site</w:t>
+              <w:t xml:space="preserve">your logo on the shirt with the title sponsor's</w:t>
             </w:r>
           </w:p>
         </w:tc>
@@ -1213,7 +898,7 @@
               <w:pStyle w:val="Compact"/>
             </w:pPr>
             <w:r>
-              <w:t xml:space="preserve">1,000,000 to 5,000,000</w:t>
+              <w:t xml:space="preserve">1,000,000 and up</w:t>
             </w:r>
           </w:p>
         </w:tc>
@@ -1235,7 +920,7 @@
               <w:pStyle w:val="Compact"/>
             </w:pPr>
             <w:r>
-              <w:t xml:space="preserve">Named contribution to the 15,000,000 MNT top-three pool; present a category prize (best beginner team, best design, best use of open data) on stage</w:t>
+              <w:t xml:space="preserve">named contribution to the top-three pool; present a category prize on stage</w:t>
             </w:r>
           </w:p>
         </w:tc>
@@ -1285,7 +970,7 @@
               <w:pStyle w:val="Compact"/>
             </w:pPr>
             <w:r>
-              <w:t xml:space="preserve">Security, printing, water and snacks, photography and video, cloud credits, hardware kits; logo on site and thanks from the stage</w:t>
+              <w:t xml:space="preserve">security, printing, water, photography, cloud credits, hardware; logo on site and thanks from the stage</w:t>
             </w:r>
           </w:p>
         </w:tc>
@@ -1296,7 +981,7 @@
         <w:pStyle w:val="BodyText"/>
       </w:pPr>
       <w:r>
-        <w:t xml:space="preserve">Every sponsor, at every tier, receives: logo on the website and results post, mention in the final report, event photographs, and a thank-you from the stage. Wifi is provided by the venue, so no connectivity tier is needed.</w:t>
+        <w:t xml:space="preserve">Every sponsor receives a logo on the website and results post, a mention in the report, event photographs, and a thank-you from the stage. Wifi is provided by the venue.</w:t>
       </w:r>
     </w:p>
     <w:p>
@@ -1307,13 +992,13 @@
       </w:r>
     </w:p>
     <w:bookmarkEnd w:id="14"/>
-    <w:bookmarkStart w:id="15" w:name="X183cfb75f124c68b424b8c6539c51ae76e9384b"/>
+    <w:bookmarkStart w:id="15" w:name="where-the-money-goes"/>
     <w:p>
       <w:pPr>
         <w:pStyle w:val="Heading2"/>
       </w:pPr>
       <w:r>
-        <w:t xml:space="preserve">6. What you receive, and when</w:t>
+        <w:t xml:space="preserve">Where the money goes</w:t>
       </w:r>
     </w:p>
     <w:tbl>
@@ -1337,18 +1022,18 @@
               <w:pStyle w:val="Compact"/>
             </w:pPr>
             <w:r>
-              <w:t xml:space="preserve">When</w:t>
-            </w:r>
-          </w:p>
-        </w:tc>
-        <w:tc>
-          <w:tcPr/>
-          <w:p>
-            <w:pPr>
-              <w:pStyle w:val="Compact"/>
-            </w:pPr>
-            <w:r>
-              <w:t xml:space="preserve">Sponsor deliverable</w:t>
+              <w:t xml:space="preserve">Item</w:t>
+            </w:r>
+          </w:p>
+        </w:tc>
+        <w:tc>
+          <w:tcPr/>
+          <w:p>
+            <w:pPr>
+              <w:pStyle w:val="Compact"/>
+            </w:pPr>
+            <w:r>
+              <w:t xml:space="preserve">MNT</w:t>
             </w:r>
           </w:p>
         </w:tc>
@@ -1361,18 +1046,18 @@
               <w:pStyle w:val="Compact"/>
             </w:pPr>
             <w:r>
-              <w:t xml:space="preserve">On signing</w:t>
-            </w:r>
-          </w:p>
-        </w:tc>
-        <w:tc>
-          <w:tcPr/>
-          <w:p>
-            <w:pPr>
-              <w:pStyle w:val="Compact"/>
-            </w:pPr>
-            <w:r>
-              <w:t xml:space="preserve">Logo on the website, registration page and announcement posts within 48 hours</w:t>
+              <w:t xml:space="preserve">Venue, two days including overnight</w:t>
+            </w:r>
+          </w:p>
+        </w:tc>
+        <w:tc>
+          <w:tcPr/>
+          <w:p>
+            <w:pPr>
+              <w:pStyle w:val="Compact"/>
+            </w:pPr>
+            <w:r>
+              <w:t xml:space="preserve">20,000,000</w:t>
             </w:r>
           </w:p>
         </w:tc>
@@ -1385,18 +1070,18 @@
               <w:pStyle w:val="Compact"/>
             </w:pPr>
             <w:r>
-              <w:t xml:space="preserve">Oct 25 to Nov 6</w:t>
-            </w:r>
-          </w:p>
-        </w:tc>
-        <w:tc>
-          <w:tcPr/>
-          <w:p>
-            <w:pPr>
-              <w:pStyle w:val="Compact"/>
-            </w:pPr>
-            <w:r>
-              <w:t xml:space="preserve">Track sponsors: problem statements agreed with you by Oct 28; your judge and workshop speaker briefed Nov 6</w:t>
+              <w:t xml:space="preserve">Food, five meals and snacks for 220 participants and 45 staff</w:t>
+            </w:r>
+          </w:p>
+        </w:tc>
+        <w:tc>
+          <w:tcPr/>
+          <w:p>
+            <w:pPr>
+              <w:pStyle w:val="Compact"/>
+            </w:pPr>
+            <w:r>
+              <w:t xml:space="preserve">10,000,000</w:t>
             </w:r>
           </w:p>
         </w:tc>
@@ -1409,18 +1094,18 @@
               <w:pStyle w:val="Compact"/>
             </w:pPr>
             <w:r>
-              <w:t xml:space="preserve">Nov 7</w:t>
-            </w:r>
-          </w:p>
-        </w:tc>
-        <w:tc>
-          <w:tcPr/>
-          <w:p>
-            <w:pPr>
-              <w:pStyle w:val="Compact"/>
-            </w:pPr>
-            <w:r>
-              <w:t xml:space="preserve">Opening-slot speaking time (title and track sponsors); workshop slot (track sponsors); stage thanks at lunch and dinner; logo on signage, table cards and the countdown screen</w:t>
+              <w:t xml:space="preserve">Prize pool for the top three, split 50 / 30 / 20</w:t>
+            </w:r>
+          </w:p>
+        </w:tc>
+        <w:tc>
+          <w:tcPr/>
+          <w:p>
+            <w:pPr>
+              <w:pStyle w:val="Compact"/>
+            </w:pPr>
+            <w:r>
+              <w:t xml:space="preserve">5,000,000 minimum, target 15,000,000</w:t>
             </w:r>
           </w:p>
         </w:tc>
@@ -1433,18 +1118,18 @@
               <w:pStyle w:val="Compact"/>
             </w:pPr>
             <w:r>
-              <w:t xml:space="preserve">Nov 8</w:t>
-            </w:r>
-          </w:p>
-        </w:tc>
-        <w:tc>
-          <w:tcPr/>
-          <w:p>
-            <w:pPr>
-              <w:pStyle w:val="Compact"/>
-            </w:pPr>
-            <w:r>
-              <w:t xml:space="preserve">Judge seat in the track panel or final panel; prize presentation on stage; group photograph with winners</w:t>
+              <w:t xml:space="preserve">T-shirts, stickers, badges</w:t>
+            </w:r>
+          </w:p>
+        </w:tc>
+        <w:tc>
+          <w:tcPr/>
+          <w:p>
+            <w:pPr>
+              <w:pStyle w:val="Compact"/>
+            </w:pPr>
+            <w:r>
+              <w:t xml:space="preserve">4,400,000</w:t>
             </w:r>
           </w:p>
         </w:tc>
@@ -1457,18 +1142,18 @@
               <w:pStyle w:val="Compact"/>
             </w:pPr>
             <w:r>
-              <w:t xml:space="preserve">Nov 9 to 10</w:t>
-            </w:r>
-          </w:p>
-        </w:tc>
-        <w:tc>
-          <w:tcPr/>
-          <w:p>
-            <w:pPr>
-              <w:pStyle w:val="Compact"/>
-            </w:pPr>
-            <w:r>
-              <w:t xml:space="preserve">Results post with your logo and the winning projects; thank-you post</w:t>
+              <w:t xml:space="preserve">Judges, designers, finance support</w:t>
+            </w:r>
+          </w:p>
+        </w:tc>
+        <w:tc>
+          <w:tcPr/>
+          <w:p>
+            <w:pPr>
+              <w:pStyle w:val="Compact"/>
+            </w:pPr>
+            <w:r>
+              <w:t xml:space="preserve">3,000,000</w:t>
             </w:r>
           </w:p>
         </w:tc>
@@ -1481,18 +1166,18 @@
               <w:pStyle w:val="Compact"/>
             </w:pPr>
             <w:r>
-              <w:t xml:space="preserve">By Nov 13</w:t>
-            </w:r>
-          </w:p>
-        </w:tc>
-        <w:tc>
-          <w:tcPr/>
-          <w:p>
-            <w:pPr>
-              <w:pStyle w:val="Compact"/>
-            </w:pPr>
-            <w:r>
-              <w:t xml:space="preserve">Written report: participants, schools, teams, projects, project links, photos, media coverage, survey results; itemized spending</w:t>
+              <w:t xml:space="preserve">Power, supplies, first aid, printing, signage</w:t>
+            </w:r>
+          </w:p>
+        </w:tc>
+        <w:tc>
+          <w:tcPr/>
+          <w:p>
+            <w:pPr>
+              <w:pStyle w:val="Compact"/>
+            </w:pPr>
+            <w:r>
+              <w:t xml:space="preserve">3,200,000</w:t>
             </w:r>
           </w:p>
         </w:tc>
@@ -1505,23 +1190,90 @@
               <w:pStyle w:val="Compact"/>
             </w:pPr>
             <w:r>
-              <w:t xml:space="preserve">After</w:t>
-            </w:r>
-          </w:p>
-        </w:tc>
-        <w:tc>
-          <w:tcPr/>
-          <w:p>
-            <w:pPr>
-              <w:pStyle w:val="Compact"/>
-            </w:pPr>
-            <w:r>
-              <w:t xml:space="preserve">Introductions to winning teams on request; opt-in CVs of participants (title and track sponsors)</w:t>
+              <w:t xml:space="preserve">Photography, security, cleaning, first aider</w:t>
+            </w:r>
+          </w:p>
+        </w:tc>
+        <w:tc>
+          <w:tcPr/>
+          <w:p>
+            <w:pPr>
+              <w:pStyle w:val="Compact"/>
+            </w:pPr>
+            <w:r>
+              <w:t xml:space="preserve">1,900,000</w:t>
+            </w:r>
+          </w:p>
+        </w:tc>
+      </w:tr>
+      <w:tr>
+        <w:tc>
+          <w:tcPr/>
+          <w:p>
+            <w:pPr>
+              <w:pStyle w:val="Compact"/>
+            </w:pPr>
+            <w:r>
+              <w:t xml:space="preserve">Contingency 10%</w:t>
+            </w:r>
+          </w:p>
+        </w:tc>
+        <w:tc>
+          <w:tcPr/>
+          <w:p>
+            <w:pPr>
+              <w:pStyle w:val="Compact"/>
+            </w:pPr>
+            <w:r>
+              <w:t xml:space="preserve">4,750,000 to 5,750,000</w:t>
+            </w:r>
+          </w:p>
+        </w:tc>
+      </w:tr>
+      <w:tr>
+        <w:tc>
+          <w:tcPr/>
+          <w:p>
+            <w:pPr>
+              <w:pStyle w:val="Compact"/>
+            </w:pPr>
+            <w:r>
+              <w:rPr>
+                <w:b/>
+                <w:bCs/>
+              </w:rPr>
+              <w:t xml:space="preserve">Total</w:t>
+            </w:r>
+          </w:p>
+        </w:tc>
+        <w:tc>
+          <w:tcPr/>
+          <w:p>
+            <w:pPr>
+              <w:pStyle w:val="Compact"/>
+            </w:pPr>
+            <w:r>
+              <w:rPr>
+                <w:b/>
+                <w:bCs/>
+              </w:rPr>
+              <w:t xml:space="preserve">52,000,000 to 63,000,000</w:t>
+            </w:r>
+            <w:r>
+              <w:t xml:space="preserve">, about 20,000,000 less if the hall is in kind</w:t>
             </w:r>
           </w:p>
         </w:tc>
       </w:tr>
     </w:tbl>
+    <w:p>
+      <w:pPr>
+        <w:pStyle w:val="BodyText"/>
+      </w:pPr>
+      <w:r>
+        <w:t xml:space="preserve">All payments go through Uram Enerel's account with receipts. The itemized ledger goes to every sponsor in the final report.</w:t>
+      </w:r>
+    </w:p>
     <w:p>
       <w:r>
         <w:pict>
@@ -1530,13 +1282,74 @@
       </w:r>
     </w:p>
     <w:bookmarkEnd w:id="15"/>
-    <w:bookmarkStart w:id="16" w:name="X73ce15a08787f7002043a7aecef670cf0789dfa"/>
+    <w:bookmarkStart w:id="16" w:name="how-to-say-yes"/>
     <w:p>
       <w:pPr>
         <w:pStyle w:val="Heading2"/>
       </w:pPr>
       <w:r>
-        <w:t xml:space="preserve">7. Where the money goes</w:t>
+        <w:t xml:space="preserve">How to say yes</w:t>
+      </w:r>
+    </w:p>
+    <w:p>
+      <w:pPr>
+        <w:pStyle w:val="Compact"/>
+        <w:numPr>
+          <w:ilvl w:val="0"/>
+          <w:numId w:val="1001"/>
+        </w:numPr>
+      </w:pPr>
+      <w:r>
+        <w:t xml:space="preserve">Tell [co-organizer name] your tier by</w:t>
+      </w:r>
+      <w:r>
+        <w:t xml:space="preserve"> </w:t>
+      </w:r>
+      <w:r>
+        <w:rPr>
+          <w:b/>
+          <w:bCs/>
+        </w:rPr>
+        <w:t xml:space="preserve">October 25, 2026</w:t>
+      </w:r>
+      <w:r>
+        <w:t xml:space="preserve">.</w:t>
+      </w:r>
+    </w:p>
+    <w:p>
+      <w:pPr>
+        <w:pStyle w:val="Compact"/>
+        <w:numPr>
+          <w:ilvl w:val="0"/>
+          <w:numId w:val="1001"/>
+        </w:numPr>
+      </w:pPr>
+      <w:r>
+        <w:t xml:space="preserve">Uram Enerel sends a one-page contract: amount, payment date, your tier's benefits, logo usage, refund or roll-over if the event is cancelled, no control over judging or program.</w:t>
+      </w:r>
+    </w:p>
+    <w:p>
+      <w:pPr>
+        <w:pStyle w:val="Compact"/>
+        <w:numPr>
+          <w:ilvl w:val="0"/>
+          <w:numId w:val="1001"/>
+        </w:numPr>
+      </w:pPr>
+      <w:r>
+        <w:t xml:space="preserve">Uram Enerel invoices the sponsorship as advertising services with an e-barimt. Under Article 19 of the Law on Advertising, a sponsor's contribution to an advertising distributor under contract counts as advertising payment, so it books as a marketing expense, not a non-deductible donation. Cash prizes carry 5 percent personal income tax, which Uram Enerel withholds.</w:t>
+      </w:r>
+    </w:p>
+    <w:p>
+      <w:pPr>
+        <w:pStyle w:val="Compact"/>
+        <w:numPr>
+          <w:ilvl w:val="0"/>
+          <w:numId w:val="1001"/>
+        </w:numPr>
+      </w:pPr>
+      <w:r>
+        <w:t xml:space="preserve">Send your logo and a 40-word description. Name your judge, and for track sponsors your workshop speaker, by October 30.</w:t>
       </w:r>
     </w:p>
     <w:p>
@@ -1544,7 +1357,447 @@
         <w:pStyle w:val="FirstParagraph"/>
       </w:pPr>
       <w:r>
-        <w:t xml:space="preserve">Budget for 220 participants over 24 hours, in MNT. All payments go through Uram Enerel's account with receipts, and the itemized ledger is shared with every sponsor in the final report.</w:t>
+        <w:rPr>
+          <w:b/>
+          <w:bCs/>
+        </w:rPr>
+        <w:t xml:space="preserve">Contacts.</w:t>
+      </w:r>
+      <w:r>
+        <w:t xml:space="preserve"> </w:t>
+      </w:r>
+      <w:r>
+        <w:t xml:space="preserve">[Co-organizer, title, phone, email] · Anar Tuvshinbayar, Hackathon Mongolia, [phone, email] · Uram Enerel NGO, [address, registration number, bank].</w:t>
+      </w:r>
+    </w:p>
+    <w:p>
+      <w:r>
+        <w:pict>
+          <v:rect style="width:0;height:1.5pt" o:hralign="center" o:hrstd="t" o:hr="t"/>
+        </w:pict>
+      </w:r>
+    </w:p>
+    <w:bookmarkEnd w:id="16"/>
+    <w:bookmarkStart w:id="17" w:name="монгол-хураангуй"/>
+    <w:p>
+      <w:pPr>
+        <w:pStyle w:val="Heading2"/>
+      </w:pPr>
+      <w:r>
+        <w:t xml:space="preserve">Монгол хураангуй</w:t>
+      </w:r>
+    </w:p>
+    <w:p>
+      <w:pPr>
+        <w:pStyle w:val="FirstParagraph"/>
+      </w:pPr>
+      <w:r>
+        <w:rPr>
+          <w:b/>
+          <w:bCs/>
+        </w:rPr>
+        <w:t xml:space="preserve">Touch Grass · Залуучуудын 24 цагийн хакатон · Эрүүл мэнд × Хүрээлэн буй орчин · 2026.11.07–08 · [байршил]</w:t>
+      </w:r>
+    </w:p>
+    <w:p>
+      <w:pPr>
+        <w:pStyle w:val="BodyText"/>
+      </w:pPr>
+      <w:r>
+        <w:rPr>
+          <w:b/>
+          <w:bCs/>
+        </w:rPr>
+        <w:t xml:space="preserve">Юу болох вэ.</w:t>
+      </w:r>
+      <w:r>
+        <w:t xml:space="preserve"> </w:t>
+      </w:r>
+      <w:r>
+        <w:t xml:space="preserve">220 гаруй ахлах ангийн сурагч, оюутан 55 орчим багт хуваагдан 24 цагийн дотор хүрээлэн буй орчноос үүдэлтэй эрүүл мэндийн асуудлуудад ажиллах прототип бүтээнэ. Зургаан чиглэл: цэвэр агаар ба уушгины эрүүл мэнд; угаарын хийн хордлого; хөрс, усны бохирдол; хог хаягдал; зуд, хүйтэн, халууны эрсдэл; эрүүл мэндийн өгөгдөл ба эрт сэрэмжлүүлэг. Инженер, эмч, байгаль орчны мэргэжилтнүүд баг бүрийг дүгнэнэ.</w:t>
+      </w:r>
+    </w:p>
+    <w:p>
+      <w:pPr>
+        <w:pStyle w:val="BodyText"/>
+      </w:pPr>
+      <w:r>
+        <w:rPr>
+          <w:b/>
+          <w:bCs/>
+        </w:rPr>
+        <w:t xml:space="preserve">Яагаад.</w:t>
+      </w:r>
+      <w:r>
+        <w:t xml:space="preserve"> </w:t>
+      </w:r>
+      <w:r>
+        <w:t xml:space="preserve">Монголд нас баралтын тав тутмын дөрөв нь халдварт бус өвчнөөс үүдэлтэй бөгөөд хүний амьдардаг орчин үүнд шууд нөлөөлдөг. Өгөгдөл нээлттэй, залуучууд чадвартай, гэвч хэн ч тэднийг энэ асуудалд чиглүүлээгүй. Монголд сурагч, оюутнууд өөрсдөө зохион байгуулсан, эрүүл мэнд ба хүрээлэн буй орчныг нэгтгэсэн, 150-аас дээш оролцогчтой хакатон өнөөг хүртэл болоогүй.</w:t>
+      </w:r>
+    </w:p>
+    <w:p>
+      <w:pPr>
+        <w:pStyle w:val="BodyText"/>
+      </w:pPr>
+      <w:r>
+        <w:rPr>
+          <w:b/>
+          <w:bCs/>
+        </w:rPr>
+        <w:t xml:space="preserve">Хэн.</w:t>
+      </w:r>
+      <w:r>
+        <w:t xml:space="preserve"> </w:t>
+      </w:r>
+      <w:r>
+        <w:t xml:space="preserve">Hackathon Mongolia — хөтөлбөр, шүүлт, бүртгэлийг хариуцах сурагч, оюутны зохион байгуулагчдын нэгдэл. Урам Энэрэл ТББ (Uram Care) — улсын бүртгэлтэй, залуучуудын эрүүл мэндийн ТББ, 1,500 гаруй сайн дурынхан, 15 гаруй сургуулийн салбартай; гэрээ, санхүү, тайланг хариуцна. [Төрийн байгууллага]-ын дэмжлэгтэй.</w:t>
+      </w:r>
+    </w:p>
+    <w:p>
+      <w:pPr>
+        <w:pStyle w:val="BodyText"/>
+      </w:pPr>
+      <w:r>
+        <w:rPr>
+          <w:b/>
+          <w:bCs/>
+        </w:rPr>
+        <w:t xml:space="preserve">Хүсэлт.</w:t>
+      </w:r>
+      <w:r>
+        <w:t xml:space="preserve"> </w:t>
+      </w:r>
+      <w:r>
+        <w:t xml:space="preserve">Ерөнхий ивээн тэтгэгч 20 сая; танхимын түнш 20 сая эсвэл танхимаар; чиглэлийн ивээн тэтгэгч 5 сая (6 чиглэл); хоол 10 сая эсвэл хоол хүнсээр; бэлэг дурсгал бараагаар; шагналын сан 5 саяас дээш, ивээн тэтгэгчдийн оролцоогоор нэмэгдэнэ. Нийт төсөв 52–63 сая төгрөг. Гэрээг Урам Энэрэл ТББ байгуулж, зар сурталчилгааны үйлчилгээний и-баримт олгоно.</w:t>
+      </w:r>
+    </w:p>
+    <w:p>
+      <w:pPr>
+        <w:pStyle w:val="BodyText"/>
+      </w:pPr>
+      <w:r>
+        <w:rPr>
+          <w:b/>
+          <w:bCs/>
+        </w:rPr>
+        <w:t xml:space="preserve">Шийдвэрийн хугацаа: 2026 оны 10-р сарын 25.</w:t>
+      </w:r>
+      <w:r>
+        <w:t xml:space="preserve"> </w:t>
+      </w:r>
+      <w:r>
+        <w:t xml:space="preserve">Холбоо барих: [нэр, утас, имэйл].</w:t>
+      </w:r>
+    </w:p>
+    <w:p>
+      <w:r>
+        <w:pict>
+          <v:rect style="width:0;height:1.5pt" o:hralign="center" o:hrstd="t" o:hr="t"/>
+        </w:pict>
+      </w:r>
+    </w:p>
+    <w:bookmarkEnd w:id="17"/>
+    <w:bookmarkEnd w:id="18"/>
+    <w:bookmarkStart w:id="24" w:name="part-b--for-the-organizing-team-only"/>
+    <w:p>
+      <w:pPr>
+        <w:pStyle w:val="Heading1"/>
+      </w:pPr>
+      <w:r>
+        <w:t xml:space="preserve">Part B · For the organizing team only</w:t>
+      </w:r>
+    </w:p>
+    <w:bookmarkStart w:id="19" w:name="the-90-second-pitch"/>
+    <w:p>
+      <w:pPr>
+        <w:pStyle w:val="Heading2"/>
+      </w:pPr>
+      <w:r>
+        <w:t xml:space="preserve">The 90-second pitch</w:t>
+      </w:r>
+    </w:p>
+    <w:p>
+      <w:pPr>
+        <w:pStyle w:val="FirstParagraph"/>
+      </w:pPr>
+      <w:r>
+        <w:t xml:space="preserve">"We are running Touch Grass, Mongolia's first student-led health and environment hackathon: 220 students, 24 hours, November 7 to 8. Teams build working prototypes for six specific problems: winter air and children's lungs, carbon monoxide in heated homes, contaminated wells and soil, waste, dzud and cold-wave health risks, and connecting environmental data to hospitals. Hackathon Mongolia runs the program; Uram Enerel, a registered youth health NGO with 15 school chapters, hosts it legally and is recognized by [government body]. Engineers and doctors judge. We are asking [company] to be the [tier] sponsor at [amount]. You get your name on a track, a judge seat, a workshop with 220 students, the winning prototypes first, and a report with numbers within a week. Commitments close October 25."</w:t>
+      </w:r>
+    </w:p>
+    <w:bookmarkEnd w:id="19"/>
+    <w:bookmarkStart w:id="20" w:name="questions-you-will-get"/>
+    <w:p>
+      <w:pPr>
+        <w:pStyle w:val="Heading2"/>
+      </w:pPr>
+      <w:r>
+        <w:t xml:space="preserve">Questions you will get</w:t>
+      </w:r>
+    </w:p>
+    <w:p>
+      <w:pPr>
+        <w:pStyle w:val="Compact"/>
+        <w:numPr>
+          <w:ilvl w:val="0"/>
+          <w:numId w:val="1002"/>
+        </w:numPr>
+      </w:pPr>
+      <w:r>
+        <w:rPr>
+          <w:i/>
+          <w:iCs/>
+        </w:rPr>
+        <w:t xml:space="preserve">Is this legal and deductible for us?</w:t>
+      </w:r>
+      <w:r>
+        <w:t xml:space="preserve"> </w:t>
+      </w:r>
+      <w:r>
+        <w:t xml:space="preserve">You pay Uram Enerel, a registered NGO, under a sponsorship contract and receive an e-barimt invoice for advertising services. Donations are not deductible for companies; advertising is.</w:t>
+      </w:r>
+    </w:p>
+    <w:p>
+      <w:pPr>
+        <w:pStyle w:val="Compact"/>
+        <w:numPr>
+          <w:ilvl w:val="0"/>
+          <w:numId w:val="1002"/>
+        </w:numPr>
+      </w:pPr>
+      <w:r>
+        <w:rPr>
+          <w:i/>
+          <w:iCs/>
+        </w:rPr>
+        <w:t xml:space="preserve">What exactly do we get?</w:t>
+      </w:r>
+      <w:r>
+        <w:t xml:space="preserve"> </w:t>
+      </w:r>
+      <w:r>
+        <w:t xml:space="preserve">The tier table. Hand them the page.</w:t>
+      </w:r>
+    </w:p>
+    <w:p>
+      <w:pPr>
+        <w:pStyle w:val="Compact"/>
+        <w:numPr>
+          <w:ilvl w:val="0"/>
+          <w:numId w:val="1002"/>
+        </w:numPr>
+      </w:pPr>
+      <w:r>
+        <w:rPr>
+          <w:i/>
+          <w:iCs/>
+        </w:rPr>
+        <w:t xml:space="preserve">Can we set our track's problem?</w:t>
+      </w:r>
+      <w:r>
+        <w:t xml:space="preserve"> </w:t>
+      </w:r>
+      <w:r>
+        <w:t xml:space="preserve">Yes, co-written with us by October 28, inside the theme.</w:t>
+      </w:r>
+    </w:p>
+    <w:p>
+      <w:pPr>
+        <w:pStyle w:val="Compact"/>
+        <w:numPr>
+          <w:ilvl w:val="0"/>
+          <w:numId w:val="1002"/>
+        </w:numPr>
+      </w:pPr>
+      <w:r>
+        <w:rPr>
+          <w:i/>
+          <w:iCs/>
+        </w:rPr>
+        <w:t xml:space="preserve">Can we recruit?</w:t>
+      </w:r>
+      <w:r>
+        <w:t xml:space="preserve"> </w:t>
+      </w:r>
+      <w:r>
+        <w:t xml:space="preserve">Workshop, conversations, and opt-in CVs. No mandatory data collection.</w:t>
+      </w:r>
+    </w:p>
+    <w:p>
+      <w:pPr>
+        <w:pStyle w:val="Compact"/>
+        <w:numPr>
+          <w:ilvl w:val="0"/>
+          <w:numId w:val="1002"/>
+        </w:numPr>
+      </w:pPr>
+      <w:r>
+        <w:rPr>
+          <w:i/>
+          <w:iCs/>
+        </w:rPr>
+        <w:t xml:space="preserve">Can we judge our own track?</w:t>
+      </w:r>
+      <w:r>
+        <w:t xml:space="preserve"> </w:t>
+      </w:r>
+      <w:r>
+        <w:t xml:space="preserve">One of three seats on the panel. The rubric decides.</w:t>
+      </w:r>
+    </w:p>
+    <w:p>
+      <w:pPr>
+        <w:pStyle w:val="Compact"/>
+        <w:numPr>
+          <w:ilvl w:val="0"/>
+          <w:numId w:val="1002"/>
+        </w:numPr>
+      </w:pPr>
+      <w:r>
+        <w:rPr>
+          <w:i/>
+          <w:iCs/>
+        </w:rPr>
+        <w:t xml:space="preserve">How big is the prize?</w:t>
+      </w:r>
+      <w:r>
+        <w:t xml:space="preserve"> </w:t>
+      </w:r>
+      <w:r>
+        <w:t xml:space="preserve">"At least 5,000,000 MNT for the top three, split 50 / 30 / 20, and it grows with every prize-pool sponsor." Never name a higher figure before October 25.</w:t>
+      </w:r>
+    </w:p>
+    <w:p>
+      <w:pPr>
+        <w:pStyle w:val="Compact"/>
+        <w:numPr>
+          <w:ilvl w:val="0"/>
+          <w:numId w:val="1002"/>
+        </w:numPr>
+      </w:pPr>
+      <w:r>
+        <w:rPr>
+          <w:i/>
+          <w:iCs/>
+        </w:rPr>
+        <w:t xml:space="preserve">What if too few register?</w:t>
+      </w:r>
+      <w:r>
+        <w:t xml:space="preserve"> </w:t>
+      </w:r>
+      <w:r>
+        <w:t xml:space="preserve">Weekly numbers to sponsors; under 150 we scale the budget and refund or roll over the difference, in the contract.</w:t>
+      </w:r>
+    </w:p>
+    <w:p>
+      <w:pPr>
+        <w:pStyle w:val="Compact"/>
+        <w:numPr>
+          <w:ilvl w:val="0"/>
+          <w:numId w:val="1002"/>
+        </w:numPr>
+      </w:pPr>
+      <w:r>
+        <w:rPr>
+          <w:i/>
+          <w:iCs/>
+        </w:rPr>
+        <w:t xml:space="preserve">Why not an established event?</w:t>
+      </w:r>
+      <w:r>
+        <w:t xml:space="preserve"> </w:t>
+      </w:r>
+      <w:r>
+        <w:t xml:space="preserve">There is none. Nothing independent has passed 150 people since 2021.</w:t>
+      </w:r>
+    </w:p>
+    <w:p>
+      <w:pPr>
+        <w:pStyle w:val="Compact"/>
+        <w:numPr>
+          <w:ilvl w:val="0"/>
+          <w:numId w:val="1002"/>
+        </w:numPr>
+      </w:pPr>
+      <w:r>
+        <w:rPr>
+          <w:i/>
+          <w:iCs/>
+        </w:rPr>
+        <w:t xml:space="preserve">Can we pay in kind?</w:t>
+      </w:r>
+      <w:r>
+        <w:t xml:space="preserve"> </w:t>
+      </w:r>
+      <w:r>
+        <w:t xml:space="preserve">Yes, at the tier the market value matches.</w:t>
+      </w:r>
+    </w:p>
+    <w:bookmarkEnd w:id="20"/>
+    <w:bookmarkStart w:id="21" w:name="email-template"/>
+    <w:p>
+      <w:pPr>
+        <w:pStyle w:val="Heading2"/>
+      </w:pPr>
+      <w:r>
+        <w:t xml:space="preserve">Email template</w:t>
+      </w:r>
+    </w:p>
+    <w:p>
+      <w:pPr>
+        <w:pStyle w:val="FirstParagraph"/>
+      </w:pPr>
+      <w:r>
+        <w:t xml:space="preserve">Subject: Sponsor Touch Grass, Mongolia's first youth health × environment hackathon, Nov 7–8</w:t>
+      </w:r>
+    </w:p>
+    <w:p>
+      <w:pPr>
+        <w:pStyle w:val="BlockText"/>
+      </w:pPr>
+      <w:r>
+        <w:t xml:space="preserve">Dear [name],</w:t>
+      </w:r>
+    </w:p>
+    <w:p>
+      <w:pPr>
+        <w:pStyle w:val="BlockText"/>
+      </w:pPr>
+      <w:r>
+        <w:t xml:space="preserve">Uram Enerel NGO (Uram Care) and the Hackathon Mongolia student collective are running Touch Grass, a 24-hour hackathon on November 7–8, 2026 for 220+ students, on health problems with environmental causes: winter air pollution, carbon monoxide poisoning, contaminated water and soil, waste, and climate shocks. Teams build working prototypes in six tracks, judged by engineers and doctors. The event is recognized by [government body].</w:t>
+      </w:r>
+    </w:p>
+    <w:p>
+      <w:pPr>
+        <w:pStyle w:val="BlockText"/>
+      </w:pPr>
+      <w:r>
+        <w:t xml:space="preserve">We are asking [company] to be our [tier] sponsor at [amount] MNT, or to provide [the venue / meals / merchandise / prizes] in kind. In return: [two or three benefits]. Sponsorship is contracted and invoiced through Uram Enerel NGO as advertising services.</w:t>
+      </w:r>
+    </w:p>
+    <w:p>
+      <w:pPr>
+        <w:pStyle w:val="BlockText"/>
+      </w:pPr>
+      <w:r>
+        <w:t xml:space="preserve">The proposal is attached. Could we meet for 20 minutes this week? Commitments close October 25.</w:t>
+      </w:r>
+    </w:p>
+    <w:p>
+      <w:pPr>
+        <w:pStyle w:val="BlockText"/>
+      </w:pPr>
+      <w:r>
+        <w:t xml:space="preserve">[name, title, phone]</w:t>
+      </w:r>
+    </w:p>
+    <w:bookmarkEnd w:id="21"/>
+    <w:bookmarkStart w:id="22" w:name="what-sponsors-receive-and-when"/>
+    <w:p>
+      <w:pPr>
+        <w:pStyle w:val="Heading2"/>
+      </w:pPr>
+      <w:r>
+        <w:t xml:space="preserve">What sponsors receive, and when</w:t>
       </w:r>
     </w:p>
     <w:tbl>
@@ -1568,18 +1821,18 @@
               <w:pStyle w:val="Compact"/>
             </w:pPr>
             <w:r>
-              <w:t xml:space="preserve">Item</w:t>
-            </w:r>
-          </w:p>
-        </w:tc>
-        <w:tc>
-          <w:tcPr/>
-          <w:p>
-            <w:pPr>
-              <w:pStyle w:val="Compact"/>
-            </w:pPr>
-            <w:r>
-              <w:t xml:space="preserve">Amount</w:t>
+              <w:t xml:space="preserve">When</w:t>
+            </w:r>
+          </w:p>
+        </w:tc>
+        <w:tc>
+          <w:tcPr/>
+          <w:p>
+            <w:pPr>
+              <w:pStyle w:val="Compact"/>
+            </w:pPr>
+            <w:r>
+              <w:t xml:space="preserve">Deliverable</w:t>
             </w:r>
           </w:p>
         </w:tc>
@@ -1592,18 +1845,18 @@
               <w:pStyle w:val="Compact"/>
             </w:pPr>
             <w:r>
-              <w:t xml:space="preserve">Venue, two days including overnight</w:t>
-            </w:r>
-          </w:p>
-        </w:tc>
-        <w:tc>
-          <w:tcPr/>
-          <w:p>
-            <w:pPr>
-              <w:pStyle w:val="Compact"/>
-            </w:pPr>
-            <w:r>
-              <w:t xml:space="preserve">20,000,000</w:t>
+              <w:t xml:space="preserve">On signing</w:t>
+            </w:r>
+          </w:p>
+        </w:tc>
+        <w:tc>
+          <w:tcPr/>
+          <w:p>
+            <w:pPr>
+              <w:pStyle w:val="Compact"/>
+            </w:pPr>
+            <w:r>
+              <w:t xml:space="preserve">logo on the website, registration page and announcements within 48 hours</w:t>
             </w:r>
           </w:p>
         </w:tc>
@@ -1616,18 +1869,18 @@
               <w:pStyle w:val="Compact"/>
             </w:pPr>
             <w:r>
-              <w:t xml:space="preserve">Cash prize pool for the top three teams: 50% / 30% / 20%</w:t>
-            </w:r>
-          </w:p>
-        </w:tc>
-        <w:tc>
-          <w:tcPr/>
-          <w:p>
-            <w:pPr>
-              <w:pStyle w:val="Compact"/>
-            </w:pPr>
-            <w:r>
-              <w:t xml:space="preserve">15,000,000</w:t>
+              <w:t xml:space="preserve">Oct 25 to Nov 6</w:t>
+            </w:r>
+          </w:p>
+        </w:tc>
+        <w:tc>
+          <w:tcPr/>
+          <w:p>
+            <w:pPr>
+              <w:pStyle w:val="Compact"/>
+            </w:pPr>
+            <w:r>
+              <w:t xml:space="preserve">track problem statements agreed by Oct 28; judges and speakers briefed Nov 6</w:t>
             </w:r>
           </w:p>
         </w:tc>
@@ -1640,18 +1893,18 @@
               <w:pStyle w:val="Compact"/>
             </w:pPr>
             <w:r>
-              <w:t xml:space="preserve">Food: five meals and snacks for 220 participants and 45 staff</w:t>
-            </w:r>
-          </w:p>
-        </w:tc>
-        <w:tc>
-          <w:tcPr/>
-          <w:p>
-            <w:pPr>
-              <w:pStyle w:val="Compact"/>
-            </w:pPr>
-            <w:r>
-              <w:t xml:space="preserve">10,000,000</w:t>
+              <w:t xml:space="preserve">Nov 7</w:t>
+            </w:r>
+          </w:p>
+        </w:tc>
+        <w:tc>
+          <w:tcPr/>
+          <w:p>
+            <w:pPr>
+              <w:pStyle w:val="Compact"/>
+            </w:pPr>
+            <w:r>
+              <w:t xml:space="preserve">opening slots (title, track); workshops (track); stage thanks at meals; logo on signage, table cards and the countdown screen</w:t>
             </w:r>
           </w:p>
         </w:tc>
@@ -1664,18 +1917,18 @@
               <w:pStyle w:val="Compact"/>
             </w:pPr>
             <w:r>
-              <w:t xml:space="preserve">T-shirts for 220 participants</w:t>
-            </w:r>
-          </w:p>
-        </w:tc>
-        <w:tc>
-          <w:tcPr/>
-          <w:p>
-            <w:pPr>
-              <w:pStyle w:val="Compact"/>
-            </w:pPr>
-            <w:r>
-              <w:t xml:space="preserve">3,300,000</w:t>
+              <w:t xml:space="preserve">Nov 8</w:t>
+            </w:r>
+          </w:p>
+        </w:tc>
+        <w:tc>
+          <w:tcPr/>
+          <w:p>
+            <w:pPr>
+              <w:pStyle w:val="Compact"/>
+            </w:pPr>
+            <w:r>
+              <w:t xml:space="preserve">judge seats; prize presentations; group photo with winners</w:t>
             </w:r>
           </w:p>
         </w:tc>
@@ -1688,18 +1941,18 @@
               <w:pStyle w:val="Compact"/>
             </w:pPr>
             <w:r>
-              <w:t xml:space="preserve">Judges, designers and finance support</w:t>
-            </w:r>
-          </w:p>
-        </w:tc>
-        <w:tc>
-          <w:tcPr/>
-          <w:p>
-            <w:pPr>
-              <w:pStyle w:val="Compact"/>
-            </w:pPr>
-            <w:r>
-              <w:t xml:space="preserve">3,000,000</w:t>
+              <w:t xml:space="preserve">Nov 9 to 10</w:t>
+            </w:r>
+          </w:p>
+        </w:tc>
+        <w:tc>
+          <w:tcPr/>
+          <w:p>
+            <w:pPr>
+              <w:pStyle w:val="Compact"/>
+            </w:pPr>
+            <w:r>
+              <w:t xml:space="preserve">results post and thank-you post with logos</w:t>
             </w:r>
           </w:p>
         </w:tc>
@@ -1712,18 +1965,18 @@
               <w:pStyle w:val="Compact"/>
             </w:pPr>
             <w:r>
-              <w:t xml:space="preserve">Power strips, cords, name tags, first aid, supplies</w:t>
-            </w:r>
-          </w:p>
-        </w:tc>
-        <w:tc>
-          <w:tcPr/>
-          <w:p>
-            <w:pPr>
-              <w:pStyle w:val="Compact"/>
-            </w:pPr>
-            <w:r>
-              <w:t xml:space="preserve">2,500,000</w:t>
+              <w:t xml:space="preserve">By Nov 13</w:t>
+            </w:r>
+          </w:p>
+        </w:tc>
+        <w:tc>
+          <w:tcPr/>
+          <w:p>
+            <w:pPr>
+              <w:pStyle w:val="Compact"/>
+            </w:pPr>
+            <w:r>
+              <w:t xml:space="preserve">written report: participants, institutions, teams, projects with links, photos, media, survey, itemized spending</w:t>
             </w:r>
           </w:p>
         </w:tc>
@@ -1736,274 +1989,31 @@
               <w:pStyle w:val="Compact"/>
             </w:pPr>
             <w:r>
-              <w:t xml:space="preserve">Stickers, badges, lanyards</w:t>
-            </w:r>
-          </w:p>
-        </w:tc>
-        <w:tc>
-          <w:tcPr/>
-          <w:p>
-            <w:pPr>
-              <w:pStyle w:val="Compact"/>
-            </w:pPr>
-            <w:r>
-              <w:t xml:space="preserve">1,100,000</w:t>
-            </w:r>
-          </w:p>
-        </w:tc>
-      </w:tr>
-      <w:tr>
-        <w:tc>
-          <w:tcPr/>
-          <w:p>
-            <w:pPr>
-              <w:pStyle w:val="Compact"/>
-            </w:pPr>
-            <w:r>
-              <w:t xml:space="preserve">Photography and video</w:t>
-            </w:r>
-          </w:p>
-        </w:tc>
-        <w:tc>
-          <w:tcPr/>
-          <w:p>
-            <w:pPr>
-              <w:pStyle w:val="Compact"/>
-            </w:pPr>
-            <w:r>
-              <w:t xml:space="preserve">800,000</w:t>
-            </w:r>
-          </w:p>
-        </w:tc>
-      </w:tr>
-      <w:tr>
-        <w:tc>
-          <w:tcPr/>
-          <w:p>
-            <w:pPr>
-              <w:pStyle w:val="Compact"/>
-            </w:pPr>
-            <w:r>
-              <w:t xml:space="preserve">Overnight security and cleaning</w:t>
-            </w:r>
-          </w:p>
-        </w:tc>
-        <w:tc>
-          <w:tcPr/>
-          <w:p>
-            <w:pPr>
-              <w:pStyle w:val="Compact"/>
-            </w:pPr>
-            <w:r>
-              <w:t xml:space="preserve">800,000</w:t>
-            </w:r>
-          </w:p>
-        </w:tc>
-      </w:tr>
-      <w:tr>
-        <w:tc>
-          <w:tcPr/>
-          <w:p>
-            <w:pPr>
-              <w:pStyle w:val="Compact"/>
-            </w:pPr>
-            <w:r>
-              <w:t xml:space="preserve">Printing and signage</w:t>
-            </w:r>
-          </w:p>
-        </w:tc>
-        <w:tc>
-          <w:tcPr/>
-          <w:p>
-            <w:pPr>
-              <w:pStyle w:val="Compact"/>
-            </w:pPr>
-            <w:r>
-              <w:t xml:space="preserve">700,000</w:t>
-            </w:r>
-          </w:p>
-        </w:tc>
-      </w:tr>
-      <w:tr>
-        <w:tc>
-          <w:tcPr/>
-          <w:p>
-            <w:pPr>
-              <w:pStyle w:val="Compact"/>
-            </w:pPr>
-            <w:r>
-              <w:t xml:space="preserve">First aider on site for 24 hours</w:t>
-            </w:r>
-          </w:p>
-        </w:tc>
-        <w:tc>
-          <w:tcPr/>
-          <w:p>
-            <w:pPr>
-              <w:pStyle w:val="Compact"/>
-            </w:pPr>
-            <w:r>
-              <w:t xml:space="preserve">300,000</w:t>
-            </w:r>
-          </w:p>
-        </w:tc>
-      </w:tr>
-      <w:tr>
-        <w:tc>
-          <w:tcPr/>
-          <w:p>
-            <w:pPr>
-              <w:pStyle w:val="Compact"/>
-            </w:pPr>
-            <w:r>
-              <w:t xml:space="preserve">Contingency 10%</w:t>
-            </w:r>
-          </w:p>
-        </w:tc>
-        <w:tc>
-          <w:tcPr/>
-          <w:p>
-            <w:pPr>
-              <w:pStyle w:val="Compact"/>
-            </w:pPr>
-            <w:r>
-              <w:t xml:space="preserve">5,750,000</w:t>
-            </w:r>
-          </w:p>
-        </w:tc>
-      </w:tr>
-      <w:tr>
-        <w:tc>
-          <w:tcPr/>
-          <w:p>
-            <w:pPr>
-              <w:pStyle w:val="Compact"/>
-            </w:pPr>
-            <w:r>
-              <w:rPr>
-                <w:b/>
-                <w:bCs/>
-              </w:rPr>
-              <w:t xml:space="preserve">Total</w:t>
-            </w:r>
-          </w:p>
-        </w:tc>
-        <w:tc>
-          <w:tcPr/>
-          <w:p>
-            <w:pPr>
-              <w:pStyle w:val="Compact"/>
-            </w:pPr>
-            <w:r>
-              <w:rPr>
-                <w:b/>
-                <w:bCs/>
-              </w:rPr>
-              <w:t xml:space="preserve">63,250,000</w:t>
+              <w:t xml:space="preserve">After</w:t>
+            </w:r>
+          </w:p>
+        </w:tc>
+        <w:tc>
+          <w:tcPr/>
+          <w:p>
+            <w:pPr>
+              <w:pStyle w:val="Compact"/>
+            </w:pPr>
+            <w:r>
+              <w:t xml:space="preserve">introductions to winning teams on request; opt-in CVs (title and track)</w:t>
             </w:r>
           </w:p>
         </w:tc>
       </w:tr>
     </w:tbl>
-    <w:p>
-      <w:pPr>
-        <w:pStyle w:val="BodyText"/>
-      </w:pPr>
-      <w:r>
-        <w:t xml:space="preserve">Wifi is provided by the venue. If the venue partner provides the hall in kind, the cash budget falls to about 43,000,000 MNT. If a sponsor provides catering or merchandise directly, the cash budget falls by that amount.</w:t>
-      </w:r>
-    </w:p>
-    <w:p>
-      <w:r>
-        <w:pict>
-          <v:rect style="width:0;height:1.5pt" o:hralign="center" o:hrstd="t" o:hr="t"/>
-        </w:pict>
-      </w:r>
-    </w:p>
-    <w:bookmarkEnd w:id="16"/>
-    <w:bookmarkStart w:id="17" w:name="X5487b8829963d5e59ab6b334279302566209e91"/>
+    <w:bookmarkEnd w:id="22"/>
+    <w:bookmarkStart w:id="23" w:name="target-list-by-tier-fit"/>
     <w:p>
       <w:pPr>
         <w:pStyle w:val="Heading2"/>
       </w:pPr>
       <w:r>
-        <w:t xml:space="preserve">8. How to say yes</w:t>
-      </w:r>
-    </w:p>
-    <w:p>
-      <w:pPr>
-        <w:pStyle w:val="Compact"/>
-        <w:numPr>
-          <w:ilvl w:val="0"/>
-          <w:numId w:val="1003"/>
-        </w:numPr>
-      </w:pPr>
-      <w:r>
-        <w:t xml:space="preserve">Reply to [co-organizer name] by</w:t>
-      </w:r>
-      <w:r>
-        <w:t xml:space="preserve"> </w:t>
-      </w:r>
-      <w:r>
-        <w:rPr>
-          <w:b/>
-          <w:bCs/>
-        </w:rPr>
-        <w:t xml:space="preserve">October 25, 2026</w:t>
-      </w:r>
-      <w:r>
-        <w:t xml:space="preserve"> </w:t>
-      </w:r>
-      <w:r>
-        <w:t xml:space="preserve">with the tier you want.</w:t>
-      </w:r>
-    </w:p>
-    <w:p>
-      <w:pPr>
-        <w:pStyle w:val="Compact"/>
-        <w:numPr>
-          <w:ilvl w:val="0"/>
-          <w:numId w:val="1003"/>
-        </w:numPr>
-      </w:pPr>
-      <w:r>
-        <w:t xml:space="preserve">Uram Enerel sends a one-page sponsorship contract: amount, payment date, the exact benefits of your tier, logo usage, refund or roll-over if the event is cancelled, and no control over judging or program.</w:t>
-      </w:r>
-    </w:p>
-    <w:p>
-      <w:pPr>
-        <w:pStyle w:val="Compact"/>
-        <w:numPr>
-          <w:ilvl w:val="0"/>
-          <w:numId w:val="1003"/>
-        </w:numPr>
-      </w:pPr>
-      <w:r>
-        <w:t xml:space="preserve">Uram Enerel invoices the sponsorship as advertising services and issues an e-barimt receipt. Under Article 19 of the Law on Advertising, a sponsor's contribution to an advertising distributor under contract is counted as advertising payment, so it books as an ordinary marketing expense rather than a non-deductible donation. Product prizes are welcome and avoid prize-tax paperwork; cash prizes paid to winners carry 5 percent personal income tax, which Uram Enerel withholds and remits.</w:t>
-      </w:r>
-    </w:p>
-    <w:p>
-      <w:pPr>
-        <w:pStyle w:val="Compact"/>
-        <w:numPr>
-          <w:ilvl w:val="0"/>
-          <w:numId w:val="1003"/>
-        </w:numPr>
-      </w:pPr>
-      <w:r>
-        <w:t xml:space="preserve">Send your logo files and a 40-word description for the website.</w:t>
-      </w:r>
-    </w:p>
-    <w:p>
-      <w:pPr>
-        <w:pStyle w:val="Compact"/>
-        <w:numPr>
-          <w:ilvl w:val="0"/>
-          <w:numId w:val="1003"/>
-        </w:numPr>
-      </w:pPr>
-      <w:r>
-        <w:t xml:space="preserve">Name your judge and, for track sponsors, your workshop speaker by October 30.</w:t>
+        <w:t xml:space="preserve">Target list, by tier fit</w:t>
       </w:r>
     </w:p>
     <w:p>
@@ -2011,513 +2021,11 @@
         <w:pStyle w:val="FirstParagraph"/>
       </w:pPr>
       <w:r>
-        <w:rPr>
-          <w:b/>
-          <w:bCs/>
-        </w:rPr>
-        <w:t xml:space="preserve">Contacts</w:t>
-      </w:r>
-      <w:r>
-        <w:t xml:space="preserve"> </w:t>
-      </w:r>
-      <w:r>
-        <w:t xml:space="preserve">[Co-organizer name, title, phone, email]</w:t>
-      </w:r>
-      <w:r>
-        <w:t xml:space="preserve"> </w:t>
-      </w:r>
-      <w:r>
-        <w:t xml:space="preserve">Anar Tuvshinbayar, co-organizer, [phone, email]</w:t>
-      </w:r>
-      <w:r>
-        <w:t xml:space="preserve"> </w:t>
-      </w:r>
-      <w:r>
-        <w:t xml:space="preserve">Uram Enerel NGO (Uram Care), [address, registration number, bank]</w:t>
-      </w:r>
-    </w:p>
-    <w:p>
-      <w:r>
-        <w:pict>
-          <v:rect style="width:0;height:1.5pt" o:hralign="center" o:hrstd="t" o:hr="t"/>
-        </w:pict>
-      </w:r>
-    </w:p>
-    <w:bookmarkEnd w:id="17"/>
-    <w:bookmarkStart w:id="18" w:name="Xc9d430fa02d676db84d6d61556f90193069318b"/>
-    <w:p>
-      <w:pPr>
-        <w:pStyle w:val="Heading2"/>
-      </w:pPr>
-      <w:r>
-        <w:t xml:space="preserve">9. Meeting kit for the co-organizer</w:t>
-      </w:r>
-    </w:p>
-    <w:p>
-      <w:pPr>
-        <w:pStyle w:val="FirstParagraph"/>
-      </w:pPr>
-      <w:r>
-        <w:rPr>
-          <w:b/>
-          <w:bCs/>
-        </w:rPr>
-        <w:t xml:space="preserve">The 90-second pitch.</w:t>
-      </w:r>
-      <w:r>
-        <w:t xml:space="preserve"> </w:t>
-      </w:r>
-      <w:r>
-        <w:t xml:space="preserve">"We are running Touch Grass, Mongolia's first student-led health and environment hackathon: 220 students, 24 hours, November 7 to 8. Teams build working prototypes for six specific problems: children's exposure to winter air pollution, carbon monoxide poisoning from briquettes, contaminated well water in ger districts, waste, dzud and cold-wave health risks, and connecting environmental data to hospitals. The event is a collaboration between Hackathon Mongolia, our student organizing collective, and Uram Enerel NGO, a registered youth health NGO with 15 school chapters that hosts it legally and is recognized by [government body]. It is judged by engineers and doctors. We are asking [company] to be the [tier] sponsor at [amount]. You get your name on a track, a judge seat, a workshop with 220 students, the winning prototypes first, and a report with numbers within a week. Commitments close October 25."</w:t>
-      </w:r>
-    </w:p>
-    <w:p>
-      <w:pPr>
-        <w:pStyle w:val="BodyText"/>
-      </w:pPr>
-      <w:r>
-        <w:rPr>
-          <w:b/>
-          <w:bCs/>
-        </w:rPr>
-        <w:t xml:space="preserve">Questions you will get, and the answers.</w:t>
-      </w:r>
-    </w:p>
-    <w:p>
-      <w:pPr>
-        <w:pStyle w:val="Compact"/>
-        <w:numPr>
-          <w:ilvl w:val="0"/>
-          <w:numId w:val="1004"/>
-        </w:numPr>
-      </w:pPr>
-      <w:r>
-        <w:rPr>
-          <w:i/>
-          <w:iCs/>
-        </w:rPr>
-        <w:t xml:space="preserve">Is sponsoring students legal and deductible for us?</w:t>
-      </w:r>
-      <w:r>
-        <w:t xml:space="preserve"> </w:t>
-      </w:r>
-      <w:r>
-        <w:t xml:space="preserve">You pay Uram Enerel, a registered NGO, under a sponsorship contract, and receive an e-barimt invoice for advertising services. Plain donations are not deductible for companies, so we structure it as advertising, which is deductible.</w:t>
-      </w:r>
-    </w:p>
-    <w:p>
-      <w:pPr>
-        <w:pStyle w:val="Compact"/>
-        <w:numPr>
-          <w:ilvl w:val="0"/>
-          <w:numId w:val="1004"/>
-        </w:numPr>
-      </w:pPr>
-      <w:r>
-        <w:rPr>
-          <w:i/>
-          <w:iCs/>
-        </w:rPr>
-        <w:t xml:space="preserve">What exactly do we get for the money?</w:t>
-      </w:r>
-      <w:r>
-        <w:t xml:space="preserve"> </w:t>
-      </w:r>
-      <w:r>
-        <w:t xml:space="preserve">The tier table, nothing more and nothing less. Hand them the page.</w:t>
-      </w:r>
-    </w:p>
-    <w:p>
-      <w:pPr>
-        <w:pStyle w:val="Compact"/>
-        <w:numPr>
-          <w:ilvl w:val="0"/>
-          <w:numId w:val="1004"/>
-        </w:numPr>
-      </w:pPr>
-      <w:r>
-        <w:rPr>
-          <w:i/>
-          <w:iCs/>
-        </w:rPr>
-        <w:t xml:space="preserve">Can we set the problem for our track?</w:t>
-      </w:r>
-      <w:r>
-        <w:t xml:space="preserve"> </w:t>
-      </w:r>
-      <w:r>
-        <w:t xml:space="preserve">Yes. Track sponsors co-write the problem statements with us by October 28, within the health and environment theme.</w:t>
-      </w:r>
-    </w:p>
-    <w:p>
-      <w:pPr>
-        <w:pStyle w:val="Compact"/>
-        <w:numPr>
-          <w:ilvl w:val="0"/>
-          <w:numId w:val="1004"/>
-        </w:numPr>
-      </w:pPr>
-      <w:r>
-        <w:rPr>
-          <w:i/>
-          <w:iCs/>
-        </w:rPr>
-        <w:t xml:space="preserve">Can we recruit?</w:t>
-      </w:r>
-      <w:r>
-        <w:t xml:space="preserve"> </w:t>
-      </w:r>
-      <w:r>
-        <w:t xml:space="preserve">You can run a workshop, talk to participants, and receive CVs of those who opt in. No mandatory data collection.</w:t>
-      </w:r>
-    </w:p>
-    <w:p>
-      <w:pPr>
-        <w:pStyle w:val="Compact"/>
-        <w:numPr>
-          <w:ilvl w:val="0"/>
-          <w:numId w:val="1004"/>
-        </w:numPr>
-      </w:pPr>
-      <w:r>
-        <w:rPr>
-          <w:i/>
-          <w:iCs/>
-        </w:rPr>
-        <w:t xml:space="preserve">Can we judge our own track?</w:t>
-      </w:r>
-      <w:r>
-        <w:t xml:space="preserve"> </w:t>
-      </w:r>
-      <w:r>
-        <w:t xml:space="preserve">You seat one judge of three on the track panel. The rubric decides.</w:t>
-      </w:r>
-    </w:p>
-    <w:p>
-      <w:pPr>
-        <w:pStyle w:val="Compact"/>
-        <w:numPr>
-          <w:ilvl w:val="0"/>
-          <w:numId w:val="1004"/>
-        </w:numPr>
-      </w:pPr>
-      <w:r>
-        <w:rPr>
-          <w:i/>
-          <w:iCs/>
-        </w:rPr>
-        <w:t xml:space="preserve">What if too few students register?</w:t>
-      </w:r>
-      <w:r>
-        <w:t xml:space="preserve"> </w:t>
-      </w:r>
-      <w:r>
-        <w:t xml:space="preserve">Registration opens October 12 and we report numbers to sponsors weekly. If attendance falls below 150 we scale the budget and refund or roll over the difference, in the contract.</w:t>
-      </w:r>
-    </w:p>
-    <w:p>
-      <w:pPr>
-        <w:pStyle w:val="Compact"/>
-        <w:numPr>
-          <w:ilvl w:val="0"/>
-          <w:numId w:val="1004"/>
-        </w:numPr>
-      </w:pPr>
-      <w:r>
-        <w:rPr>
-          <w:i/>
-          <w:iCs/>
-        </w:rPr>
-        <w:t xml:space="preserve">Why not sponsor a bigger, established event?</w:t>
-      </w:r>
-      <w:r>
-        <w:t xml:space="preserve"> </w:t>
-      </w:r>
-      <w:r>
-        <w:t xml:space="preserve">Because there is none. No independent hackathon in Mongolia has passed 150 people since 2021, and none has taken this theme.</w:t>
-      </w:r>
-    </w:p>
-    <w:p>
-      <w:pPr>
-        <w:pStyle w:val="Compact"/>
-        <w:numPr>
-          <w:ilvl w:val="0"/>
-          <w:numId w:val="1004"/>
-        </w:numPr>
-      </w:pPr>
-      <w:r>
-        <w:rPr>
-          <w:i/>
-          <w:iCs/>
-        </w:rPr>
-        <w:t xml:space="preserve">Can we pay in kind?</w:t>
-      </w:r>
-      <w:r>
-        <w:t xml:space="preserve"> </w:t>
-      </w:r>
-      <w:r>
-        <w:t xml:space="preserve">Yes. Catering, wifi, venue, printing, prizes and hardware all count, at the tier their market value matches.</w:t>
-      </w:r>
-    </w:p>
-    <w:p>
-      <w:pPr>
-        <w:pStyle w:val="FirstParagraph"/>
-      </w:pPr>
-      <w:r>
-        <w:rPr>
-          <w:b/>
-          <w:bCs/>
-        </w:rPr>
-        <w:t xml:space="preserve">Email template.</w:t>
-      </w:r>
-    </w:p>
-    <w:p>
-      <w:pPr>
-        <w:pStyle w:val="BodyText"/>
-      </w:pPr>
-      <w:r>
-        <w:t xml:space="preserve">Subject: Sponsor Touch Grass, Mongolia's first youth health × environment hackathon, Nov 7–8</w:t>
-      </w:r>
-    </w:p>
-    <w:p>
-      <w:pPr>
-        <w:pStyle w:val="BlockText"/>
-      </w:pPr>
-      <w:r>
-        <w:t xml:space="preserve">Dear [name],</w:t>
-      </w:r>
-    </w:p>
-    <w:p>
-      <w:pPr>
-        <w:pStyle w:val="BlockText"/>
-      </w:pPr>
-      <w:r>
-        <w:t xml:space="preserve">Uram Enerel NGO (Uram Care) and the Hackathon Mongolia student collective are running Touch Grass, a 24-hour hackathon on November 7–8, 2026 for 220+ students, on the health problems caused by Ulaanbaatar's environment: winter air pollution and children's lungs, carbon monoxide poisoning, contaminated water and soil in ger districts, waste, and climate shocks. Teams build working prototypes in six tracks, judged by engineers and doctors. The event is recognized by [government body].</w:t>
-      </w:r>
-    </w:p>
-    <w:p>
-      <w:pPr>
-        <w:pStyle w:val="BlockText"/>
-      </w:pPr>
-      <w:r>
-        <w:t xml:space="preserve">We are asking [company] to be our [tier] sponsor at [amount] MNT, or to provide [meals / the venue / merchandise / prizes] in kind. In return: [two or three benefits]. Sponsorship is contracted and invoiced through Uram Enerel NGO as advertising services.</w:t>
-      </w:r>
-    </w:p>
-    <w:p>
-      <w:pPr>
-        <w:pStyle w:val="BlockText"/>
-      </w:pPr>
-      <w:r>
-        <w:t xml:space="preserve">I have attached the proposal. Could we meet for 20 minutes this week? Commitments close October 25.</w:t>
-      </w:r>
-    </w:p>
-    <w:p>
-      <w:pPr>
-        <w:pStyle w:val="BlockText"/>
-      </w:pPr>
-      <w:r>
-        <w:t xml:space="preserve">[name, title, phone]</w:t>
-      </w:r>
-    </w:p>
-    <w:p>
-      <w:r>
-        <w:pict>
-          <v:rect style="width:0;height:1.5pt" o:hralign="center" o:hrstd="t" o:hr="t"/>
-        </w:pict>
-      </w:r>
-    </w:p>
-    <w:bookmarkEnd w:id="18"/>
-    <w:bookmarkStart w:id="19" w:name="Xafbb822c56ef8dce225880eca97748e5f7cd41d"/>
-    <w:p>
-      <w:pPr>
-        <w:pStyle w:val="Heading2"/>
-      </w:pPr>
-      <w:r>
-        <w:t xml:space="preserve">10. Монгол хураангуй</w:t>
-      </w:r>
-    </w:p>
-    <w:p>
-      <w:pPr>
-        <w:pStyle w:val="FirstParagraph"/>
-      </w:pPr>
-      <w:r>
-        <w:rPr>
-          <w:b/>
-          <w:bCs/>
-        </w:rPr>
-        <w:t xml:space="preserve">Touch Grass · Залуучуудын 24 цагийн хакатон · Эрүүл мэнд × Хүрээлэн буй орчин</w:t>
-      </w:r>
-      <w:r>
-        <w:t xml:space="preserve"> </w:t>
-      </w:r>
-      <w:r>
-        <w:rPr>
-          <w:b/>
-          <w:bCs/>
-        </w:rPr>
-        <w:t xml:space="preserve">2026 оны 11-р сарын 7–8 · Улаанбаатар · [байршил]</w:t>
-      </w:r>
-    </w:p>
-    <w:p>
-      <w:pPr>
-        <w:pStyle w:val="BodyText"/>
-      </w:pPr>
-      <w:r>
-        <w:rPr>
-          <w:b/>
-          <w:bCs/>
-        </w:rPr>
-        <w:t xml:space="preserve">Юу болох вэ.</w:t>
-      </w:r>
-      <w:r>
-        <w:t xml:space="preserve"> </w:t>
-      </w:r>
-      <w:r>
-        <w:t xml:space="preserve">220 гаруй ахлах ангийн сурагч, оюутан 55 орчим багт хуваагдан 24 цагийн дотор Улаанбаатарын хүрээлэн буй орчноос үүдэлтэй эрүүл мэндийн асуудлуудад ажиллах прототип бүтээнэ. Зургаан чиглэл: өвлийн агаарын бохирдол ба хүүхдийн уушгины өвчин; угаарын хийн хордлого; гэр хорооллын хөрс, худгийн усны бохирдол; хог хаягдал ба эрүүл мэнд; зуд, хүйтний давалгаа зэрэг уур амьсгалын эрсдэл; хүрээлэн буй орчны өгөгдлийг эмнэлэгтэй холбох. Инженер, эмч, байгаль орчны мэргэжилтнүүдээс бүрдсэн шүүгчид баг бүрийг дүгнэж, чиглэл тус бүрийн шилдэг баг тайзан дээр танилцуулна.</w:t>
-      </w:r>
-    </w:p>
-    <w:p>
-      <w:pPr>
-        <w:pStyle w:val="BodyText"/>
-      </w:pPr>
-      <w:r>
-        <w:rPr>
-          <w:b/>
-          <w:bCs/>
-        </w:rPr>
-        <w:t xml:space="preserve">Хэн зохион байгуулах вэ.</w:t>
-      </w:r>
-      <w:r>
-        <w:t xml:space="preserve"> </w:t>
-      </w:r>
-      <w:r>
-        <w:t xml:space="preserve">Хоёр байгууллагын хамтын ажиллагаа:</w:t>
-      </w:r>
-      <w:r>
-        <w:t xml:space="preserve"> </w:t>
-      </w:r>
-      <w:r>
-        <w:rPr>
-          <w:b/>
-          <w:bCs/>
-        </w:rPr>
-        <w:t xml:space="preserve">Hackathon Mongolia</w:t>
-      </w:r>
-      <w:r>
-        <w:t xml:space="preserve"> </w:t>
-      </w:r>
-      <w:r>
-        <w:t xml:space="preserve">— хөтөлбөр, чиглэл, шүүлт, бүртгэлийг хариуцах сурагч, оюутны зохион байгуулагчдын нэгдэл;</w:t>
-      </w:r>
-      <w:r>
-        <w:t xml:space="preserve"> </w:t>
-      </w:r>
-      <w:r>
-        <w:rPr>
-          <w:b/>
-          <w:bCs/>
-        </w:rPr>
-        <w:t xml:space="preserve">Урам Энэрэл ТББ (Uram Care)</w:t>
-      </w:r>
-      <w:r>
-        <w:t xml:space="preserve"> </w:t>
-      </w:r>
-      <w:r>
-        <w:t xml:space="preserve">— улсын бүртгэлтэй, залуучуудын эрүүл мэндийн чиглэлийн ТББ, Монгол даяар 1,500 гаруй сайн дурынхан, 15 гаруй сургуулийн салбартай; гэрээ, санхүү, тайланг хариуцах хууль ёсны зохион байгуулагч. [Төрийн байгууллага]-ын дэмжлэгтэй. Хариуцах насанд хүрсэн хүн: [нэр, албан тушаал].</w:t>
-      </w:r>
-    </w:p>
-    <w:p>
-      <w:pPr>
-        <w:pStyle w:val="BodyText"/>
-      </w:pPr>
-      <w:r>
-        <w:rPr>
-          <w:b/>
-          <w:bCs/>
-        </w:rPr>
-        <w:t xml:space="preserve">Яагаад одоо вэ.</w:t>
-      </w:r>
-      <w:r>
-        <w:t xml:space="preserve"> </w:t>
-      </w:r>
-      <w:r>
-        <w:t xml:space="preserve">Улаанбаатарт хүйтний улиралд PM2.5 тоосонцрын өдрийн дундаж 687 мкг/м³ хүрч байсан нь ДЭМБ-ын зөвлөмжөөс 27 дахин их. 2017–2024 онд угаарын хийн хордлогоор 779 хүн нас барсан. Гэр хорооллын хөрсний 88 хувь нянгаар бохирдсон. Эдгээр асуудалд залуучуудын технологийн авьяасыг чиглүүлсэн арга хэмжээ өнөөг хүртэл байгаагүй.</w:t>
-      </w:r>
-    </w:p>
-    <w:p>
-      <w:pPr>
-        <w:pStyle w:val="BodyText"/>
-      </w:pPr>
-      <w:r>
-        <w:rPr>
-          <w:b/>
-          <w:bCs/>
-        </w:rPr>
-        <w:t xml:space="preserve">Ивээн тэтгэгч юу авах вэ.</w:t>
-      </w:r>
-      <w:r>
-        <w:t xml:space="preserve"> </w:t>
-      </w:r>
-      <w:r>
-        <w:t xml:space="preserve">Логогоо 55 прототип, вэбсайт, тайз, үр дүнгийн мэдээлэлд байршуулах; нээлтэд үг хэлэх; шүүгчийн суудал; 220 оюутантай ажиллах семинар; ялагч багуудтай эхэлж танилцах; 7 хоногийн дотор тоо баримт, зурагтай тайлан.</w:t>
-      </w:r>
-    </w:p>
-    <w:p>
-      <w:pPr>
-        <w:pStyle w:val="BodyText"/>
-      </w:pPr>
-      <w:r>
-        <w:rPr>
-          <w:b/>
-          <w:bCs/>
-        </w:rPr>
-        <w:t xml:space="preserve">Хүсэлт.</w:t>
-      </w:r>
-      <w:r>
-        <w:t xml:space="preserve"> </w:t>
-      </w:r>
-      <w:r>
-        <w:t xml:space="preserve">Ерөнхий ивээн тэтгэгч 20 сая төгрөг; танхимын түнш 20 сая төгрөг эсвэл танхимаар; чиглэлийн ивээн тэтгэгч 5 сая төгрөг (6 чиглэл); хоолны ивээн тэтгэгч 10 сая төгрөг эсвэл хоол хүнсээр; бэлэг дурсгал (220 цамц, наалт) бараагаар; шагналын санд оруулах хувь нэмэр. Нийт төсөв 63 сая төгрөг орчим, үүнээс 15 сая төгрөг нь шилдэг гурван багийн мөнгөн шагнал (50% / 30% / 20%).</w:t>
-      </w:r>
-    </w:p>
-    <w:p>
-      <w:pPr>
-        <w:pStyle w:val="BodyText"/>
-      </w:pPr>
-      <w:r>
-        <w:rPr>
-          <w:b/>
-          <w:bCs/>
-        </w:rPr>
-        <w:t xml:space="preserve">Хууль, санхүү.</w:t>
-      </w:r>
-      <w:r>
-        <w:t xml:space="preserve"> </w:t>
-      </w:r>
-      <w:r>
-        <w:t xml:space="preserve">Гэрээг Урам Энэрэл ТББ байгуулж, зар сурталчилгааны үйлчилгээний нэхэмжлэх, и-баримт олгоно (Зар сурталчилгааны тухай хуулийн 19 дүгээр зүйл). Санхүүгийн тайланг ивээн тэтгэгч бүрт хүргүүлнэ.</w:t>
-      </w:r>
-    </w:p>
-    <w:p>
-      <w:pPr>
-        <w:pStyle w:val="BodyText"/>
-      </w:pPr>
-      <w:r>
-        <w:rPr>
-          <w:b/>
-          <w:bCs/>
-        </w:rPr>
-        <w:t xml:space="preserve">Шийдвэрийн хугацаа: 2026 оны 10-р сарын 25.</w:t>
-      </w:r>
-      <w:r>
-        <w:t xml:space="preserve"> </w:t>
-      </w:r>
-      <w:r>
-        <w:t xml:space="preserve">Холбоо барих: [нэр, утас, имэйл].</w:t>
-      </w:r>
-    </w:p>
-    <w:bookmarkEnd w:id="19"/>
-    <w:bookmarkEnd w:id="20"/>
+        <w:t xml:space="preserve">Title and venue: banks, telecoms, a mining or energy company's CSR, a university or a sponsor's headquarters for the hall. Tracks: a hospital or clinic group for clean air, an insurer for safe heat, a water or beverage company for ground and water, a retailer or packaging company for waste, an insurer or telecom with rural reach for climate shocks, a bank or fintech data team for health data. Food: a food or beverage company. Merchandise: an apparel or print company. Keep 30 names in the finance team's sheet with tier, contact, date asked, status.</w:t>
+      </w:r>
+    </w:p>
+    <w:bookmarkEnd w:id="23"/>
+    <w:bookmarkEnd w:id="24"/>
     <w:sectPr>
       <w:footnotePr>
         <w:numRestart w:val="eachSect"/>
@@ -2628,6 +2136,91 @@
       </w:pPr>
     </w:lvl>
   </w:abstractNum>
+  <w:abstractNum w:abstractNumId="99411">
+    <w:nsid w:val="00A99411"/>
+    <w:multiLevelType w:val="multilevel"/>
+    <w:lvl w:ilvl="0">
+      <w:start w:val="1"/>
+      <w:numFmt w:val="decimal"/>
+      <w:lvlText w:val="%1."/>
+      <w:lvlJc w:val="left"/>
+      <w:pPr>
+        <w:ind w:left="720" w:hanging="360"/>
+      </w:pPr>
+    </w:lvl>
+    <w:lvl w:ilvl="1">
+      <w:start w:val="1"/>
+      <w:numFmt w:val="decimal"/>
+      <w:lvlText w:val="%2."/>
+      <w:lvlJc w:val="left"/>
+      <w:pPr>
+        <w:ind w:left="1440" w:hanging="360"/>
+      </w:pPr>
+    </w:lvl>
+    <w:lvl w:ilvl="2">
+      <w:start w:val="1"/>
+      <w:numFmt w:val="decimal"/>
+      <w:lvlText w:val="%3."/>
+      <w:lvlJc w:val="left"/>
+      <w:pPr>
+        <w:ind w:left="2160" w:hanging="360"/>
+      </w:pPr>
+    </w:lvl>
+    <w:lvl w:ilvl="3">
+      <w:start w:val="1"/>
+      <w:numFmt w:val="decimal"/>
+      <w:lvlText w:val="%4."/>
+      <w:lvlJc w:val="left"/>
+      <w:pPr>
+        <w:ind w:left="2880" w:hanging="360"/>
+      </w:pPr>
+    </w:lvl>
+    <w:lvl w:ilvl="4">
+      <w:start w:val="1"/>
+      <w:numFmt w:val="decimal"/>
+      <w:lvlText w:val="%5."/>
+      <w:lvlJc w:val="left"/>
+      <w:pPr>
+        <w:ind w:left="3600" w:hanging="360"/>
+      </w:pPr>
+    </w:lvl>
+    <w:lvl w:ilvl="5">
+      <w:start w:val="1"/>
+      <w:numFmt w:val="decimal"/>
+      <w:lvlText w:val="%6."/>
+      <w:lvlJc w:val="left"/>
+      <w:pPr>
+        <w:ind w:left="4320" w:hanging="360"/>
+      </w:pPr>
+    </w:lvl>
+    <w:lvl w:ilvl="6">
+      <w:start w:val="1"/>
+      <w:numFmt w:val="decimal"/>
+      <w:lvlText w:val="%7."/>
+      <w:lvlJc w:val="left"/>
+      <w:pPr>
+        <w:ind w:left="5040" w:hanging="360"/>
+      </w:pPr>
+    </w:lvl>
+    <w:lvl w:ilvl="7">
+      <w:start w:val="1"/>
+      <w:numFmt w:val="decimal"/>
+      <w:lvlText w:val="%8."/>
+      <w:lvlJc w:val="left"/>
+      <w:pPr>
+        <w:ind w:left="5760" w:hanging="360"/>
+      </w:pPr>
+    </w:lvl>
+    <w:lvl w:ilvl="8">
+      <w:start w:val="1"/>
+      <w:numFmt w:val="decimal"/>
+      <w:lvlText w:val="%9."/>
+      <w:lvlJc w:val="left"/>
+      <w:pPr>
+        <w:ind w:left="6480" w:hanging="360"/>
+      </w:pPr>
+    </w:lvl>
+  </w:abstractNum>
   <w:abstractNum w:abstractNumId="991">
     <w:nsid w:val="0000A991"/>
     <w:multiLevelType w:val="multilevel"/>
@@ -2731,98 +2324,10 @@
       </w:rPr>
     </w:lvl>
   </w:abstractNum>
-  <w:abstractNum w:abstractNumId="99411">
-    <w:nsid w:val="00A99411"/>
-    <w:multiLevelType w:val="multilevel"/>
-    <w:lvl w:ilvl="0">
-      <w:start w:val="1"/>
-      <w:numFmt w:val="decimal"/>
-      <w:lvlText w:val="%1."/>
-      <w:lvlJc w:val="left"/>
-      <w:pPr>
-        <w:ind w:left="720" w:hanging="360"/>
-      </w:pPr>
-    </w:lvl>
-    <w:lvl w:ilvl="1">
-      <w:start w:val="1"/>
-      <w:numFmt w:val="decimal"/>
-      <w:lvlText w:val="%2."/>
-      <w:lvlJc w:val="left"/>
-      <w:pPr>
-        <w:ind w:left="1440" w:hanging="360"/>
-      </w:pPr>
-    </w:lvl>
-    <w:lvl w:ilvl="2">
-      <w:start w:val="1"/>
-      <w:numFmt w:val="decimal"/>
-      <w:lvlText w:val="%3."/>
-      <w:lvlJc w:val="left"/>
-      <w:pPr>
-        <w:ind w:left="2160" w:hanging="360"/>
-      </w:pPr>
-    </w:lvl>
-    <w:lvl w:ilvl="3">
-      <w:start w:val="1"/>
-      <w:numFmt w:val="decimal"/>
-      <w:lvlText w:val="%4."/>
-      <w:lvlJc w:val="left"/>
-      <w:pPr>
-        <w:ind w:left="2880" w:hanging="360"/>
-      </w:pPr>
-    </w:lvl>
-    <w:lvl w:ilvl="4">
-      <w:start w:val="1"/>
-      <w:numFmt w:val="decimal"/>
-      <w:lvlText w:val="%5."/>
-      <w:lvlJc w:val="left"/>
-      <w:pPr>
-        <w:ind w:left="3600" w:hanging="360"/>
-      </w:pPr>
-    </w:lvl>
-    <w:lvl w:ilvl="5">
-      <w:start w:val="1"/>
-      <w:numFmt w:val="decimal"/>
-      <w:lvlText w:val="%6."/>
-      <w:lvlJc w:val="left"/>
-      <w:pPr>
-        <w:ind w:left="4320" w:hanging="360"/>
-      </w:pPr>
-    </w:lvl>
-    <w:lvl w:ilvl="6">
-      <w:start w:val="1"/>
-      <w:numFmt w:val="decimal"/>
-      <w:lvlText w:val="%7."/>
-      <w:lvlJc w:val="left"/>
-      <w:pPr>
-        <w:ind w:left="5040" w:hanging="360"/>
-      </w:pPr>
-    </w:lvl>
-    <w:lvl w:ilvl="7">
-      <w:start w:val="1"/>
-      <w:numFmt w:val="decimal"/>
-      <w:lvlText w:val="%8."/>
-      <w:lvlJc w:val="left"/>
-      <w:pPr>
-        <w:ind w:left="5760" w:hanging="360"/>
-      </w:pPr>
-    </w:lvl>
-    <w:lvl w:ilvl="8">
-      <w:start w:val="1"/>
-      <w:numFmt w:val="decimal"/>
-      <w:lvlText w:val="%9."/>
-      <w:lvlJc w:val="left"/>
-      <w:pPr>
-        <w:ind w:left="6480" w:hanging="360"/>
-      </w:pPr>
-    </w:lvl>
-  </w:abstractNum>
   <w:num w:numId="1000">
     <w:abstractNumId w:val="990"/>
   </w:num>
   <w:num w:numId="1001">
-    <w:abstractNumId w:val="991"/>
-  </w:num>
-  <w:num w:numId="1002">
     <w:abstractNumId w:val="99411"/>
     <w:lvlOverride w:ilvl="0">
       <w:startOverride w:val="1"/>
@@ -2852,37 +2357,7 @@
       <w:startOverride w:val="1"/>
     </w:lvlOverride>
   </w:num>
-  <w:num w:numId="1003">
-    <w:abstractNumId w:val="99411"/>
-    <w:lvlOverride w:ilvl="0">
-      <w:startOverride w:val="1"/>
-    </w:lvlOverride>
-    <w:lvlOverride w:ilvl="1">
-      <w:startOverride w:val="1"/>
-    </w:lvlOverride>
-    <w:lvlOverride w:ilvl="2">
-      <w:startOverride w:val="1"/>
-    </w:lvlOverride>
-    <w:lvlOverride w:ilvl="3">
-      <w:startOverride w:val="1"/>
-    </w:lvlOverride>
-    <w:lvlOverride w:ilvl="4">
-      <w:startOverride w:val="1"/>
-    </w:lvlOverride>
-    <w:lvlOverride w:ilvl="5">
-      <w:startOverride w:val="1"/>
-    </w:lvlOverride>
-    <w:lvlOverride w:ilvl="6">
-      <w:startOverride w:val="1"/>
-    </w:lvlOverride>
-    <w:lvlOverride w:ilvl="7">
-      <w:startOverride w:val="1"/>
-    </w:lvlOverride>
-    <w:lvlOverride w:ilvl="8">
-      <w:startOverride w:val="1"/>
-    </w:lvlOverride>
-  </w:num>
-  <w:num w:numId="1004">
+  <w:num w:numId="1002">
     <w:abstractNumId w:val="991"/>
   </w:num>
 </w:numbering>

</xml_diff>

<commit_message>
Public repo cleanup: remove the September reference kit; proposal carries the sponsor-facing part only; neutral wording
Co-Authored-By: Claude Fable 5.1 <noreply@anthropic.com>
</commit_message>
<xml_diff>
--- a/docs/01-sponsorship-proposal.docx
+++ b/docs/01-sponsorship-proposal.docx
@@ -2,7 +2,7 @@
 <file path=word/document.xml><?xml version="1.0" encoding="utf-8"?>
 <w:document xmlns:w="http://schemas.openxmlformats.org/wordprocessingml/2006/main" xmlns:m="http://schemas.openxmlformats.org/officeDocument/2006/math" xmlns:r="http://schemas.openxmlformats.org/officeDocument/2006/relationships" xmlns:o="urn:schemas-microsoft-com:office:office" xmlns:v="urn:schemas-microsoft-com:vml" xmlns:w10="urn:schemas-microsoft-com:office:word" xmlns:a="http://schemas.openxmlformats.org/drawingml/2006/main" xmlns:pic="http://schemas.openxmlformats.org/drawingml/2006/picture" xmlns:wp="http://schemas.openxmlformats.org/drawingml/2006/wordprocessingDrawing">
   <w:body>
-    <w:bookmarkStart w:id="10" w:name="touch-grass--sponsorship-proposal"/>
+    <w:bookmarkStart w:id="17" w:name="touch-grass--sponsorship-proposal"/>
     <w:p>
       <w:pPr>
         <w:pStyle w:val="Heading1"/>
@@ -25,7 +25,7 @@
         <w:pStyle w:val="FirstParagraph"/>
       </w:pPr>
       <w:r>
-        <w:t xml:space="preserve">Part A is for companies. Part B is for the organizing team only; cut it before the document leaves the team. Square brackets are facts still to fill in.</w:t>
+        <w:t xml:space="preserve">Square brackets are facts still to fill in.</w:t>
       </w:r>
     </w:p>
     <w:p>
@@ -36,17 +36,7 @@
       </w:r>
     </w:p>
     <w:bookmarkEnd w:id="9"/>
-    <w:bookmarkEnd w:id="10"/>
-    <w:bookmarkStart w:id="18" w:name="part-a--for-sponsors"/>
-    <w:p>
-      <w:pPr>
-        <w:pStyle w:val="Heading1"/>
-      </w:pPr>
-      <w:r>
-        <w:t xml:space="preserve">Part A · For sponsors</w:t>
-      </w:r>
-    </w:p>
-    <w:bookmarkStart w:id="11" w:name="touch-grass-in-one-page"/>
+    <w:bookmarkStart w:id="10" w:name="touch-grass-in-one-page"/>
     <w:p>
       <w:pPr>
         <w:pStyle w:val="Heading2"/>
@@ -206,8 +196,8 @@
         </w:pict>
       </w:r>
     </w:p>
-    <w:bookmarkEnd w:id="11"/>
-    <w:bookmarkStart w:id="12" w:name="why-this-hackathon"/>
+    <w:bookmarkEnd w:id="10"/>
+    <w:bookmarkStart w:id="11" w:name="why-this-hackathon"/>
     <w:p>
       <w:pPr>
         <w:pStyle w:val="Heading2"/>
@@ -295,8 +285,8 @@
         </w:pict>
       </w:r>
     </w:p>
-    <w:bookmarkEnd w:id="12"/>
-    <w:bookmarkStart w:id="13" w:name="the-event"/>
+    <w:bookmarkEnd w:id="11"/>
+    <w:bookmarkStart w:id="12" w:name="the-event"/>
     <w:p>
       <w:pPr>
         <w:pStyle w:val="Heading2"/>
@@ -554,8 +544,8 @@
         </w:pict>
       </w:r>
     </w:p>
-    <w:bookmarkEnd w:id="13"/>
-    <w:bookmarkStart w:id="14" w:name="sponsorship-tiers"/>
+    <w:bookmarkEnd w:id="12"/>
+    <w:bookmarkStart w:id="13" w:name="sponsorship-tiers"/>
     <w:p>
       <w:pPr>
         <w:pStyle w:val="Heading2"/>
@@ -991,8 +981,8 @@
         </w:pict>
       </w:r>
     </w:p>
-    <w:bookmarkEnd w:id="14"/>
-    <w:bookmarkStart w:id="15" w:name="where-the-money-goes"/>
+    <w:bookmarkEnd w:id="13"/>
+    <w:bookmarkStart w:id="14" w:name="where-the-money-goes"/>
     <w:p>
       <w:pPr>
         <w:pStyle w:val="Heading2"/>
@@ -1281,8 +1271,8 @@
         </w:pict>
       </w:r>
     </w:p>
-    <w:bookmarkEnd w:id="15"/>
-    <w:bookmarkStart w:id="16" w:name="how-to-say-yes"/>
+    <w:bookmarkEnd w:id="14"/>
+    <w:bookmarkStart w:id="15" w:name="how-to-say-yes"/>
     <w:p>
       <w:pPr>
         <w:pStyle w:val="Heading2"/>
@@ -1377,8 +1367,8 @@
         </w:pict>
       </w:r>
     </w:p>
-    <w:bookmarkEnd w:id="16"/>
-    <w:bookmarkStart w:id="17" w:name="монгол-хураангуй"/>
+    <w:bookmarkEnd w:id="15"/>
+    <w:bookmarkStart w:id="16" w:name="монгол-хураангуй"/>
     <w:p>
       <w:pPr>
         <w:pStyle w:val="Heading2"/>
@@ -1496,536 +1486,8 @@
         </w:pict>
       </w:r>
     </w:p>
+    <w:bookmarkEnd w:id="16"/>
     <w:bookmarkEnd w:id="17"/>
-    <w:bookmarkEnd w:id="18"/>
-    <w:bookmarkStart w:id="24" w:name="part-b--for-the-organizing-team-only"/>
-    <w:p>
-      <w:pPr>
-        <w:pStyle w:val="Heading1"/>
-      </w:pPr>
-      <w:r>
-        <w:t xml:space="preserve">Part B · For the organizing team only</w:t>
-      </w:r>
-    </w:p>
-    <w:bookmarkStart w:id="19" w:name="the-90-second-pitch"/>
-    <w:p>
-      <w:pPr>
-        <w:pStyle w:val="Heading2"/>
-      </w:pPr>
-      <w:r>
-        <w:t xml:space="preserve">The 90-second pitch</w:t>
-      </w:r>
-    </w:p>
-    <w:p>
-      <w:pPr>
-        <w:pStyle w:val="FirstParagraph"/>
-      </w:pPr>
-      <w:r>
-        <w:t xml:space="preserve">"We are running Touch Grass, Mongolia's first student-led health and environment hackathon: 220 students, 24 hours, November 7 to 8. Teams build working prototypes for six specific problems: winter air and children's lungs, carbon monoxide in heated homes, contaminated wells and soil, waste, dzud and cold-wave health risks, and connecting environmental data to hospitals. Hackathon Mongolia runs the program; Uram Enerel, a registered youth health NGO with 15 school chapters, hosts it legally and is recognized by [government body]. Engineers and doctors judge. We are asking [company] to be the [tier] sponsor at [amount]. You get your name on a track, a judge seat, a workshop with 220 students, the winning prototypes first, and a report with numbers within a week. Commitments close October 25."</w:t>
-      </w:r>
-    </w:p>
-    <w:bookmarkEnd w:id="19"/>
-    <w:bookmarkStart w:id="20" w:name="questions-you-will-get"/>
-    <w:p>
-      <w:pPr>
-        <w:pStyle w:val="Heading2"/>
-      </w:pPr>
-      <w:r>
-        <w:t xml:space="preserve">Questions you will get</w:t>
-      </w:r>
-    </w:p>
-    <w:p>
-      <w:pPr>
-        <w:pStyle w:val="Compact"/>
-        <w:numPr>
-          <w:ilvl w:val="0"/>
-          <w:numId w:val="1002"/>
-        </w:numPr>
-      </w:pPr>
-      <w:r>
-        <w:rPr>
-          <w:i/>
-          <w:iCs/>
-        </w:rPr>
-        <w:t xml:space="preserve">Is this legal and deductible for us?</w:t>
-      </w:r>
-      <w:r>
-        <w:t xml:space="preserve"> </w:t>
-      </w:r>
-      <w:r>
-        <w:t xml:space="preserve">You pay Uram Enerel, a registered NGO, under a sponsorship contract and receive an e-barimt invoice for advertising services. Donations are not deductible for companies; advertising is.</w:t>
-      </w:r>
-    </w:p>
-    <w:p>
-      <w:pPr>
-        <w:pStyle w:val="Compact"/>
-        <w:numPr>
-          <w:ilvl w:val="0"/>
-          <w:numId w:val="1002"/>
-        </w:numPr>
-      </w:pPr>
-      <w:r>
-        <w:rPr>
-          <w:i/>
-          <w:iCs/>
-        </w:rPr>
-        <w:t xml:space="preserve">What exactly do we get?</w:t>
-      </w:r>
-      <w:r>
-        <w:t xml:space="preserve"> </w:t>
-      </w:r>
-      <w:r>
-        <w:t xml:space="preserve">The tier table. Hand them the page.</w:t>
-      </w:r>
-    </w:p>
-    <w:p>
-      <w:pPr>
-        <w:pStyle w:val="Compact"/>
-        <w:numPr>
-          <w:ilvl w:val="0"/>
-          <w:numId w:val="1002"/>
-        </w:numPr>
-      </w:pPr>
-      <w:r>
-        <w:rPr>
-          <w:i/>
-          <w:iCs/>
-        </w:rPr>
-        <w:t xml:space="preserve">Can we set our track's problem?</w:t>
-      </w:r>
-      <w:r>
-        <w:t xml:space="preserve"> </w:t>
-      </w:r>
-      <w:r>
-        <w:t xml:space="preserve">Yes, co-written with us by October 28, inside the theme.</w:t>
-      </w:r>
-    </w:p>
-    <w:p>
-      <w:pPr>
-        <w:pStyle w:val="Compact"/>
-        <w:numPr>
-          <w:ilvl w:val="0"/>
-          <w:numId w:val="1002"/>
-        </w:numPr>
-      </w:pPr>
-      <w:r>
-        <w:rPr>
-          <w:i/>
-          <w:iCs/>
-        </w:rPr>
-        <w:t xml:space="preserve">Can we recruit?</w:t>
-      </w:r>
-      <w:r>
-        <w:t xml:space="preserve"> </w:t>
-      </w:r>
-      <w:r>
-        <w:t xml:space="preserve">Workshop, conversations, and opt-in CVs. No mandatory data collection.</w:t>
-      </w:r>
-    </w:p>
-    <w:p>
-      <w:pPr>
-        <w:pStyle w:val="Compact"/>
-        <w:numPr>
-          <w:ilvl w:val="0"/>
-          <w:numId w:val="1002"/>
-        </w:numPr>
-      </w:pPr>
-      <w:r>
-        <w:rPr>
-          <w:i/>
-          <w:iCs/>
-        </w:rPr>
-        <w:t xml:space="preserve">Can we judge our own track?</w:t>
-      </w:r>
-      <w:r>
-        <w:t xml:space="preserve"> </w:t>
-      </w:r>
-      <w:r>
-        <w:t xml:space="preserve">One of three seats on the panel. The rubric decides.</w:t>
-      </w:r>
-    </w:p>
-    <w:p>
-      <w:pPr>
-        <w:pStyle w:val="Compact"/>
-        <w:numPr>
-          <w:ilvl w:val="0"/>
-          <w:numId w:val="1002"/>
-        </w:numPr>
-      </w:pPr>
-      <w:r>
-        <w:rPr>
-          <w:i/>
-          <w:iCs/>
-        </w:rPr>
-        <w:t xml:space="preserve">How big is the prize?</w:t>
-      </w:r>
-      <w:r>
-        <w:t xml:space="preserve"> </w:t>
-      </w:r>
-      <w:r>
-        <w:t xml:space="preserve">"At least 5,000,000 MNT for the top three, split 50 / 30 / 20, and it grows with every prize-pool sponsor." Never name a higher figure before October 25.</w:t>
-      </w:r>
-    </w:p>
-    <w:p>
-      <w:pPr>
-        <w:pStyle w:val="Compact"/>
-        <w:numPr>
-          <w:ilvl w:val="0"/>
-          <w:numId w:val="1002"/>
-        </w:numPr>
-      </w:pPr>
-      <w:r>
-        <w:rPr>
-          <w:i/>
-          <w:iCs/>
-        </w:rPr>
-        <w:t xml:space="preserve">What if too few register?</w:t>
-      </w:r>
-      <w:r>
-        <w:t xml:space="preserve"> </w:t>
-      </w:r>
-      <w:r>
-        <w:t xml:space="preserve">Weekly numbers to sponsors; under 150 we scale the budget and refund or roll over the difference, in the contract.</w:t>
-      </w:r>
-    </w:p>
-    <w:p>
-      <w:pPr>
-        <w:pStyle w:val="Compact"/>
-        <w:numPr>
-          <w:ilvl w:val="0"/>
-          <w:numId w:val="1002"/>
-        </w:numPr>
-      </w:pPr>
-      <w:r>
-        <w:rPr>
-          <w:i/>
-          <w:iCs/>
-        </w:rPr>
-        <w:t xml:space="preserve">Why not an established event?</w:t>
-      </w:r>
-      <w:r>
-        <w:t xml:space="preserve"> </w:t>
-      </w:r>
-      <w:r>
-        <w:t xml:space="preserve">There is none. Nothing independent has passed 150 people since 2021.</w:t>
-      </w:r>
-    </w:p>
-    <w:p>
-      <w:pPr>
-        <w:pStyle w:val="Compact"/>
-        <w:numPr>
-          <w:ilvl w:val="0"/>
-          <w:numId w:val="1002"/>
-        </w:numPr>
-      </w:pPr>
-      <w:r>
-        <w:rPr>
-          <w:i/>
-          <w:iCs/>
-        </w:rPr>
-        <w:t xml:space="preserve">Can we pay in kind?</w:t>
-      </w:r>
-      <w:r>
-        <w:t xml:space="preserve"> </w:t>
-      </w:r>
-      <w:r>
-        <w:t xml:space="preserve">Yes, at the tier the market value matches.</w:t>
-      </w:r>
-    </w:p>
-    <w:bookmarkEnd w:id="20"/>
-    <w:bookmarkStart w:id="21" w:name="email-template"/>
-    <w:p>
-      <w:pPr>
-        <w:pStyle w:val="Heading2"/>
-      </w:pPr>
-      <w:r>
-        <w:t xml:space="preserve">Email template</w:t>
-      </w:r>
-    </w:p>
-    <w:p>
-      <w:pPr>
-        <w:pStyle w:val="FirstParagraph"/>
-      </w:pPr>
-      <w:r>
-        <w:t xml:space="preserve">Subject: Sponsor Touch Grass, Mongolia's first youth health × environment hackathon, Nov 7–8</w:t>
-      </w:r>
-    </w:p>
-    <w:p>
-      <w:pPr>
-        <w:pStyle w:val="BlockText"/>
-      </w:pPr>
-      <w:r>
-        <w:t xml:space="preserve">Dear [name],</w:t>
-      </w:r>
-    </w:p>
-    <w:p>
-      <w:pPr>
-        <w:pStyle w:val="BlockText"/>
-      </w:pPr>
-      <w:r>
-        <w:t xml:space="preserve">Uram Enerel NGO (Uram Care) and the Hackathon Mongolia student collective are running Touch Grass, a 24-hour hackathon on November 7–8, 2026 for 220+ students, on health problems with environmental causes: winter air pollution, carbon monoxide poisoning, contaminated water and soil, waste, and climate shocks. Teams build working prototypes in six tracks, judged by engineers and doctors. The event is recognized by [government body].</w:t>
-      </w:r>
-    </w:p>
-    <w:p>
-      <w:pPr>
-        <w:pStyle w:val="BlockText"/>
-      </w:pPr>
-      <w:r>
-        <w:t xml:space="preserve">We are asking [company] to be our [tier] sponsor at [amount] MNT, or to provide [the venue / meals / merchandise / prizes] in kind. In return: [two or three benefits]. Sponsorship is contracted and invoiced through Uram Enerel NGO as advertising services.</w:t>
-      </w:r>
-    </w:p>
-    <w:p>
-      <w:pPr>
-        <w:pStyle w:val="BlockText"/>
-      </w:pPr>
-      <w:r>
-        <w:t xml:space="preserve">The proposal is attached. Could we meet for 20 minutes this week? Commitments close October 25.</w:t>
-      </w:r>
-    </w:p>
-    <w:p>
-      <w:pPr>
-        <w:pStyle w:val="BlockText"/>
-      </w:pPr>
-      <w:r>
-        <w:t xml:space="preserve">[name, title, phone]</w:t>
-      </w:r>
-    </w:p>
-    <w:bookmarkEnd w:id="21"/>
-    <w:bookmarkStart w:id="22" w:name="what-sponsors-receive-and-when"/>
-    <w:p>
-      <w:pPr>
-        <w:pStyle w:val="Heading2"/>
-      </w:pPr>
-      <w:r>
-        <w:t xml:space="preserve">What sponsors receive, and when</w:t>
-      </w:r>
-    </w:p>
-    <w:tbl>
-      <w:tblPr>
-        <w:tblStyle w:val="Table"/>
-        <w:tblW w:type="auto" w:w="0"/>
-        <w:tblLook w:firstRow="1" w:lastRow="0" w:firstColumn="0" w:lastColumn="0" w:noHBand="0" w:noVBand="0" w:val="0020"/>
-      </w:tblPr>
-      <w:tblGrid>
-        <w:gridCol w:w="3960"/>
-        <w:gridCol w:w="3960"/>
-      </w:tblGrid>
-      <w:tr>
-        <w:trPr>
-          <w:tblHeader w:val="on"/>
-        </w:trPr>
-        <w:tc>
-          <w:tcPr/>
-          <w:p>
-            <w:pPr>
-              <w:pStyle w:val="Compact"/>
-            </w:pPr>
-            <w:r>
-              <w:t xml:space="preserve">When</w:t>
-            </w:r>
-          </w:p>
-        </w:tc>
-        <w:tc>
-          <w:tcPr/>
-          <w:p>
-            <w:pPr>
-              <w:pStyle w:val="Compact"/>
-            </w:pPr>
-            <w:r>
-              <w:t xml:space="preserve">Deliverable</w:t>
-            </w:r>
-          </w:p>
-        </w:tc>
-      </w:tr>
-      <w:tr>
-        <w:tc>
-          <w:tcPr/>
-          <w:p>
-            <w:pPr>
-              <w:pStyle w:val="Compact"/>
-            </w:pPr>
-            <w:r>
-              <w:t xml:space="preserve">On signing</w:t>
-            </w:r>
-          </w:p>
-        </w:tc>
-        <w:tc>
-          <w:tcPr/>
-          <w:p>
-            <w:pPr>
-              <w:pStyle w:val="Compact"/>
-            </w:pPr>
-            <w:r>
-              <w:t xml:space="preserve">logo on the website, registration page and announcements within 48 hours</w:t>
-            </w:r>
-          </w:p>
-        </w:tc>
-      </w:tr>
-      <w:tr>
-        <w:tc>
-          <w:tcPr/>
-          <w:p>
-            <w:pPr>
-              <w:pStyle w:val="Compact"/>
-            </w:pPr>
-            <w:r>
-              <w:t xml:space="preserve">Oct 25 to Nov 6</w:t>
-            </w:r>
-          </w:p>
-        </w:tc>
-        <w:tc>
-          <w:tcPr/>
-          <w:p>
-            <w:pPr>
-              <w:pStyle w:val="Compact"/>
-            </w:pPr>
-            <w:r>
-              <w:t xml:space="preserve">track problem statements agreed by Oct 28; judges and speakers briefed Nov 6</w:t>
-            </w:r>
-          </w:p>
-        </w:tc>
-      </w:tr>
-      <w:tr>
-        <w:tc>
-          <w:tcPr/>
-          <w:p>
-            <w:pPr>
-              <w:pStyle w:val="Compact"/>
-            </w:pPr>
-            <w:r>
-              <w:t xml:space="preserve">Nov 7</w:t>
-            </w:r>
-          </w:p>
-        </w:tc>
-        <w:tc>
-          <w:tcPr/>
-          <w:p>
-            <w:pPr>
-              <w:pStyle w:val="Compact"/>
-            </w:pPr>
-            <w:r>
-              <w:t xml:space="preserve">opening slots (title, track); workshops (track); stage thanks at meals; logo on signage, table cards and the countdown screen</w:t>
-            </w:r>
-          </w:p>
-        </w:tc>
-      </w:tr>
-      <w:tr>
-        <w:tc>
-          <w:tcPr/>
-          <w:p>
-            <w:pPr>
-              <w:pStyle w:val="Compact"/>
-            </w:pPr>
-            <w:r>
-              <w:t xml:space="preserve">Nov 8</w:t>
-            </w:r>
-          </w:p>
-        </w:tc>
-        <w:tc>
-          <w:tcPr/>
-          <w:p>
-            <w:pPr>
-              <w:pStyle w:val="Compact"/>
-            </w:pPr>
-            <w:r>
-              <w:t xml:space="preserve">judge seats; prize presentations; group photo with winners</w:t>
-            </w:r>
-          </w:p>
-        </w:tc>
-      </w:tr>
-      <w:tr>
-        <w:tc>
-          <w:tcPr/>
-          <w:p>
-            <w:pPr>
-              <w:pStyle w:val="Compact"/>
-            </w:pPr>
-            <w:r>
-              <w:t xml:space="preserve">Nov 9 to 10</w:t>
-            </w:r>
-          </w:p>
-        </w:tc>
-        <w:tc>
-          <w:tcPr/>
-          <w:p>
-            <w:pPr>
-              <w:pStyle w:val="Compact"/>
-            </w:pPr>
-            <w:r>
-              <w:t xml:space="preserve">results post and thank-you post with logos</w:t>
-            </w:r>
-          </w:p>
-        </w:tc>
-      </w:tr>
-      <w:tr>
-        <w:tc>
-          <w:tcPr/>
-          <w:p>
-            <w:pPr>
-              <w:pStyle w:val="Compact"/>
-            </w:pPr>
-            <w:r>
-              <w:t xml:space="preserve">By Nov 13</w:t>
-            </w:r>
-          </w:p>
-        </w:tc>
-        <w:tc>
-          <w:tcPr/>
-          <w:p>
-            <w:pPr>
-              <w:pStyle w:val="Compact"/>
-            </w:pPr>
-            <w:r>
-              <w:t xml:space="preserve">written report: participants, institutions, teams, projects with links, photos, media, survey, itemized spending</w:t>
-            </w:r>
-          </w:p>
-        </w:tc>
-      </w:tr>
-      <w:tr>
-        <w:tc>
-          <w:tcPr/>
-          <w:p>
-            <w:pPr>
-              <w:pStyle w:val="Compact"/>
-            </w:pPr>
-            <w:r>
-              <w:t xml:space="preserve">After</w:t>
-            </w:r>
-          </w:p>
-        </w:tc>
-        <w:tc>
-          <w:tcPr/>
-          <w:p>
-            <w:pPr>
-              <w:pStyle w:val="Compact"/>
-            </w:pPr>
-            <w:r>
-              <w:t xml:space="preserve">introductions to winning teams on request; opt-in CVs (title and track)</w:t>
-            </w:r>
-          </w:p>
-        </w:tc>
-      </w:tr>
-    </w:tbl>
-    <w:bookmarkEnd w:id="22"/>
-    <w:bookmarkStart w:id="23" w:name="target-list-by-tier-fit"/>
-    <w:p>
-      <w:pPr>
-        <w:pStyle w:val="Heading2"/>
-      </w:pPr>
-      <w:r>
-        <w:t xml:space="preserve">Target list, by tier fit</w:t>
-      </w:r>
-    </w:p>
-    <w:p>
-      <w:pPr>
-        <w:pStyle w:val="FirstParagraph"/>
-      </w:pPr>
-      <w:r>
-        <w:t xml:space="preserve">Title and venue: banks, telecoms, a mining or energy company's CSR, a university or a sponsor's headquarters for the hall. Tracks: a hospital or clinic group for clean air, an insurer for safe heat, a water or beverage company for ground and water, a retailer or packaging company for waste, an insurer or telecom with rural reach for climate shocks, a bank or fintech data team for health data. Food: a food or beverage company. Merchandise: an apparel or print company. Keep 30 names in the finance team's sheet with tier, contact, date asked, status.</w:t>
-      </w:r>
-    </w:p>
-    <w:bookmarkEnd w:id="23"/>
-    <w:bookmarkEnd w:id="24"/>
     <w:sectPr>
       <w:footnotePr>
         <w:numRestart w:val="eachSect"/>
@@ -2219,109 +1681,6 @@
       <w:pPr>
         <w:ind w:left="6480" w:hanging="360"/>
       </w:pPr>
-    </w:lvl>
-  </w:abstractNum>
-  <w:abstractNum w:abstractNumId="991">
-    <w:nsid w:val="0000A991"/>
-    <w:multiLevelType w:val="multilevel"/>
-    <w:lvl w:ilvl="0">
-      <w:numFmt w:val="bullet"/>
-      <w:lvlText w:val=""/>
-      <w:lvlJc w:val="left"/>
-      <w:pPr>
-        <w:ind w:left="720" w:hanging="360"/>
-      </w:pPr>
-      <w:rPr>
-        <w:rFonts w:ascii="Symbol" w:hAnsi="Symbol" w:cs="Symbol" w:hint="default"/>
-      </w:rPr>
-    </w:lvl>
-    <w:lvl w:ilvl="1">
-      <w:numFmt w:val="bullet"/>
-      <w:lvlText w:val="o"/>
-      <w:lvlJc w:val="left"/>
-      <w:pPr>
-        <w:ind w:left="1440" w:hanging="360"/>
-      </w:pPr>
-      <w:rPr>
-        <w:rFonts w:ascii="Courier New" w:hAnsi="Courier New" w:cs="Courier New" w:hint="default"/>
-      </w:rPr>
-    </w:lvl>
-    <w:lvl w:ilvl="2">
-      <w:numFmt w:val="bullet"/>
-      <w:lvlText w:val=""/>
-      <w:lvlJc w:val="left"/>
-      <w:pPr>
-        <w:ind w:left="2160" w:hanging="360"/>
-      </w:pPr>
-      <w:rPr>
-        <w:rFonts w:ascii="Wingdings" w:hAnsi="Wingdings" w:cs="Wingdings" w:hint="default"/>
-      </w:rPr>
-    </w:lvl>
-    <w:lvl w:ilvl="3">
-      <w:numFmt w:val="bullet"/>
-      <w:lvlText w:val=""/>
-      <w:lvlJc w:val="left"/>
-      <w:pPr>
-        <w:ind w:left="2880" w:hanging="360"/>
-      </w:pPr>
-      <w:rPr>
-        <w:rFonts w:ascii="Symbol" w:hAnsi="Symbol" w:cs="Symbol" w:hint="default"/>
-      </w:rPr>
-    </w:lvl>
-    <w:lvl w:ilvl="4">
-      <w:numFmt w:val="bullet"/>
-      <w:lvlText w:val="o"/>
-      <w:lvlJc w:val="left"/>
-      <w:pPr>
-        <w:ind w:left="3600" w:hanging="360"/>
-      </w:pPr>
-      <w:rPr>
-        <w:rFonts w:ascii="Courier New" w:hAnsi="Courier New" w:cs="Courier New" w:hint="default"/>
-      </w:rPr>
-    </w:lvl>
-    <w:lvl w:ilvl="5">
-      <w:numFmt w:val="bullet"/>
-      <w:lvlText w:val=""/>
-      <w:lvlJc w:val="left"/>
-      <w:pPr>
-        <w:ind w:left="4320" w:hanging="360"/>
-      </w:pPr>
-      <w:rPr>
-        <w:rFonts w:ascii="Wingdings" w:hAnsi="Wingdings" w:cs="Wingdings" w:hint="default"/>
-      </w:rPr>
-    </w:lvl>
-    <w:lvl w:ilvl="6">
-      <w:numFmt w:val="bullet"/>
-      <w:lvlText w:val=""/>
-      <w:lvlJc w:val="left"/>
-      <w:pPr>
-        <w:ind w:left="5040" w:hanging="360"/>
-      </w:pPr>
-      <w:rPr>
-        <w:rFonts w:ascii="Symbol" w:hAnsi="Symbol" w:cs="Symbol" w:hint="default"/>
-      </w:rPr>
-    </w:lvl>
-    <w:lvl w:ilvl="7">
-      <w:numFmt w:val="bullet"/>
-      <w:lvlText w:val="o"/>
-      <w:lvlJc w:val="left"/>
-      <w:pPr>
-        <w:ind w:left="5760" w:hanging="360"/>
-      </w:pPr>
-      <w:rPr>
-        <w:rFonts w:ascii="Courier New" w:hAnsi="Courier New" w:cs="Courier New" w:hint="default"/>
-      </w:rPr>
-    </w:lvl>
-    <w:lvl w:ilvl="8">
-      <w:numFmt w:val="bullet"/>
-      <w:lvlText w:val=""/>
-      <w:lvlJc w:val="left"/>
-      <w:pPr>
-        <w:ind w:left="6480" w:hanging="360"/>
-      </w:pPr>
-      <w:rPr>
-        <w:rFonts w:ascii="Wingdings" w:hAnsi="Wingdings" w:cs="Wingdings" w:hint="default"/>
-      </w:rPr>
     </w:lvl>
   </w:abstractNum>
   <w:num w:numId="1000">
@@ -2356,9 +1715,6 @@
     <w:lvlOverride w:ilvl="8">
       <w:startOverride w:val="1"/>
     </w:lvlOverride>
-  </w:num>
-  <w:num w:numId="1002">
-    <w:abstractNumId w:val="991"/>
   </w:num>
 </w:numbering>
 </file>

</xml_diff>

<commit_message>
Age range 14 to 20
</commit_message>
<xml_diff>
--- a/docs/01-sponsorship-proposal.docx
+++ b/docs/01-sponsorship-proposal.docx
@@ -158,7 +158,7 @@
         <w:t xml:space="preserve"> </w:t>
       </w:r>
       <w:r>
-        <w:t xml:space="preserve">High school and university students aged 16 to 24, free of charge, from 25+ institutions. Mentors from industry and universities; a judging panel of engineers, doctors, environmental scientists and sponsor representatives.</w:t>
+        <w:t xml:space="preserve">Secondary school and university students aged 14 to 20, free of charge, from 25+ institutions. Mentors from industry and universities; a judging panel of engineers, doctors, environmental scientists and sponsor representatives.</w:t>
       </w:r>
     </w:p>
     <w:p>
@@ -393,7 +393,7 @@
               <w:pStyle w:val="Compact"/>
             </w:pPr>
             <w:r>
-              <w:t xml:space="preserve">220+ students aged 16 to 24; free entry; parental consent for under-18s</w:t>
+              <w:t xml:space="preserve">220+ students aged 14 to 20; free entry; parental consent for under-18s</w:t>
             </w:r>
           </w:p>
         </w:tc>
@@ -1404,7 +1404,7 @@
         <w:t xml:space="preserve"> </w:t>
       </w:r>
       <w:r>
-        <w:t xml:space="preserve">220 гаруй ахлах ангийн сурагч, оюутан 55 орчим багт хуваагдан 24 цагийн дотор хүрээлэн буй орчноос үүдэлтэй эрүүл мэндийн асуудлуудад ажиллах прототип бүтээнэ. Зургаан чиглэл: цэвэр агаар ба уушгины эрүүл мэнд; угаарын хийн хордлого; хөрс, усны бохирдол; хог хаягдал; зуд, хүйтэн, халууны эрсдэл; эрүүл мэндийн өгөгдөл ба эрт сэрэмжлүүлэг. Инженер, эмч, байгаль орчны мэргэжилтнүүд баг бүрийг дүгнэнэ.</w:t>
+        <w:t xml:space="preserve">14–20 насны 220 гаруй дунд, ахлах ангийн сурагч, оюутан 55 орчим багт хуваагдан 24 цагийн дотор хүрээлэн буй орчноос үүдэлтэй эрүүл мэндийн асуудлуудад ажиллах прототип бүтээнэ. Зургаан чиглэл: цэвэр агаар ба уушгины эрүүл мэнд; угаарын хийн хордлого; хөрс, усны бохирдол; хог хаягдал; зуд, хүйтэн, халууны эрсдэл; эрүүл мэндийн өгөгдөл ба эрт сэрэмжлүүлэг. Инженер, эмч, байгаль орчны мэргэжилтнүүд баг бүрийг дүгнэнэ.</w:t>
       </w:r>
     </w:p>
     <w:p>

</xml_diff>

<commit_message>
Sponsorship proposal ready to send: organizers named, website, English, PDF
</commit_message>
<xml_diff>
--- a/docs/01-sponsorship-proposal.docx
+++ b/docs/01-sponsorship-proposal.docx
@@ -2,7 +2,7 @@
 <file path=word/document.xml><?xml version="1.0" encoding="utf-8"?>
 <w:document xmlns:w="http://schemas.openxmlformats.org/wordprocessingml/2006/main" xmlns:m="http://schemas.openxmlformats.org/officeDocument/2006/math" xmlns:r="http://schemas.openxmlformats.org/officeDocument/2006/relationships" xmlns:o="urn:schemas-microsoft-com:office:office" xmlns:v="urn:schemas-microsoft-com:vml" xmlns:w10="urn:schemas-microsoft-com:office:word" xmlns:a="http://schemas.openxmlformats.org/drawingml/2006/main" xmlns:pic="http://schemas.openxmlformats.org/drawingml/2006/picture" xmlns:wp="http://schemas.openxmlformats.org/drawingml/2006/wordprocessingDrawing">
   <w:body>
-    <w:bookmarkStart w:id="17" w:name="touch-grass--sponsorship-proposal"/>
+    <w:bookmarkStart w:id="18" w:name="touch-grass--sponsorship-proposal"/>
     <w:p>
       <w:pPr>
         <w:pStyle w:val="Heading1"/>
@@ -18,31 +18,6 @@
       </w:pPr>
       <w:r>
         <w:t xml:space="preserve">A 24-hour youth hackathon on health and the environment · Mongolia · November 7–8, 2026</w:t>
-      </w:r>
-    </w:p>
-    <w:p>
-      <w:pPr>
-        <w:pStyle w:val="FirstParagraph"/>
-      </w:pPr>
-      <w:r>
-        <w:t xml:space="preserve">Square brackets are facts still to fill in.</w:t>
-      </w:r>
-    </w:p>
-    <w:p>
-      <w:r>
-        <w:pict>
-          <v:rect style="width:0;height:1.5pt" o:hralign="center" o:hrstd="t" o:hr="t"/>
-        </w:pict>
-      </w:r>
-    </w:p>
-    <w:bookmarkEnd w:id="9"/>
-    <w:bookmarkStart w:id="10" w:name="touch-grass-in-one-page"/>
-    <w:p>
-      <w:pPr>
-        <w:pStyle w:val="Heading2"/>
-      </w:pPr>
-      <w:r>
-        <w:t xml:space="preserve">Touch Grass in one page</w:t>
       </w:r>
     </w:p>
     <w:p>
@@ -54,18 +29,29 @@
           <w:b/>
           <w:bCs/>
         </w:rPr>
-        <w:t xml:space="preserve">The name.</w:t>
-      </w:r>
-      <w:r>
-        <w:t xml:space="preserve"> </w:t>
-      </w:r>
-      <w:r>
-        <w:t xml:space="preserve">Touch Grass is the internet's way of saying "go outside." In Mongolia, going outside is a health decision: the air in winter, the water in the well, the ground children play on, the cold that kills livestock and the people who depend on them. The name says the thesis in two words.</w:t>
-      </w:r>
-    </w:p>
-    <w:p>
-      <w:pPr>
-        <w:pStyle w:val="BodyText"/>
+        <w:t xml:space="preserve">hack-touchgrass.com</w:t>
+      </w:r>
+    </w:p>
+    <w:p>
+      <w:r>
+        <w:pict>
+          <v:rect style="width:0;height:1.5pt" o:hralign="center" o:hrstd="t" o:hr="t"/>
+        </w:pict>
+      </w:r>
+    </w:p>
+    <w:bookmarkEnd w:id="9"/>
+    <w:bookmarkStart w:id="10" w:name="touch-grass-in-one-page"/>
+    <w:p>
+      <w:pPr>
+        <w:pStyle w:val="Heading2"/>
+      </w:pPr>
+      <w:r>
+        <w:t xml:space="preserve">Touch Grass in one page</w:t>
+      </w:r>
+    </w:p>
+    <w:p>
+      <w:pPr>
+        <w:pStyle w:val="FirstParagraph"/>
       </w:pPr>
       <w:r>
         <w:rPr>
@@ -78,7 +64,7 @@
         <w:t xml:space="preserve"> </w:t>
       </w:r>
       <w:r>
-        <w:t xml:space="preserve">A 24-hour hackathon where 220+ young people in about 55 teams build working prototypes for health problems with an environmental cause. Six tracks, 24 specific problem statements, any technology. Teams start Saturday 13:00 and submit Sunday 13:00; professional judges score every team; the best in each track presents on stage.</w:t>
+        <w:t xml:space="preserve">A 24-hour hackathon where 220+ young people in about 55 teams build working prototypes for health problems with an environmental cause. Six tracks, 24 specific problem statements, any technology. The event runs in English. Teams start Saturday 13:00 and submit Sunday 13:00; professional judges score every team; the best in each track presents on stage.</w:t>
       </w:r>
     </w:p>
     <w:p>
@@ -96,7 +82,7 @@
         <w:t xml:space="preserve"> </w:t>
       </w:r>
       <w:r>
-        <w:t xml:space="preserve">Saturday November 7 to Sunday November 8, 2026, at [venue]. Doors 11:00 Saturday, awards 16:20 Sunday.</w:t>
+        <w:t xml:space="preserve">Saturday November 7 to Sunday November 8, 2026, in Ulaanbaatar; the venue is confirmed by October 14. Doors 11:00 Saturday, awards 16:20 Sunday.</w:t>
       </w:r>
     </w:p>
     <w:p>
@@ -114,7 +100,36 @@
         <w:t xml:space="preserve"> </w:t>
       </w:r>
       <w:r>
-        <w:t xml:space="preserve">Two organizations.</w:t>
+        <w:t xml:space="preserve">Touch Grass was founded and is organized by</w:t>
+      </w:r>
+      <w:r>
+        <w:t xml:space="preserve"> </w:t>
+      </w:r>
+      <w:r>
+        <w:rPr>
+          <w:b/>
+          <w:bCs/>
+        </w:rPr>
+        <w:t xml:space="preserve">Anar Tuvshinbayar</w:t>
+      </w:r>
+      <w:r>
+        <w:t xml:space="preserve"> </w:t>
+      </w:r>
+      <w:r>
+        <w:t xml:space="preserve">and</w:t>
+      </w:r>
+      <w:r>
+        <w:t xml:space="preserve"> </w:t>
+      </w:r>
+      <w:r>
+        <w:rPr>
+          <w:b/>
+          <w:bCs/>
+        </w:rPr>
+        <w:t xml:space="preserve">Goomaral Sandag-Ochir</w:t>
+      </w:r>
+      <w:r>
+        <w:t xml:space="preserve">.</w:t>
       </w:r>
       <w:r>
         <w:t xml:space="preserve"> </w:t>
@@ -127,7 +142,7 @@
         <w:t xml:space="preserve">Hackathon Mongolia</w:t>
       </w:r>
       <w:r>
-        <w:t xml:space="preserve">, a student-run organizing collective, designs and runs the program.</w:t>
+        <w:t xml:space="preserve">, their student organizing team, designs and runs the program.</w:t>
       </w:r>
       <w:r>
         <w:t xml:space="preserve"> </w:t>
@@ -140,7 +155,7 @@
         <w:t xml:space="preserve">Uram Enerel NGO</w:t>
       </w:r>
       <w:r>
-        <w:t xml:space="preserve">, known as Uram Care, a registered youth health NGO with 1,500+ volunteers and 15+ school chapters across Mongolia, is the legal host: contracts, funds, receipts, reporting. Recognized by [government body]. Responsible adult on site: [name, title].</w:t>
+        <w:t xml:space="preserve">, known as Uram Care, a registered youth health NGO with volunteers and school chapters across Mongolia, is the legal host: contracts, funds, receipts, reporting. A responsible adult from Uram Enerel NGO is on site for the full 24 hours.</w:t>
       </w:r>
     </w:p>
     <w:p>
@@ -345,7 +360,7 @@
               <w:pStyle w:val="Compact"/>
             </w:pPr>
             <w:r>
-              <w:t xml:space="preserve">24 hours in person, overnight at the venue with adult supervision; teams of 2 to 4</w:t>
+              <w:t xml:space="preserve">24 hours in person, overnight at the venue with adult supervision; teams of 2 to 4; in English</w:t>
             </w:r>
           </w:p>
         </w:tc>
@@ -534,7 +549,7 @@
         <w:t xml:space="preserve"> </w:t>
       </w:r>
       <w:r>
-        <w:t xml:space="preserve">Clean air and healthy lungs · Safe heat: carbon monoxide in heated homes · Ground and water: latrines, soil and wells · Waste and health · Climate shocks: dzud, cold waves and heat · Health data and early warning. The problem bank and judging rubric are in the companion document.</w:t>
+        <w:t xml:space="preserve">Clean air and healthy lungs · Safe heat: carbon monoxide in heated homes · Ground and water: latrines, soil and wells · Waste and health · Climate shocks: dzud, cold waves and heat · Health data and early warning. All 24 problems are listed at hack-touchgrass.com.</w:t>
       </w:r>
     </w:p>
     <w:p>
@@ -660,7 +675,7 @@
               <w:pStyle w:val="Compact"/>
             </w:pPr>
             <w:r>
-              <w:t xml:space="preserve">"Touch Grass presented by [You]"; logo first everywhere including all 220 t-shirts; 5-minute opening slot; judge on the final panel; you present first prize; first access to winning teams; opt-in participant CVs</w:t>
+              <w:t xml:space="preserve">"Touch Grass presented by Your Company"; logo first everywhere including all 220 t-shirts; 5-minute opening slot; judge on the final panel; you present first prize; first access to winning teams; opt-in participant CVs</w:t>
             </w:r>
           </w:p>
         </w:tc>
@@ -710,7 +725,7 @@
               <w:pStyle w:val="Compact"/>
             </w:pPr>
             <w:r>
-              <w:t xml:space="preserve">"Hosted at [You]"; logo on every table card and all signage; named in every announcement; opening remarks</w:t>
+              <w:t xml:space="preserve">"Hosted at Your Company"; logo on every table card and all signage; named in every announcement; opening remarks</w:t>
             </w:r>
           </w:p>
         </w:tc>
@@ -810,7 +825,7 @@
               <w:pStyle w:val="Compact"/>
             </w:pPr>
             <w:r>
-              <w:t xml:space="preserve">"Meals by [You]" at five meals; logo on site and stage; thanks at each meal</w:t>
+              <w:t xml:space="preserve">"Meals by Your Company" at five meals; logo on site and stage; thanks at each meal</w:t>
             </w:r>
           </w:p>
         </w:tc>
@@ -1272,7 +1287,7 @@
       </w:r>
     </w:p>
     <w:bookmarkEnd w:id="14"/>
-    <w:bookmarkStart w:id="15" w:name="how-to-say-yes"/>
+    <w:bookmarkStart w:id="16" w:name="how-to-say-yes"/>
     <w:p>
       <w:pPr>
         <w:pStyle w:val="Heading2"/>
@@ -1290,7 +1305,7 @@
         </w:numPr>
       </w:pPr>
       <w:r>
-        <w:t xml:space="preserve">Tell [co-organizer name] your tier by</w:t>
+        <w:t xml:space="preserve">Tell Goomaral Sandag-Ochir or Anar Tuvshinbayar your tier by</w:t>
       </w:r>
       <w:r>
         <w:t xml:space="preserve"> </w:t>
@@ -1357,7 +1372,24 @@
         <w:t xml:space="preserve"> </w:t>
       </w:r>
       <w:r>
-        <w:t xml:space="preserve">[Co-organizer, title, phone, email] · Anar Tuvshinbayar, Hackathon Mongolia, [phone, email] · Uram Enerel NGO, [address, registration number, bank].</w:t>
+        <w:t xml:space="preserve">Goomaral Sandag-Ochir, co-founder and organizer · Anar Tuvshinbayar, co-founder and organizer,</w:t>
+      </w:r>
+      <w:r>
+        <w:t xml:space="preserve"> </w:t>
+      </w:r>
+      <w:hyperlink r:id="rId15">
+        <w:r>
+          <w:rPr>
+            <w:rStyle w:val="Hyperlink"/>
+          </w:rPr>
+          <w:t xml:space="preserve">anartuvshinbayar1@gmail.com</w:t>
+        </w:r>
+      </w:hyperlink>
+      <w:r>
+        <w:t xml:space="preserve"> </w:t>
+      </w:r>
+      <w:r>
+        <w:t xml:space="preserve">· Website: hack-touchgrass.com · Uram Enerel NGO's registration and bank details come with the contract.</w:t>
       </w:r>
     </w:p>
     <w:p>
@@ -1367,8 +1399,8 @@
         </w:pict>
       </w:r>
     </w:p>
-    <w:bookmarkEnd w:id="15"/>
-    <w:bookmarkStart w:id="16" w:name="монгол-хураангуй"/>
+    <w:bookmarkEnd w:id="16"/>
+    <w:bookmarkStart w:id="17" w:name="монгол-хураангуй"/>
     <w:p>
       <w:pPr>
         <w:pStyle w:val="Heading2"/>
@@ -1386,7 +1418,7 @@
           <w:b/>
           <w:bCs/>
         </w:rPr>
-        <w:t xml:space="preserve">Touch Grass · Залуучуудын 24 цагийн хакатон · Эрүүл мэнд × Хүрээлэн буй орчин · 2026.11.07–08 · [байршил]</w:t>
+        <w:t xml:space="preserve">Touch Grass · Залуучуудын 24 цагийн хакатон · Эрүүл мэнд × Хүрээлэн буй орчин · 2026.11.07–08 · Улаанбаатар</w:t>
       </w:r>
     </w:p>
     <w:p>
@@ -1440,7 +1472,7 @@
         <w:t xml:space="preserve"> </w:t>
       </w:r>
       <w:r>
-        <w:t xml:space="preserve">Hackathon Mongolia — хөтөлбөр, шүүлт, бүртгэлийг хариуцах сурагч, оюутны зохион байгуулагчдын нэгдэл. Урам Энэрэл ТББ (Uram Care) — улсын бүртгэлтэй, залуучуудын эрүүл мэндийн ТББ, 1,500 гаруй сайн дурынхан, 15 гаруй сургуулийн салбартай; гэрээ, санхүү, тайланг хариуцна. [Төрийн байгууллага]-ын дэмжлэгтэй.</w:t>
+        <w:t xml:space="preserve">Hackathon Mongolia — хөтөлбөр, шүүлт, бүртгэлийг хариуцах сурагч, оюутны зохион байгуулагчдын нэгдэл. Урам Энэрэл ТББ (Uram Care) — улсын бүртгэлтэй, залуучуудын эрүүл мэндийн ТББ; гэрээ, санхүү, тайланг хариуцна. Үүсгэн байгуулагч, зохион байгуулагчид: Анар Түвшинбаяр, Гоомарал Сандаг-Очир.</w:t>
       </w:r>
     </w:p>
     <w:p>
@@ -1476,7 +1508,24 @@
         <w:t xml:space="preserve"> </w:t>
       </w:r>
       <w:r>
-        <w:t xml:space="preserve">Холбоо барих: [нэр, утас, имэйл].</w:t>
+        <w:t xml:space="preserve">Холбоо барих:</w:t>
+      </w:r>
+      <w:r>
+        <w:t xml:space="preserve"> </w:t>
+      </w:r>
+      <w:hyperlink r:id="rId15">
+        <w:r>
+          <w:rPr>
+            <w:rStyle w:val="Hyperlink"/>
+          </w:rPr>
+          <w:t xml:space="preserve">anartuvshinbayar1@gmail.com</w:t>
+        </w:r>
+      </w:hyperlink>
+      <w:r>
+        <w:t xml:space="preserve"> </w:t>
+      </w:r>
+      <w:r>
+        <w:t xml:space="preserve">· hack-touchgrass.com</w:t>
       </w:r>
     </w:p>
     <w:p>
@@ -1486,8 +1535,8 @@
         </w:pict>
       </w:r>
     </w:p>
-    <w:bookmarkEnd w:id="16"/>
     <w:bookmarkEnd w:id="17"/>
+    <w:bookmarkEnd w:id="18"/>
     <w:sectPr>
       <w:footnotePr>
         <w:numRestart w:val="eachSect"/>

</xml_diff>

<commit_message>
Participation fee 45,000 MNT; recruitment outside schools
</commit_message>
<xml_diff>
--- a/docs/01-sponsorship-proposal.docx
+++ b/docs/01-sponsorship-proposal.docx
@@ -173,7 +173,7 @@
         <w:t xml:space="preserve"> </w:t>
       </w:r>
       <w:r>
-        <w:t xml:space="preserve">Secondary school and university students aged 14 to 20, free of charge, from 25+ institutions. Mentors from industry and universities; a judging panel of engineers, doctors, environmental scientists and sponsor representatives.</w:t>
+        <w:t xml:space="preserve">Secondary school and university students aged 14 to 20, from 25+ institutions; participation is 45,000 MNT per person. Mentors from industry and universities; a judging panel of engineers, doctors, environmental scientists and sponsor representatives.</w:t>
       </w:r>
     </w:p>
     <w:p>
@@ -408,7 +408,7 @@
               <w:pStyle w:val="Compact"/>
             </w:pPr>
             <w:r>
-              <w:t xml:space="preserve">220+ students aged 14 to 20; free entry; parental consent for under-18s</w:t>
+              <w:t xml:space="preserve">220+ students aged 14 to 20; 45,000 MNT participation fee; parental consent for under-18s</w:t>
             </w:r>
           </w:p>
         </w:tc>
@@ -1276,7 +1276,7 @@
         <w:pStyle w:val="BodyText"/>
       </w:pPr>
       <w:r>
-        <w:t xml:space="preserve">All payments go through Uram Enerel's account with receipts. The itemized ledger goes to every sponsor in the final report.</w:t>
+        <w:t xml:space="preserve">Participation fees (45,000 MNT for about 220 students) cover about 9,900,000 of this; sponsors cover the rest. All payments go through Uram Enerel's account with receipts. The itemized ledger goes to every sponsor in the final report.</w:t>
       </w:r>
     </w:p>
     <w:p>

</xml_diff>

<commit_message>
Broad TreeHacks-style tracks: Health, Sustainability, Education, Fintech, AI, Open
</commit_message>
<xml_diff>
--- a/docs/01-sponsorship-proposal.docx
+++ b/docs/01-sponsorship-proposal.docx
@@ -11,13 +11,13 @@
         <w:t xml:space="preserve">Touch Grass — Sponsorship Proposal</w:t>
       </w:r>
     </w:p>
-    <w:bookmarkStart w:id="9" w:name="Xe6c72dad6ae59970a7b54074d2d71b68b754772"/>
+    <w:bookmarkStart w:id="9" w:name="X19772d9f421b394b6f9dc340508d43420832d6c"/>
     <w:p>
       <w:pPr>
         <w:pStyle w:val="Heading2"/>
       </w:pPr>
       <w:r>
-        <w:t xml:space="preserve">A 24-hour youth hackathon on health and the environment · Mongolia · November 7–8, 2026</w:t>
+        <w:t xml:space="preserve">A 24-hour youth hackathon · Health · Sustainability · Education · Fintech · AI · Open · Mongolia · November 7–8, 2026</w:t>
       </w:r>
     </w:p>
     <w:p>
@@ -64,7 +64,7 @@
         <w:t xml:space="preserve"> </w:t>
       </w:r>
       <w:r>
-        <w:t xml:space="preserve">A 24-hour hackathon where 220+ young people in about 55 teams build working prototypes for health problems with an environmental cause. Six tracks, 24 specific problem statements, any technology. The event runs in English. Teams start Saturday 13:00 and submit Sunday 13:00; professional judges score every team; the best in each track presents on stage.</w:t>
+        <w:t xml:space="preserve">A 24-hour hackathon where 220+ young people in about 55 teams build working prototypes for real problems. Six tracks on the model of Stanford's TreeHacks: Health, Sustainability, Education, Fintech, AI and Open. Any technology. The event runs in English. Teams start Saturday 13:00 and submit Sunday 13:00; professional judges score every team; the best in each track presents on stage.</w:t>
       </w:r>
     </w:p>
     <w:p>
@@ -173,7 +173,7 @@
         <w:t xml:space="preserve"> </w:t>
       </w:r>
       <w:r>
-        <w:t xml:space="preserve">Secondary school and university students aged 14 to 20, from 25+ institutions; participation is 45,000 MNT per person. Mentors from industry and universities; a judging panel of engineers, doctors, environmental scientists and sponsor representatives.</w:t>
+        <w:t xml:space="preserve">Secondary school and university students aged 14 to 20, from 25+ institutions; participation is 45,000 MNT per person. Mentors from industry and universities; a judging panel of engineers, doctors, educators, finance and AI professionals, and sponsor representatives.</w:t>
       </w:r>
     </w:p>
     <w:p>
@@ -230,31 +230,13 @@
           <w:b/>
           <w:bCs/>
         </w:rPr>
-        <w:t xml:space="preserve">Health and environment is where Mongolia's biggest problems meet.</w:t>
+        <w:t xml:space="preserve">Mongolia has the talent and no reason to build.</w:t>
       </w:r>
       <w:r>
         <w:t xml:space="preserve"> </w:t>
       </w:r>
       <w:r>
-        <w:t xml:space="preserve">Four in five deaths in Mongolia are from noncommunicable diseases, and the environment people live in drives much of that: the smoke they breathe in winter, the water they draw, the cold and the dzud that have hit herders six times in a decade and killed 8.1 million animals in one winter. The country has warmed 1.59 degrees since 2005, nearly three times the global rate. These are not city problems or countryside problems. They are the national condition.</w:t>
-      </w:r>
-    </w:p>
-    <w:p>
-      <w:pPr>
-        <w:pStyle w:val="BodyText"/>
-      </w:pPr>
-      <w:r>
-        <w:rPr>
-          <w:b/>
-          <w:bCs/>
-        </w:rPr>
-        <w:t xml:space="preserve">The data is open and nobody young is building on it.</w:t>
-      </w:r>
-      <w:r>
-        <w:t xml:space="preserve"> </w:t>
-      </w:r>
-      <w:r>
-        <w:t xml:space="preserve">Air-quality stations publish hourly. The National Statistics Office has an open API. Health indicators are public. Mongolia's students win medals at the informatics olympiads every year and then build nothing with this data, because nobody has asked them to.</w:t>
+        <w:t xml:space="preserve">Mongolia's students win medals at the informatics olympiads every year. Air-quality stations publish hourly, the National Statistics Office has an open API, payments run on QR codes, and AI now speaks Mongolian. What is missing is a weekend that asks young people to turn that into something real.</w:t>
       </w:r>
     </w:p>
     <w:p>
@@ -272,7 +254,25 @@
         <w:t xml:space="preserve"> </w:t>
       </w:r>
       <w:r>
-        <w:t xml:space="preserve">In 24 hours, 220 students become 55 prototypes aimed at 24 named problems, each judged by people who work on that problem. Some prototypes die on Sunday. Some become projects, startups, theses. All of them put a generation's attention on the problems a sponsor's customers live with.</w:t>
+        <w:t xml:space="preserve">In 24 hours, 220 students become 55 prototypes, each judged by people who work in that field. Some prototypes die on Sunday. Some become projects, startups, theses. All of them put a generation's attention on the problems a sponsor's customers live with.</w:t>
+      </w:r>
+    </w:p>
+    <w:p>
+      <w:pPr>
+        <w:pStyle w:val="BodyText"/>
+      </w:pPr>
+      <w:r>
+        <w:rPr>
+          <w:b/>
+          <w:bCs/>
+        </w:rPr>
+        <w:t xml:space="preserve">Six tracks, one for every sponsor.</w:t>
+      </w:r>
+      <w:r>
+        <w:t xml:space="preserve"> </w:t>
+      </w:r>
+      <w:r>
+        <w:t xml:space="preserve">Health and Sustainability carry the country's hardest problems: four in five deaths in Mongolia are from noncommunicable diseases, and the dzud killed 8.1 million animals in one winter. Education, Fintech and AI are where banks, telecoms and tech companies meet their future customers and hires. Open keeps room for the idea nobody planned for.</w:t>
       </w:r>
     </w:p>
     <w:p>
@@ -290,7 +290,7 @@
         <w:t xml:space="preserve"> </w:t>
       </w:r>
       <w:r>
-        <w:t xml:space="preserve">Mongolia has had hackathons on mining data, health tech and air pollution, run by the World Bank, IFC, UNICEF and the city. None was student-led, none combined health and environment, and nothing independent has passed 150 participants since 2021. Touch Grass is the first at this scale, and the companies on it are the first names attached.</w:t>
+        <w:t xml:space="preserve">Mongolia has had hackathons run by the World Bank, IFC, UNICEF and the city. None was student-led, and nothing independent has passed 150 participants since 2021. Touch Grass is the first at this scale, and the companies on it are the first names attached.</w:t>
       </w:r>
     </w:p>
     <w:p>
@@ -432,7 +432,7 @@
               <w:pStyle w:val="Compact"/>
             </w:pPr>
             <w:r>
-              <w:t xml:space="preserve">six; each team claims one of 24 problem statements, so no two projects are the same</w:t>
+              <w:t xml:space="preserve">six: Health, Sustainability, Education, Fintech, AI, Open; 28 optional problem ideas on the website, or teams bring their own</w:t>
             </w:r>
           </w:p>
         </w:tc>
@@ -549,7 +549,7 @@
         <w:t xml:space="preserve"> </w:t>
       </w:r>
       <w:r>
-        <w:t xml:space="preserve">Clean air and healthy lungs · Safe heat: carbon monoxide in heated homes · Ground and water: latrines, soil and wells · Waste and health · Climate shocks: dzud, cold waves and heat · Health data and early warning. All 24 problems are listed at hack-touchgrass.com.</w:t>
+        <w:t xml:space="preserve">Health · Sustainability · Education · Fintech · AI · Open. Every track has its own winner, and three awards cross all tracks: Most Creative, Most Impactful, Most Technically Complex. Problem ideas are at hack-touchgrass.com.</w:t>
       </w:r>
     </w:p>
     <w:p>
@@ -775,7 +775,7 @@
               <w:pStyle w:val="Compact"/>
             </w:pPr>
             <w:r>
-              <w:t xml:space="preserve">a track carries your name; you co-write its problem statements; a judge on its panel; a 15-minute workshop; you present the track award</w:t>
+              <w:t xml:space="preserve">a track carries your name; you can set an optional challenge for it; a judge on its panel; a 15-minute workshop; you present the track award</w:t>
             </w:r>
           </w:p>
         </w:tc>
@@ -1418,7 +1418,7 @@
           <w:b/>
           <w:bCs/>
         </w:rPr>
-        <w:t xml:space="preserve">Touch Grass · Залуучуудын 24 цагийн хакатон · Эрүүл мэнд × Хүрээлэн буй орчин · 2026.11.07–08 · Улаанбаатар</w:t>
+        <w:t xml:space="preserve">Touch Grass · Залуучуудын 24 цагийн хакатон · Эрүүл мэнд · Тогтвортой хөгжил · Боловсрол · Финтек · AI · Нээлттэй · 2026.11.07–08 · Улаанбаатар</w:t>
       </w:r>
     </w:p>
     <w:p>
@@ -1436,7 +1436,7 @@
         <w:t xml:space="preserve"> </w:t>
       </w:r>
       <w:r>
-        <w:t xml:space="preserve">14–20 насны 220 гаруй дунд, ахлах ангийн сурагч, оюутан 55 орчим багт хуваагдан 24 цагийн дотор хүрээлэн буй орчноос үүдэлтэй эрүүл мэндийн асуудлуудад ажиллах прототип бүтээнэ. Зургаан чиглэл: цэвэр агаар ба уушгины эрүүл мэнд; угаарын хийн хордлого; хөрс, усны бохирдол; хог хаягдал; зуд, хүйтэн, халууны эрсдэл; эрүүл мэндийн өгөгдөл ба эрт сэрэмжлүүлэг. Инженер, эмч, байгаль орчны мэргэжилтнүүд баг бүрийг дүгнэнэ.</w:t>
+        <w:t xml:space="preserve">14–20 насны 220 гаруй дунд, ахлах ангийн сурагч, оюутан 55 орчим багт хуваагдан 24 цагийн дотор бодит асуудлыг шийдэх прототип бүтээнэ. Стэнфордын TreeHacks-ийн загвараар зургаан чиглэл: эрүүл мэнд; тогтвортой хөгжил; боловсрол; финтек; хиймэл оюун ухаан (AI); нээлттэй. Салбарын мэргэжилтнүүд баг бүрийг дүгнэнэ.</w:t>
       </w:r>
     </w:p>
     <w:p>
@@ -1454,7 +1454,7 @@
         <w:t xml:space="preserve"> </w:t>
       </w:r>
       <w:r>
-        <w:t xml:space="preserve">Монголд нас баралтын тав тутмын дөрөв нь халдварт бус өвчнөөс үүдэлтэй бөгөөд хүний амьдардаг орчин үүнд шууд нөлөөлдөг. Өгөгдөл нээлттэй, залуучууд чадвартай, гэвч хэн ч тэднийг энэ асуудалд чиглүүлээгүй. Монголд сурагч, оюутнууд өөрсдөө зохион байгуулсан, эрүүл мэнд ба хүрээлэн буй орчныг нэгтгэсэн, 150-аас дээш оролцогчтой хакатон өнөөг хүртэл болоогүй.</w:t>
+        <w:t xml:space="preserve">Монголын сурагчид олимпиадаас жил бүр медаль авдаг ч, тэдэнд бодит зүйл бүтээх боломж ховор. Нээлттэй өгөгдөл, QR төлбөр, монгол хэлтэй AI бэлэн байна. Монголд сурагч, оюутнууд өөрсдөө зохион байгуулсан, 150-аас дээш оролцогчтой бие даасан хакатон 2021 оноос хойш болоогүй.</w:t>
       </w:r>
     </w:p>
     <w:p>

</xml_diff>

<commit_message>
Five tracks: Healthcare, Sustainability, Education, Humanity, AI; five or six finalists
</commit_message>
<xml_diff>
--- a/docs/01-sponsorship-proposal.docx
+++ b/docs/01-sponsorship-proposal.docx
@@ -11,13 +11,13 @@
         <w:t xml:space="preserve">Touch Grass — Sponsorship Proposal</w:t>
       </w:r>
     </w:p>
-    <w:bookmarkStart w:id="9" w:name="X19772d9f421b394b6f9dc340508d43420832d6c"/>
+    <w:bookmarkStart w:id="9" w:name="X0846868ecf3fa8048d286af967c6be5b8e7d64e"/>
     <w:p>
       <w:pPr>
         <w:pStyle w:val="Heading2"/>
       </w:pPr>
       <w:r>
-        <w:t xml:space="preserve">A 24-hour youth hackathon · Health · Sustainability · Education · Fintech · AI · Open · Mongolia · November 7–8, 2026</w:t>
+        <w:t xml:space="preserve">A 24-hour youth hackathon · Healthcare · Sustainability · Education · Humanity · AI · Mongolia · November 7–8, 2026</w:t>
       </w:r>
     </w:p>
     <w:p>
@@ -64,7 +64,7 @@
         <w:t xml:space="preserve"> </w:t>
       </w:r>
       <w:r>
-        <w:t xml:space="preserve">A 24-hour hackathon where 220+ young people in about 55 teams build working prototypes for real problems. Six tracks on the model of Stanford's TreeHacks: Health, Sustainability, Education, Fintech, AI and Open. Any technology. The event runs in English. Teams start Saturday 13:00 and submit Sunday 13:00; professional judges score every team; the best in each track presents on stage.</w:t>
+        <w:t xml:space="preserve">A 24-hour hackathon where 220+ young people in about 55 teams build working prototypes for real problems. Five tracks on the model of Stanford's TreeHacks: Healthcare, Sustainability, Education, Humanity and AI. Software only. The event runs in English. Teams start Saturday 13:00 and submit Sunday 13:00; professional judges score every team; the best in each track presents on stage.</w:t>
       </w:r>
     </w:p>
     <w:p>
@@ -173,7 +173,7 @@
         <w:t xml:space="preserve"> </w:t>
       </w:r>
       <w:r>
-        <w:t xml:space="preserve">Secondary school and university students aged 14 to 20, from 25+ institutions; participation is 45,000 MNT per person. Mentors from industry and universities; a judging panel of engineers, doctors, educators, finance and AI professionals, and sponsor representatives.</w:t>
+        <w:t xml:space="preserve">Secondary school and university students aged 14 to 20, from 25+ institutions; participation is 45,000 MNT per person. Mentors from industry and universities; a judging panel of engineers, doctors, educators, AI professionals and sponsor representatives.</w:t>
       </w:r>
     </w:p>
     <w:p>
@@ -191,7 +191,7 @@
         <w:t xml:space="preserve"> </w:t>
       </w:r>
       <w:r>
-        <w:t xml:space="preserve">A title sponsor at 20,000,000 MNT, a venue partner at 20,000,000 MNT or the hall in kind, six track sponsors at 5,000,000 MNT each, a food sponsor at 10,000,000 MNT or catering in kind, and merchandise and prize-pool sponsors. The prize pool for the top three teams starts at 5,000,000 MNT and grows with sponsor commitments.</w:t>
+        <w:t xml:space="preserve">A title sponsor at 20,000,000 MNT, a venue partner at 20,000,000 MNT or the hall in kind, five track sponsors at 5,000,000 MNT each, a food sponsor at 10,000,000 MNT or catering in kind, and merchandise and prize-pool sponsors. The prize pool for the top three teams starts at 5,000,000 MNT and grows with sponsor commitments.</w:t>
       </w:r>
       <w:r>
         <w:t xml:space="preserve"> </w:t>
@@ -236,7 +236,7 @@
         <w:t xml:space="preserve"> </w:t>
       </w:r>
       <w:r>
-        <w:t xml:space="preserve">Mongolia's students win medals at the informatics olympiads every year. Air-quality stations publish hourly, the National Statistics Office has an open API, payments run on QR codes, and AI now speaks Mongolian. What is missing is a weekend that asks young people to turn that into something real.</w:t>
+        <w:t xml:space="preserve">Mongolia's students win medals at the informatics olympiads every year. Air-quality stations publish hourly, the National Statistics Office has an open API, and AI now speaks Mongolian. What is missing is a weekend that asks young people to turn that into something real.</w:t>
       </w:r>
     </w:p>
     <w:p>
@@ -266,13 +266,13 @@
           <w:b/>
           <w:bCs/>
         </w:rPr>
-        <w:t xml:space="preserve">Six tracks, one for every sponsor.</w:t>
+        <w:t xml:space="preserve">Five tracks, one for every sponsor.</w:t>
       </w:r>
       <w:r>
         <w:t xml:space="preserve"> </w:t>
       </w:r>
       <w:r>
-        <w:t xml:space="preserve">Health and Sustainability carry the country's hardest problems: four in five deaths in Mongolia are from noncommunicable diseases, and the dzud killed 8.1 million animals in one winter. Education, Fintech and AI are where banks, telecoms and tech companies meet their future customers and hires. Open keeps room for the idea nobody planned for.</w:t>
+        <w:t xml:space="preserve">Healthcare and Sustainability carry the country's hardest problems: four in five deaths in Mongolia are from noncommunicable diseases, and the dzud killed 8.1 million animals in one winter. Education and AI are where banks, telecoms and tech companies meet their future customers and hires. Humanity is for the people who get left behind: newcomers to the city, people with disabilities, families caught by debt.</w:t>
       </w:r>
     </w:p>
     <w:p>
@@ -432,7 +432,7 @@
               <w:pStyle w:val="Compact"/>
             </w:pPr>
             <w:r>
-              <w:t xml:space="preserve">six: Health, Sustainability, Education, Fintech, AI, Open; 28 optional problem ideas on the website, or teams bring their own</w:t>
+              <w:t xml:space="preserve">five: Healthcare, Sustainability, Education, Humanity, AI; software only; 30 optional problem ideas on the website, or teams bring their own</w:t>
             </w:r>
           </w:p>
         </w:tc>
@@ -480,7 +480,7 @@
               <w:pStyle w:val="Compact"/>
             </w:pPr>
             <w:r>
-              <w:t xml:space="preserve">one three-judge panel per track visits every team; six track winners plus two wildcards present on stage; the full panel picks the top three</w:t>
+              <w:t xml:space="preserve">one three-judge panel per track visits every team; the five track winners, plus one wildcard if the scores call for it, present on stage; the full panel picks the top three</w:t>
             </w:r>
           </w:p>
         </w:tc>
@@ -543,13 +543,13 @@
           <w:b/>
           <w:bCs/>
         </w:rPr>
-        <w:t xml:space="preserve">The six tracks.</w:t>
+        <w:t xml:space="preserve">The five tracks.</w:t>
       </w:r>
       <w:r>
         <w:t xml:space="preserve"> </w:t>
       </w:r>
       <w:r>
-        <w:t xml:space="preserve">Health · Sustainability · Education · Fintech · AI · Open. Every track has its own winner, and three awards cross all tracks: Most Creative, Most Impactful, Most Technically Complex. Problem ideas are at hack-touchgrass.com.</w:t>
+        <w:t xml:space="preserve">Healthcare · Sustainability · Education · Humanity · AI. Every track has its own winner, and three awards cross all tracks: Most Creative, Most Impactful, Most Technically Complex. Problem ideas are at hack-touchgrass.com.</w:t>
       </w:r>
     </w:p>
     <w:p>
@@ -764,7 +764,7 @@
               <w:pStyle w:val="Compact"/>
             </w:pPr>
             <w:r>
-              <w:t xml:space="preserve">6</w:t>
+              <w:t xml:space="preserve">5</w:t>
             </w:r>
           </w:p>
         </w:tc>
@@ -1418,7 +1418,7 @@
           <w:b/>
           <w:bCs/>
         </w:rPr>
-        <w:t xml:space="preserve">Touch Grass · Залуучуудын 24 цагийн хакатон · Эрүүл мэнд · Тогтвортой хөгжил · Боловсрол · Финтек · AI · Нээлттэй · 2026.11.07–08 · Улаанбаатар</w:t>
+        <w:t xml:space="preserve">Touch Grass · Залуучуудын 24 цагийн хакатон · Эрүүл мэнд · Тогтвортой хөгжил · Боловсрол · Хүмүүнлэг · AI · 2026.11.07–08 · Улаанбаатар</w:t>
       </w:r>
     </w:p>
     <w:p>
@@ -1436,7 +1436,7 @@
         <w:t xml:space="preserve"> </w:t>
       </w:r>
       <w:r>
-        <w:t xml:space="preserve">14–20 насны 220 гаруй дунд, ахлах ангийн сурагч, оюутан 55 орчим багт хуваагдан 24 цагийн дотор бодит асуудлыг шийдэх прототип бүтээнэ. Стэнфордын TreeHacks-ийн загвараар зургаан чиглэл: эрүүл мэнд; тогтвортой хөгжил; боловсрол; финтек; хиймэл оюун ухаан (AI); нээлттэй. Салбарын мэргэжилтнүүд баг бүрийг дүгнэнэ.</w:t>
+        <w:t xml:space="preserve">14–20 насны 220 гаруй дунд, ахлах ангийн сурагч, оюутан 55 орчим багт хуваагдан 24 цагийн дотор бодит асуудлыг шийдэх прототип бүтээнэ. Стэнфордын TreeHacks-ийн загвараар таван чиглэл: эрүүл мэнд; тогтвортой хөгжил; боловсрол; хүмүүнлэг; хиймэл оюун ухаан (AI). Салбарын мэргэжилтнүүд баг бүрийг дүгнэнэ.</w:t>
       </w:r>
     </w:p>
     <w:p>
@@ -1454,7 +1454,7 @@
         <w:t xml:space="preserve"> </w:t>
       </w:r>
       <w:r>
-        <w:t xml:space="preserve">Монголын сурагчид олимпиадаас жил бүр медаль авдаг ч, тэдэнд бодит зүйл бүтээх боломж ховор. Нээлттэй өгөгдөл, QR төлбөр, монгол хэлтэй AI бэлэн байна. Монголд сурагч, оюутнууд өөрсдөө зохион байгуулсан, 150-аас дээш оролцогчтой бие даасан хакатон 2021 оноос хойш болоогүй.</w:t>
+        <w:t xml:space="preserve">Монголын сурагчид олимпиадаас жил бүр медаль авдаг ч, тэдэнд бодит зүйл бүтээх боломж ховор. Нээлттэй өгөгдөл, монгол хэлтэй AI бэлэн байна. Монголд сурагч, оюутнууд өөрсдөө зохион байгуулсан, 150-аас дээш оролцогчтой бие даасан хакатон 2021 оноос хойш болоогүй.</w:t>
       </w:r>
     </w:p>
     <w:p>
@@ -1490,7 +1490,7 @@
         <w:t xml:space="preserve"> </w:t>
       </w:r>
       <w:r>
-        <w:t xml:space="preserve">Ерөнхий ивээн тэтгэгч 20 сая; танхимын түнш 20 сая эсвэл танхимаар; чиглэлийн ивээн тэтгэгч 5 сая (6 чиглэл); хоол 10 сая эсвэл хоол хүнсээр; бэлэг дурсгал бараагаар; шагналын сан 5 саяас дээш, ивээн тэтгэгчдийн оролцоогоор нэмэгдэнэ. Нийт төсөв 52–63 сая төгрөг. Гэрээг Урам Энэрэл ТББ байгуулж, зар сурталчилгааны үйлчилгээний и-баримт олгоно.</w:t>
+        <w:t xml:space="preserve">Ерөнхий ивээн тэтгэгч 20 сая; танхимын түнш 20 сая эсвэл танхимаар; чиглэлийн ивээн тэтгэгч 5 сая (5 чиглэл); хоол 10 сая эсвэл хоол хүнсээр; бэлэг дурсгал бараагаар; шагналын сан 5 саяас дээш, ивээн тэтгэгчдийн оролцоогоор нэмэгдэнэ. Нийт төсөв 52–63 сая төгрөг. Гэрээг Урам Энэрэл ТББ байгуулж, зар сурталчилгааны үйлчилгээний и-баримт олгоно.</w:t>
       </w:r>
     </w:p>
     <w:p>

</xml_diff>

<commit_message>
No problem list (TreeHacks style); registration opens October 17
</commit_message>
<xml_diff>
--- a/docs/01-sponsorship-proposal.docx
+++ b/docs/01-sponsorship-proposal.docx
@@ -432,7 +432,7 @@
               <w:pStyle w:val="Compact"/>
             </w:pPr>
             <w:r>
-              <w:t xml:space="preserve">five: Healthcare, Sustainability, Education, Humanity, AI; software only; 30 optional problem ideas on the website, or teams bring their own</w:t>
+              <w:t xml:space="preserve">five: Healthcare, Sustainability, Education, Humanity, AI; software only; teams build anything inside a track, as at TreeHacks</w:t>
             </w:r>
           </w:p>
         </w:tc>
@@ -549,7 +549,7 @@
         <w:t xml:space="preserve"> </w:t>
       </w:r>
       <w:r>
-        <w:t xml:space="preserve">Healthcare · Sustainability · Education · Humanity · AI. Every track has its own winner, and three awards cross all tracks: Most Creative, Most Impactful, Most Technically Complex. Problem ideas are at hack-touchgrass.com.</w:t>
+        <w:t xml:space="preserve">Healthcare · Sustainability · Education · Humanity · AI. Every track has its own winner, and three awards cross all tracks: Most Creative, Most Impactful, Most Technically Complex.</w:t>
       </w:r>
     </w:p>
     <w:p>

</xml_diff>

<commit_message>
Prizes: 2,000,000 MNT for each track winner; budget updated
</commit_message>
<xml_diff>
--- a/docs/01-sponsorship-proposal.docx
+++ b/docs/01-sponsorship-proposal.docx
@@ -191,7 +191,7 @@
         <w:t xml:space="preserve"> </w:t>
       </w:r>
       <w:r>
-        <w:t xml:space="preserve">A title sponsor at 20,000,000 MNT, a venue partner at 20,000,000 MNT or the hall in kind, five track sponsors at 5,000,000 MNT each, a food sponsor at 10,000,000 MNT or catering in kind, and merchandise and prize-pool sponsors. The prize pool for the top three teams starts at 5,000,000 MNT and grows with sponsor commitments.</w:t>
+        <w:t xml:space="preserve">A title sponsor at 20,000,000 MNT, a venue partner at 20,000,000 MNT or the hall in kind, five track sponsors at 5,000,000 MNT each, a food sponsor at 10,000,000 MNT or catering in kind, and merchandise and prize-pool sponsors. The prize pool for the top three teams starts at 5,000,000 MNT and grows with sponsor commitments; each of the five track winners also receives 2,000,000 MNT.</w:t>
       </w:r>
       <w:r>
         <w:t xml:space="preserve"> </w:t>
@@ -775,7 +775,7 @@
               <w:pStyle w:val="Compact"/>
             </w:pPr>
             <w:r>
-              <w:t xml:space="preserve">a track carries your name; you can set an optional challenge for it; a judge on its panel; a 15-minute workshop; you present the track award</w:t>
+              <w:t xml:space="preserve">a track carries your name; 2,000,000 of it is your track's cash prize, which you hand to the winning team on stage; you can set an optional challenge for it; a judge on its panel; a 15-minute workshop; you present the track award</w:t>
             </w:r>
           </w:p>
         </w:tc>
@@ -1123,18 +1123,18 @@
               <w:pStyle w:val="Compact"/>
             </w:pPr>
             <w:r>
-              <w:t xml:space="preserve">T-shirts, stickers, badges</w:t>
-            </w:r>
-          </w:p>
-        </w:tc>
-        <w:tc>
-          <w:tcPr/>
-          <w:p>
-            <w:pPr>
-              <w:pStyle w:val="Compact"/>
-            </w:pPr>
-            <w:r>
-              <w:t xml:space="preserve">4,400,000</w:t>
+              <w:t xml:space="preserve">Track prizes, 2,000,000 for each of five track winners, from track sponsorships</w:t>
+            </w:r>
+          </w:p>
+        </w:tc>
+        <w:tc>
+          <w:tcPr/>
+          <w:p>
+            <w:pPr>
+              <w:pStyle w:val="Compact"/>
+            </w:pPr>
+            <w:r>
+              <w:t xml:space="preserve">10,000,000</w:t>
             </w:r>
           </w:p>
         </w:tc>
@@ -1147,18 +1147,18 @@
               <w:pStyle w:val="Compact"/>
             </w:pPr>
             <w:r>
-              <w:t xml:space="preserve">Judges, designers, finance support</w:t>
-            </w:r>
-          </w:p>
-        </w:tc>
-        <w:tc>
-          <w:tcPr/>
-          <w:p>
-            <w:pPr>
-              <w:pStyle w:val="Compact"/>
-            </w:pPr>
-            <w:r>
-              <w:t xml:space="preserve">3,000,000</w:t>
+              <w:t xml:space="preserve">T-shirts, stickers, badges</w:t>
+            </w:r>
+          </w:p>
+        </w:tc>
+        <w:tc>
+          <w:tcPr/>
+          <w:p>
+            <w:pPr>
+              <w:pStyle w:val="Compact"/>
+            </w:pPr>
+            <w:r>
+              <w:t xml:space="preserve">4,400,000</w:t>
             </w:r>
           </w:p>
         </w:tc>
@@ -1171,18 +1171,18 @@
               <w:pStyle w:val="Compact"/>
             </w:pPr>
             <w:r>
-              <w:t xml:space="preserve">Power, supplies, first aid, printing, signage</w:t>
-            </w:r>
-          </w:p>
-        </w:tc>
-        <w:tc>
-          <w:tcPr/>
-          <w:p>
-            <w:pPr>
-              <w:pStyle w:val="Compact"/>
-            </w:pPr>
-            <w:r>
-              <w:t xml:space="preserve">3,200,000</w:t>
+              <w:t xml:space="preserve">Judges, designers, finance support</w:t>
+            </w:r>
+          </w:p>
+        </w:tc>
+        <w:tc>
+          <w:tcPr/>
+          <w:p>
+            <w:pPr>
+              <w:pStyle w:val="Compact"/>
+            </w:pPr>
+            <w:r>
+              <w:t xml:space="preserve">3,000,000</w:t>
             </w:r>
           </w:p>
         </w:tc>
@@ -1195,18 +1195,18 @@
               <w:pStyle w:val="Compact"/>
             </w:pPr>
             <w:r>
-              <w:t xml:space="preserve">Photography, security, cleaning, first aider</w:t>
-            </w:r>
-          </w:p>
-        </w:tc>
-        <w:tc>
-          <w:tcPr/>
-          <w:p>
-            <w:pPr>
-              <w:pStyle w:val="Compact"/>
-            </w:pPr>
-            <w:r>
-              <w:t xml:space="preserve">1,900,000</w:t>
+              <w:t xml:space="preserve">Power, supplies, first aid, printing, signage</w:t>
+            </w:r>
+          </w:p>
+        </w:tc>
+        <w:tc>
+          <w:tcPr/>
+          <w:p>
+            <w:pPr>
+              <w:pStyle w:val="Compact"/>
+            </w:pPr>
+            <w:r>
+              <w:t xml:space="preserve">3,200,000</w:t>
             </w:r>
           </w:p>
         </w:tc>
@@ -1219,6 +1219,30 @@
               <w:pStyle w:val="Compact"/>
             </w:pPr>
             <w:r>
+              <w:t xml:space="preserve">Photography, security, cleaning, first aider</w:t>
+            </w:r>
+          </w:p>
+        </w:tc>
+        <w:tc>
+          <w:tcPr/>
+          <w:p>
+            <w:pPr>
+              <w:pStyle w:val="Compact"/>
+            </w:pPr>
+            <w:r>
+              <w:t xml:space="preserve">1,900,000</w:t>
+            </w:r>
+          </w:p>
+        </w:tc>
+      </w:tr>
+      <w:tr>
+        <w:tc>
+          <w:tcPr/>
+          <w:p>
+            <w:pPr>
+              <w:pStyle w:val="Compact"/>
+            </w:pPr>
+            <w:r>
               <w:t xml:space="preserve">Contingency 10%</w:t>
             </w:r>
           </w:p>
@@ -1230,7 +1254,7 @@
               <w:pStyle w:val="Compact"/>
             </w:pPr>
             <w:r>
-              <w:t xml:space="preserve">4,750,000 to 5,750,000</w:t>
+              <w:t xml:space="preserve">5,750,000 to 6,750,000</w:t>
             </w:r>
           </w:p>
         </w:tc>
@@ -1262,7 +1286,7 @@
                 <w:b/>
                 <w:bCs/>
               </w:rPr>
-              <w:t xml:space="preserve">52,000,000 to 63,000,000</w:t>
+              <w:t xml:space="preserve">63,000,000 to 74,000,000</w:t>
             </w:r>
             <w:r>
               <w:t xml:space="preserve">, about 20,000,000 less if the hall is in kind</w:t>
@@ -1490,7 +1514,7 @@
         <w:t xml:space="preserve"> </w:t>
       </w:r>
       <w:r>
-        <w:t xml:space="preserve">Ерөнхий ивээн тэтгэгч 20 сая; танхимын түнш 20 сая эсвэл танхимаар; чиглэлийн ивээн тэтгэгч 5 сая (5 чиглэл); хоол 10 сая эсвэл хоол хүнсээр; бэлэг дурсгал бараагаар; шагналын сан 5 саяас дээш, ивээн тэтгэгчдийн оролцоогоор нэмэгдэнэ. Нийт төсөв 52–63 сая төгрөг. Гэрээг Урам Энэрэл ТББ байгуулж, зар сурталчилгааны үйлчилгээний и-баримт олгоно.</w:t>
+        <w:t xml:space="preserve">Ерөнхий ивээн тэтгэгч 20 сая; танхимын түнш 20 сая эсвэл танхимаар; чиглэлийн ивээн тэтгэгч 5 сая (5 чиглэл); хоол 10 сая эсвэл хоол хүнсээр; бэлэг дурсгал бараагаар; шагналын сан 5 саяас дээш, ивээн тэтгэгчдийн оролцоогоор нэмэгдэнэ. Чиглэл бүрийн ялагч баг 2 сая төгрөг авна. Нийт төсөв 63–74 сая төгрөг. Гэрээг Урам Энэрэл ТББ байгуулж, зар сурталчилгааны үйлчилгээний и-баримт олгоно.</w:t>
       </w:r>
     </w:p>
     <w:p>

</xml_diff>

<commit_message>
Sponsor tiers: Platinum, Gold (one per track), Silver
</commit_message>
<xml_diff>
--- a/docs/01-sponsorship-proposal.docx
+++ b/docs/01-sponsorship-proposal.docx
@@ -191,7 +191,55 @@
         <w:t xml:space="preserve"> </w:t>
       </w:r>
       <w:r>
-        <w:t xml:space="preserve">A title sponsor at 20,000,000 MNT, a venue partner at 20,000,000 MNT or the hall in kind, five track sponsors at 5,000,000 MNT each, a food sponsor at 10,000,000 MNT or catering in kind, and merchandise and prize-pool sponsors. The prize pool for the top three teams starts at 5,000,000 MNT and grows with sponsor commitments; each of the five track winners also receives 2,000,000 MNT.</w:t>
+        <w:t xml:space="preserve">Five to six</w:t>
+      </w:r>
+      <w:r>
+        <w:t xml:space="preserve"> </w:t>
+      </w:r>
+      <w:r>
+        <w:rPr>
+          <w:b/>
+          <w:bCs/>
+        </w:rPr>
+        <w:t xml:space="preserve">Platinum</w:t>
+      </w:r>
+      <w:r>
+        <w:t xml:space="preserve"> </w:t>
+      </w:r>
+      <w:r>
+        <w:t xml:space="preserve">sponsors at 5,000,000 MNT or more; five</w:t>
+      </w:r>
+      <w:r>
+        <w:t xml:space="preserve"> </w:t>
+      </w:r>
+      <w:r>
+        <w:rPr>
+          <w:b/>
+          <w:bCs/>
+        </w:rPr>
+        <w:t xml:space="preserve">Gold</w:t>
+      </w:r>
+      <w:r>
+        <w:t xml:space="preserve"> </w:t>
+      </w:r>
+      <w:r>
+        <w:t xml:space="preserve">sponsors at 2,000,000 MNT, one per track, whose money becomes that track's cash prize; and</w:t>
+      </w:r>
+      <w:r>
+        <w:t xml:space="preserve"> </w:t>
+      </w:r>
+      <w:r>
+        <w:rPr>
+          <w:b/>
+          <w:bCs/>
+        </w:rPr>
+        <w:t xml:space="preserve">Silver</w:t>
+      </w:r>
+      <w:r>
+        <w:t xml:space="preserve"> </w:t>
+      </w:r>
+      <w:r>
+        <w:t xml:space="preserve">sponsors at 1,000,000 to 2,000,000 MNT or in kind for food, shirts and services. The prize pool for the top three teams starts at 5,000,000 MNT and grows with Platinum commitments; each of the five track winners receives 2,000,000 MNT.</w:t>
       </w:r>
       <w:r>
         <w:t xml:space="preserve"> </w:t>
@@ -642,40 +690,40 @@
                 <w:b/>
                 <w:bCs/>
               </w:rPr>
-              <w:t xml:space="preserve">Title</w:t>
-            </w:r>
-          </w:p>
-        </w:tc>
-        <w:tc>
-          <w:tcPr/>
-          <w:p>
-            <w:pPr>
-              <w:pStyle w:val="Compact"/>
-            </w:pPr>
-            <w:r>
-              <w:t xml:space="preserve">20,000,000</w:t>
-            </w:r>
-          </w:p>
-        </w:tc>
-        <w:tc>
-          <w:tcPr/>
-          <w:p>
-            <w:pPr>
-              <w:pStyle w:val="Compact"/>
-            </w:pPr>
-            <w:r>
-              <w:t xml:space="preserve">1</w:t>
-            </w:r>
-          </w:p>
-        </w:tc>
-        <w:tc>
-          <w:tcPr/>
-          <w:p>
-            <w:pPr>
-              <w:pStyle w:val="Compact"/>
-            </w:pPr>
-            <w:r>
-              <w:t xml:space="preserve">"Touch Grass presented by Your Company"; logo first everywhere including all 220 t-shirts; 5-minute opening slot; judge on the final panel; you present first prize; first access to winning teams; opt-in participant CVs</w:t>
+              <w:t xml:space="preserve">Platinum</w:t>
+            </w:r>
+          </w:p>
+        </w:tc>
+        <w:tc>
+          <w:tcPr/>
+          <w:p>
+            <w:pPr>
+              <w:pStyle w:val="Compact"/>
+            </w:pPr>
+            <w:r>
+              <w:t xml:space="preserve">5,000,000 and up, or a venue or service of that value in kind</w:t>
+            </w:r>
+          </w:p>
+        </w:tc>
+        <w:tc>
+          <w:tcPr/>
+          <w:p>
+            <w:pPr>
+              <w:pStyle w:val="Compact"/>
+            </w:pPr>
+            <w:r>
+              <w:t xml:space="preserve">5–6</w:t>
+            </w:r>
+          </w:p>
+        </w:tc>
+        <w:tc>
+          <w:tcPr/>
+          <w:p>
+            <w:pPr>
+              <w:pStyle w:val="Compact"/>
+            </w:pPr>
+            <w:r>
+              <w:t xml:space="preserve">largest logo everywhere, on all 220 shirts and the stage; opening remarks; a 15-minute workshop; a judge on the final panel; you present one of the top-three prizes; a recruiting table and opt-in participant CVs</w:t>
             </w:r>
           </w:p>
         </w:tc>
@@ -692,40 +740,40 @@
                 <w:b/>
                 <w:bCs/>
               </w:rPr>
-              <w:t xml:space="preserve">Venue partner</w:t>
-            </w:r>
-          </w:p>
-        </w:tc>
-        <w:tc>
-          <w:tcPr/>
-          <w:p>
-            <w:pPr>
-              <w:pStyle w:val="Compact"/>
-            </w:pPr>
-            <w:r>
-              <w:t xml:space="preserve">20,000,000 or the hall in kind</w:t>
-            </w:r>
-          </w:p>
-        </w:tc>
-        <w:tc>
-          <w:tcPr/>
-          <w:p>
-            <w:pPr>
-              <w:pStyle w:val="Compact"/>
-            </w:pPr>
-            <w:r>
-              <w:t xml:space="preserve">1</w:t>
-            </w:r>
-          </w:p>
-        </w:tc>
-        <w:tc>
-          <w:tcPr/>
-          <w:p>
-            <w:pPr>
-              <w:pStyle w:val="Compact"/>
-            </w:pPr>
-            <w:r>
-              <w:t xml:space="preserve">"Hosted at Your Company"; logo on every table card and all signage; named in every announcement; opening remarks</w:t>
+              <w:t xml:space="preserve">Gold · Track</w:t>
+            </w:r>
+          </w:p>
+        </w:tc>
+        <w:tc>
+          <w:tcPr/>
+          <w:p>
+            <w:pPr>
+              <w:pStyle w:val="Compact"/>
+            </w:pPr>
+            <w:r>
+              <w:t xml:space="preserve">2,000,000</w:t>
+            </w:r>
+          </w:p>
+        </w:tc>
+        <w:tc>
+          <w:tcPr/>
+          <w:p>
+            <w:pPr>
+              <w:pStyle w:val="Compact"/>
+            </w:pPr>
+            <w:r>
+              <w:t xml:space="preserve">5, one per track</w:t>
+            </w:r>
+          </w:p>
+        </w:tc>
+        <w:tc>
+          <w:tcPr/>
+          <w:p>
+            <w:pPr>
+              <w:pStyle w:val="Compact"/>
+            </w:pPr>
+            <w:r>
+              <w:t xml:space="preserve">a track carries your name ("Healthcare track by [You]"); your 2,000,000 is that track's cash prize, which you hand to the winning team; a judge on its panel; an optional challenge you set; logo on the shirt and website</w:t>
             </w:r>
           </w:p>
         </w:tc>
@@ -742,218 +790,18 @@
                 <w:b/>
                 <w:bCs/>
               </w:rPr>
-              <w:t xml:space="preserve">Track</w:t>
-            </w:r>
-          </w:p>
-        </w:tc>
-        <w:tc>
-          <w:tcPr/>
-          <w:p>
-            <w:pPr>
-              <w:pStyle w:val="Compact"/>
-            </w:pPr>
-            <w:r>
-              <w:t xml:space="preserve">5,000,000</w:t>
-            </w:r>
-          </w:p>
-        </w:tc>
-        <w:tc>
-          <w:tcPr/>
-          <w:p>
-            <w:pPr>
-              <w:pStyle w:val="Compact"/>
-            </w:pPr>
-            <w:r>
-              <w:t xml:space="preserve">5</w:t>
-            </w:r>
-          </w:p>
-        </w:tc>
-        <w:tc>
-          <w:tcPr/>
-          <w:p>
-            <w:pPr>
-              <w:pStyle w:val="Compact"/>
-            </w:pPr>
-            <w:r>
-              <w:t xml:space="preserve">a track carries your name; 2,000,000 of it is your track's cash prize, which you hand to the winning team on stage; you can set an optional challenge for it; a judge on its panel; a 15-minute workshop; you present the track award</w:t>
-            </w:r>
-          </w:p>
-        </w:tc>
-      </w:tr>
-      <w:tr>
-        <w:tc>
-          <w:tcPr/>
-          <w:p>
-            <w:pPr>
-              <w:pStyle w:val="Compact"/>
-            </w:pPr>
-            <w:r>
-              <w:rPr>
-                <w:b/>
-                <w:bCs/>
-              </w:rPr>
-              <w:t xml:space="preserve">Food</w:t>
-            </w:r>
-          </w:p>
-        </w:tc>
-        <w:tc>
-          <w:tcPr/>
-          <w:p>
-            <w:pPr>
-              <w:pStyle w:val="Compact"/>
-            </w:pPr>
-            <w:r>
-              <w:t xml:space="preserve">10,000,000 or catering in kind</w:t>
-            </w:r>
-          </w:p>
-        </w:tc>
-        <w:tc>
-          <w:tcPr/>
-          <w:p>
-            <w:pPr>
-              <w:pStyle w:val="Compact"/>
-            </w:pPr>
-            <w:r>
-              <w:t xml:space="preserve">1 to 2</w:t>
-            </w:r>
-          </w:p>
-        </w:tc>
-        <w:tc>
-          <w:tcPr/>
-          <w:p>
-            <w:pPr>
-              <w:pStyle w:val="Compact"/>
-            </w:pPr>
-            <w:r>
-              <w:t xml:space="preserve">"Meals by Your Company" at five meals; logo on site and stage; thanks at each meal</w:t>
-            </w:r>
-          </w:p>
-        </w:tc>
-      </w:tr>
-      <w:tr>
-        <w:tc>
-          <w:tcPr/>
-          <w:p>
-            <w:pPr>
-              <w:pStyle w:val="Compact"/>
-            </w:pPr>
-            <w:r>
-              <w:rPr>
-                <w:b/>
-                <w:bCs/>
-              </w:rPr>
-              <w:t xml:space="preserve">Merchandise</w:t>
-            </w:r>
-          </w:p>
-        </w:tc>
-        <w:tc>
-          <w:tcPr/>
-          <w:p>
-            <w:pPr>
-              <w:pStyle w:val="Compact"/>
-            </w:pPr>
-            <w:r>
-              <w:t xml:space="preserve">220 t-shirts and stickers in kind, or 4,500,000</w:t>
-            </w:r>
-          </w:p>
-        </w:tc>
-        <w:tc>
-          <w:tcPr/>
-          <w:p>
-            <w:pPr>
-              <w:pStyle w:val="Compact"/>
-            </w:pPr>
-            <w:r>
-              <w:t xml:space="preserve">1</w:t>
-            </w:r>
-          </w:p>
-        </w:tc>
-        <w:tc>
-          <w:tcPr/>
-          <w:p>
-            <w:pPr>
-              <w:pStyle w:val="Compact"/>
-            </w:pPr>
-            <w:r>
-              <w:t xml:space="preserve">your logo on the shirt with the title sponsor's</w:t>
-            </w:r>
-          </w:p>
-        </w:tc>
-      </w:tr>
-      <w:tr>
-        <w:tc>
-          <w:tcPr/>
-          <w:p>
-            <w:pPr>
-              <w:pStyle w:val="Compact"/>
-            </w:pPr>
-            <w:r>
-              <w:rPr>
-                <w:b/>
-                <w:bCs/>
-              </w:rPr>
-              <w:t xml:space="preserve">Prize pool</w:t>
-            </w:r>
-          </w:p>
-        </w:tc>
-        <w:tc>
-          <w:tcPr/>
-          <w:p>
-            <w:pPr>
-              <w:pStyle w:val="Compact"/>
-            </w:pPr>
-            <w:r>
-              <w:t xml:space="preserve">1,000,000 and up</w:t>
-            </w:r>
-          </w:p>
-        </w:tc>
-        <w:tc>
-          <w:tcPr/>
-          <w:p>
-            <w:pPr>
-              <w:pStyle w:val="Compact"/>
-            </w:pPr>
-            <w:r>
-              <w:t xml:space="preserve">several</w:t>
-            </w:r>
-          </w:p>
-        </w:tc>
-        <w:tc>
-          <w:tcPr/>
-          <w:p>
-            <w:pPr>
-              <w:pStyle w:val="Compact"/>
-            </w:pPr>
-            <w:r>
-              <w:t xml:space="preserve">named contribution to the top-three pool; present one of the three awards across all tracks (Most Creative, Most Impactful, Most Technically Complex) on stage</w:t>
-            </w:r>
-          </w:p>
-        </w:tc>
-      </w:tr>
-      <w:tr>
-        <w:tc>
-          <w:tcPr/>
-          <w:p>
-            <w:pPr>
-              <w:pStyle w:val="Compact"/>
-            </w:pPr>
-            <w:r>
-              <w:rPr>
-                <w:b/>
-                <w:bCs/>
-              </w:rPr>
-              <w:t xml:space="preserve">In kind</w:t>
-            </w:r>
-          </w:p>
-        </w:tc>
-        <w:tc>
-          <w:tcPr/>
-          <w:p>
-            <w:pPr>
-              <w:pStyle w:val="Compact"/>
-            </w:pPr>
-            <w:r>
-              <w:t xml:space="preserve">goods or services</w:t>
+              <w:t xml:space="preserve">Silver</w:t>
+            </w:r>
+          </w:p>
+        </w:tc>
+        <w:tc>
+          <w:tcPr/>
+          <w:p>
+            <w:pPr>
+              <w:pStyle w:val="Compact"/>
+            </w:pPr>
+            <w:r>
+              <w:t xml:space="preserve">1,000,000 to 2,000,000, or in kind</w:t>
             </w:r>
           </w:p>
         </w:tc>
@@ -975,7 +823,7 @@
               <w:pStyle w:val="Compact"/>
             </w:pPr>
             <w:r>
-              <w:t xml:space="preserve">security, printing, water, photography, cloud credits, hardware; logo on site and thanks from the stage</w:t>
+              <w:t xml:space="preserve">food and catering, shirts, printing, devices, cloud credits or media; logo on the website and signage; thanks from the stage ("Meals by [You]" for food)</w:t>
             </w:r>
           </w:p>
         </w:tc>
@@ -1123,7 +971,7 @@
               <w:pStyle w:val="Compact"/>
             </w:pPr>
             <w:r>
-              <w:t xml:space="preserve">Track prizes, 2,000,000 for each of five track winners, from track sponsorships</w:t>
+              <w:t xml:space="preserve">Track prizes, 2,000,000 for each of five track winners, paid by the five Gold sponsors</w:t>
             </w:r>
           </w:p>
         </w:tc>
@@ -1514,7 +1362,7 @@
         <w:t xml:space="preserve"> </w:t>
       </w:r>
       <w:r>
-        <w:t xml:space="preserve">Ерөнхий ивээн тэтгэгч 20 сая; танхимын түнш 20 сая эсвэл танхимаар; чиглэлийн ивээн тэтгэгч 5 сая (5 чиглэл); хоол 10 сая эсвэл хоол хүнсээр; бэлэг дурсгал бараагаар; шагналын сан 5 саяас дээш, ивээн тэтгэгчдийн оролцоогоор нэмэгдэнэ. Чиглэл бүрийн ялагч баг 2 сая төгрөг авна. Нийт төсөв 63–74 сая төгрөг. Гэрээг Урам Энэрэл ТББ байгуулж, зар сурталчилгааны үйлчилгээний и-баримт олгоно.</w:t>
+        <w:t xml:space="preserve">Платинум ивээн тэтгэгч 5 сая төгрөг ба түүнээс дээш (5–6 байгууллага); Алтан ивээн тэтгэгч 2 сая төгрөг, чиглэл бүрт нэг (5 байгууллага), энэ мөнгө тухайн чиглэлийн ялагч багийн шагнал болно; Мөнгөн ивээн тэтгэгч 1–2 сая төгрөг эсвэл хоол, цамц, үйлчилгээгээр. Шилдэг гурван багийн шагналын сан 5 саяас дээш. Нийт төсөв 63–74 сая төгрөг. Гэрээг Урам Энэрэл ТББ байгуулж, зар сурталчилгааны үйлчилгээний и-баримт олгоно.</w:t>
       </w:r>
     </w:p>
     <w:p>

</xml_diff>

<commit_message>
Restore sponsorship proposal text (emptied by mistake), with Nov 28-29 dates and GDG partner line
</commit_message>
<xml_diff>
--- a/docs/01-sponsorship-proposal.docx
+++ b/docs/01-sponsorship-proposal.docx
@@ -2,6 +2,1286 @@
 <file path=word/document.xml><?xml version="1.0" encoding="utf-8"?>
 <w:document xmlns:w="http://schemas.openxmlformats.org/wordprocessingml/2006/main" xmlns:m="http://schemas.openxmlformats.org/officeDocument/2006/math" xmlns:r="http://schemas.openxmlformats.org/officeDocument/2006/relationships" xmlns:o="urn:schemas-microsoft-com:office:office" xmlns:v="urn:schemas-microsoft-com:vml" xmlns:w10="urn:schemas-microsoft-com:office:word" xmlns:a="http://schemas.openxmlformats.org/drawingml/2006/main" xmlns:pic="http://schemas.openxmlformats.org/drawingml/2006/picture" xmlns:wp="http://schemas.openxmlformats.org/drawingml/2006/wordprocessingDrawing">
   <w:body>
+    <w:bookmarkStart w:id="17" w:name="touch-grass--sponsorship-proposal"/>
+    <w:p>
+      <w:pPr>
+        <w:pStyle w:val="Heading1"/>
+      </w:pPr>
+      <w:r>
+        <w:t xml:space="preserve">Touch Grass — Sponsorship Proposal</w:t>
+      </w:r>
+    </w:p>
+    <w:bookmarkStart w:id="9" w:name="X16e7359bb606b2b3d9bf8c976283141bf606790"/>
+    <w:p>
+      <w:pPr>
+        <w:pStyle w:val="Heading2"/>
+      </w:pPr>
+      <w:r>
+        <w:t xml:space="preserve">A 24-hour youth hackathon · Healthcare · Sustainability · Education · Humanity · AI · Mongolia · November 28–29, 2026</w:t>
+      </w:r>
+    </w:p>
+    <w:p>
+      <w:pPr>
+        <w:pStyle w:val="FirstParagraph"/>
+      </w:pPr>
+      <w:r>
+        <w:rPr>
+          <w:b/>
+          <w:bCs/>
+        </w:rPr>
+        <w:t xml:space="preserve">hack-touchgrass.com</w:t>
+      </w:r>
+    </w:p>
+    <w:p>
+      <w:r>
+        <w:pict>
+          <v:rect style="width:0;height:1.5pt" o:hralign="center" o:hrstd="t" o:hr="t"/>
+        </w:pict>
+      </w:r>
+    </w:p>
+    <w:bookmarkEnd w:id="9"/>
+    <w:bookmarkStart w:id="10" w:name="touch-grass-in-one-page"/>
+    <w:p>
+      <w:pPr>
+        <w:pStyle w:val="Heading2"/>
+      </w:pPr>
+      <w:r>
+        <w:t xml:space="preserve">Touch Grass in one page</w:t>
+      </w:r>
+    </w:p>
+    <w:p>
+      <w:pPr>
+        <w:pStyle w:val="FirstParagraph"/>
+      </w:pPr>
+      <w:r>
+        <w:rPr>
+          <w:b/>
+          <w:bCs/>
+        </w:rPr>
+        <w:t xml:space="preserve">What.</w:t>
+      </w:r>
+      <w:r>
+        <w:t xml:space="preserve"> </w:t>
+      </w:r>
+      <w:r>
+        <w:t xml:space="preserve">A 24-hour hackathon where 220+ young people in about 55 teams build working prototypes for real problems. Five tracks on the model of Stanford's TreeHacks: Healthcare, Sustainability, Education, Humanity and AI. Software only. The event runs in English. Teams start Saturday 13:00 and submit Sunday 13:00; professional judges score every team; the best in each track presents on stage.</w:t>
+      </w:r>
+    </w:p>
+    <w:p>
+      <w:pPr>
+        <w:pStyle w:val="BodyText"/>
+      </w:pPr>
+      <w:r>
+        <w:rPr>
+          <w:b/>
+          <w:bCs/>
+        </w:rPr>
+        <w:t xml:space="preserve">When and where.</w:t>
+      </w:r>
+      <w:r>
+        <w:t xml:space="preserve"> </w:t>
+      </w:r>
+      <w:r>
+        <w:t xml:space="preserve">Saturday November 28 to Sunday November 29, 2026, in Ulaanbaatar; the venue is confirmed by November 4. Doors 11:00 Saturday, awards 16:20 Sunday.</w:t>
+      </w:r>
+    </w:p>
+    <w:p>
+      <w:pPr>
+        <w:pStyle w:val="BodyText"/>
+      </w:pPr>
+      <w:r>
+        <w:rPr>
+          <w:b/>
+          <w:bCs/>
+        </w:rPr>
+        <w:t xml:space="preserve">Who runs it.</w:t>
+      </w:r>
+      <w:r>
+        <w:t xml:space="preserve"> </w:t>
+      </w:r>
+      <w:r>
+        <w:t xml:space="preserve">Touch Grass was founded and is organized by</w:t>
+      </w:r>
+      <w:r>
+        <w:t xml:space="preserve"> </w:t>
+      </w:r>
+      <w:r>
+        <w:rPr>
+          <w:b/>
+          <w:bCs/>
+        </w:rPr>
+        <w:t xml:space="preserve">Anar Tuvshinbayar</w:t>
+      </w:r>
+      <w:r>
+        <w:t xml:space="preserve"> </w:t>
+      </w:r>
+      <w:r>
+        <w:t xml:space="preserve">and</w:t>
+      </w:r>
+      <w:r>
+        <w:t xml:space="preserve"> </w:t>
+      </w:r>
+      <w:r>
+        <w:rPr>
+          <w:b/>
+          <w:bCs/>
+        </w:rPr>
+        <w:t xml:space="preserve">Goomaral Sandag-Ochir</w:t>
+      </w:r>
+      <w:r>
+        <w:t xml:space="preserve">.</w:t>
+      </w:r>
+      <w:r>
+        <w:t xml:space="preserve"> </w:t>
+      </w:r>
+      <w:r>
+        <w:rPr>
+          <w:b/>
+          <w:bCs/>
+        </w:rPr>
+        <w:t xml:space="preserve">Hackathon Mongolia</w:t>
+      </w:r>
+      <w:r>
+        <w:t xml:space="preserve">, their student organizing team, designs and runs the program.</w:t>
+      </w:r>
+      <w:r>
+        <w:t xml:space="preserve"> </w:t>
+      </w:r>
+      <w:r>
+        <w:rPr>
+          <w:b/>
+          <w:bCs/>
+        </w:rPr>
+        <w:t xml:space="preserve">Uram Enerel NGO</w:t>
+      </w:r>
+      <w:r>
+        <w:t xml:space="preserve">, known as Uram Care, a registered youth health NGO with volunteers and school chapters across Mongolia, is the legal host: contracts, funds, receipts, reporting. A responsible adult from Uram Enerel NGO is on site for the full 24 hours.</w:t>
+      </w:r>
+      <w:r>
+        <w:t xml:space="preserve"> </w:t>
+      </w:r>
+      <w:r>
+        <w:rPr>
+          <w:b/>
+          <w:bCs/>
+        </w:rPr>
+        <w:t xml:space="preserve">GDG Ulaanbaatar</w:t>
+      </w:r>
+      <w:r>
+        <w:t xml:space="preserve"> </w:t>
+      </w:r>
+      <w:r>
+        <w:t xml:space="preserve">(Google Developer Group Ulaanbaatar) is our community partner, providing judges and mentors.</w:t>
+      </w:r>
+    </w:p>
+    <w:p>
+      <w:pPr>
+        <w:pStyle w:val="BodyText"/>
+      </w:pPr>
+      <w:r>
+        <w:rPr>
+          <w:b/>
+          <w:bCs/>
+        </w:rPr>
+        <w:t xml:space="preserve">Who comes.</w:t>
+      </w:r>
+      <w:r>
+        <w:t xml:space="preserve"> </w:t>
+      </w:r>
+      <w:r>
+        <w:t xml:space="preserve">Secondary school and university students aged 14 to 20, from 25+ institutions; participation is 45,000 MNT per person. Mentors from industry and universities; a judging panel of engineers, doctors, educators, AI professionals and sponsor representatives.</w:t>
+      </w:r>
+    </w:p>
+    <w:p>
+      <w:pPr>
+        <w:pStyle w:val="BodyText"/>
+      </w:pPr>
+      <w:r>
+        <w:rPr>
+          <w:b/>
+          <w:bCs/>
+        </w:rPr>
+        <w:t xml:space="preserve">The ask.</w:t>
+      </w:r>
+      <w:r>
+        <w:t xml:space="preserve"> </w:t>
+      </w:r>
+      <w:r>
+        <w:t xml:space="preserve">Five to six</w:t>
+      </w:r>
+      <w:r>
+        <w:t xml:space="preserve"> </w:t>
+      </w:r>
+      <w:r>
+        <w:rPr>
+          <w:b/>
+          <w:bCs/>
+        </w:rPr>
+        <w:t xml:space="preserve">Platinum</w:t>
+      </w:r>
+      <w:r>
+        <w:t xml:space="preserve"> </w:t>
+      </w:r>
+      <w:r>
+        <w:t xml:space="preserve">sponsors at 5,000,000 MNT or more; five</w:t>
+      </w:r>
+      <w:r>
+        <w:t xml:space="preserve"> </w:t>
+      </w:r>
+      <w:r>
+        <w:rPr>
+          <w:b/>
+          <w:bCs/>
+        </w:rPr>
+        <w:t xml:space="preserve">Gold</w:t>
+      </w:r>
+      <w:r>
+        <w:t xml:space="preserve"> </w:t>
+      </w:r>
+      <w:r>
+        <w:t xml:space="preserve">sponsors at 2,000,000 MNT, one per track, whose money becomes that track's cash prize; and</w:t>
+      </w:r>
+      <w:r>
+        <w:t xml:space="preserve"> </w:t>
+      </w:r>
+      <w:r>
+        <w:rPr>
+          <w:b/>
+          <w:bCs/>
+        </w:rPr>
+        <w:t xml:space="preserve">Silver</w:t>
+      </w:r>
+      <w:r>
+        <w:t xml:space="preserve"> </w:t>
+      </w:r>
+      <w:r>
+        <w:t xml:space="preserve">sponsors at 1,000,000 to 2,000,000 MNT or in kind for food, shirts and services. The prize pool for the top three teams starts at 5,000,000 MNT and grows with Platinum commitments; each of the five track winners receives 2,000,000 MNT.</w:t>
+      </w:r>
+      <w:r>
+        <w:t xml:space="preserve"> </w:t>
+      </w:r>
+      <w:r>
+        <w:rPr>
+          <w:b/>
+          <w:bCs/>
+        </w:rPr>
+        <w:t xml:space="preserve">Commitments close November 15, 2026.</w:t>
+      </w:r>
+    </w:p>
+    <w:p>
+      <w:r>
+        <w:pict>
+          <v:rect style="width:0;height:1.5pt" o:hralign="center" o:hrstd="t" o:hr="t"/>
+        </w:pict>
+      </w:r>
+    </w:p>
+    <w:bookmarkEnd w:id="10"/>
+    <w:bookmarkStart w:id="11" w:name="why-this-hackathon"/>
+    <w:p>
+      <w:pPr>
+        <w:pStyle w:val="Heading2"/>
+      </w:pPr>
+      <w:r>
+        <w:t xml:space="preserve">Why this hackathon</w:t>
+      </w:r>
+    </w:p>
+    <w:p>
+      <w:pPr>
+        <w:pStyle w:val="FirstParagraph"/>
+      </w:pPr>
+      <w:r>
+        <w:rPr>
+          <w:b/>
+          <w:bCs/>
+        </w:rPr>
+        <w:t xml:space="preserve">Mongolia has the talent and no reason to build.</w:t>
+      </w:r>
+      <w:r>
+        <w:t xml:space="preserve"> </w:t>
+      </w:r>
+      <w:r>
+        <w:t xml:space="preserve">Mongolia's students win medals at the informatics olympiads every year. Air-quality stations publish hourly, the National Statistics Office has an open API, and AI now speaks Mongolian. What is missing is a weekend that asks young people to turn that into something real.</w:t>
+      </w:r>
+    </w:p>
+    <w:p>
+      <w:pPr>
+        <w:pStyle w:val="BodyText"/>
+      </w:pPr>
+      <w:r>
+        <w:rPr>
+          <w:b/>
+          <w:bCs/>
+        </w:rPr>
+        <w:t xml:space="preserve">A hackathon is the fastest way to ask.</w:t>
+      </w:r>
+      <w:r>
+        <w:t xml:space="preserve"> </w:t>
+      </w:r>
+      <w:r>
+        <w:t xml:space="preserve">In 24 hours, 220 students become 55 prototypes, each judged by people who work in that field. Some prototypes die on Sunday. Some become projects, startups, theses. All of them put a generation's attention on the problems a sponsor's customers live with.</w:t>
+      </w:r>
+    </w:p>
+    <w:p>
+      <w:pPr>
+        <w:pStyle w:val="BodyText"/>
+      </w:pPr>
+      <w:r>
+        <w:rPr>
+          <w:b/>
+          <w:bCs/>
+        </w:rPr>
+        <w:t xml:space="preserve">Five tracks, one for every sponsor.</w:t>
+      </w:r>
+      <w:r>
+        <w:t xml:space="preserve"> </w:t>
+      </w:r>
+      <w:r>
+        <w:t xml:space="preserve">Healthcare and Sustainability carry the country's hardest problems: four in five deaths in Mongolia are from noncommunicable diseases, and the dzud killed 8.1 million animals in one winter. Education and AI are where banks, telecoms and tech companies meet their future customers and hires. Humanity is for the people who get left behind: newcomers to the city, people with disabilities, families caught by debt.</w:t>
+      </w:r>
+    </w:p>
+    <w:p>
+      <w:pPr>
+        <w:pStyle w:val="BodyText"/>
+      </w:pPr>
+      <w:r>
+        <w:rPr>
+          <w:b/>
+          <w:bCs/>
+        </w:rPr>
+        <w:t xml:space="preserve">Nobody has done this.</w:t>
+      </w:r>
+      <w:r>
+        <w:t xml:space="preserve"> </w:t>
+      </w:r>
+      <w:r>
+        <w:t xml:space="preserve">Mongolia has had hackathons run by the World Bank, IFC, UNICEF and the city. None was student-led, and nothing independent has passed 150 participants since 2021. Touch Grass is the first at this scale, and the companies on it are the first names attached.</w:t>
+      </w:r>
+    </w:p>
+    <w:p>
+      <w:r>
+        <w:pict>
+          <v:rect style="width:0;height:1.5pt" o:hralign="center" o:hrstd="t" o:hr="t"/>
+        </w:pict>
+      </w:r>
+    </w:p>
+    <w:bookmarkEnd w:id="11"/>
+    <w:bookmarkStart w:id="12" w:name="the-event"/>
+    <w:p>
+      <w:pPr>
+        <w:pStyle w:val="Heading2"/>
+      </w:pPr>
+      <w:r>
+        <w:t xml:space="preserve">The event</w:t>
+      </w:r>
+    </w:p>
+    <w:tbl>
+      <w:tblPr>
+        <w:tblStyle w:val="Table"/>
+        <w:tblW w:type="auto" w:w="0"/>
+        <w:tblLook w:firstRow="1" w:lastRow="0" w:firstColumn="0" w:lastColumn="0" w:noHBand="0" w:noVBand="0" w:val="0020"/>
+      </w:tblPr>
+      <w:tblGrid>
+        <w:gridCol w:w="3960"/>
+        <w:gridCol w:w="3960"/>
+      </w:tblGrid>
+      <w:tr>
+        <w:trPr>
+          <w:tblHeader w:val="on"/>
+        </w:trPr>
+        <w:tc>
+          <w:tcPr/>
+          <w:p>
+            <w:pPr>
+              <w:pStyle w:val="Compact"/>
+            </w:pPr>
+          </w:p>
+        </w:tc>
+        <w:tc>
+          <w:tcPr/>
+          <w:p>
+            <w:pPr>
+              <w:pStyle w:val="Compact"/>
+            </w:pPr>
+          </w:p>
+        </w:tc>
+      </w:tr>
+      <w:tr>
+        <w:tc>
+          <w:tcPr/>
+          <w:p>
+            <w:pPr>
+              <w:pStyle w:val="Compact"/>
+            </w:pPr>
+            <w:r>
+              <w:t xml:space="preserve">Format</w:t>
+            </w:r>
+          </w:p>
+        </w:tc>
+        <w:tc>
+          <w:tcPr/>
+          <w:p>
+            <w:pPr>
+              <w:pStyle w:val="Compact"/>
+            </w:pPr>
+            <w:r>
+              <w:t xml:space="preserve">24 hours in person, overnight at the venue with adult supervision; teams of 2 to 4; in English</w:t>
+            </w:r>
+          </w:p>
+        </w:tc>
+      </w:tr>
+      <w:tr>
+        <w:tc>
+          <w:tcPr/>
+          <w:p>
+            <w:pPr>
+              <w:pStyle w:val="Compact"/>
+            </w:pPr>
+            <w:r>
+              <w:t xml:space="preserve">Hacking window</w:t>
+            </w:r>
+          </w:p>
+        </w:tc>
+        <w:tc>
+          <w:tcPr/>
+          <w:p>
+            <w:pPr>
+              <w:pStyle w:val="Compact"/>
+            </w:pPr>
+            <w:r>
+              <w:t xml:space="preserve">Saturday 13:00 to Sunday 13:00</w:t>
+            </w:r>
+          </w:p>
+        </w:tc>
+      </w:tr>
+      <w:tr>
+        <w:tc>
+          <w:tcPr/>
+          <w:p>
+            <w:pPr>
+              <w:pStyle w:val="Compact"/>
+            </w:pPr>
+            <w:r>
+              <w:t xml:space="preserve">Participants</w:t>
+            </w:r>
+          </w:p>
+        </w:tc>
+        <w:tc>
+          <w:tcPr/>
+          <w:p>
+            <w:pPr>
+              <w:pStyle w:val="Compact"/>
+            </w:pPr>
+            <w:r>
+              <w:t xml:space="preserve">220+ students aged 14 to 20; 45,000 MNT participation fee; parental consent for under-18s</w:t>
+            </w:r>
+          </w:p>
+        </w:tc>
+      </w:tr>
+      <w:tr>
+        <w:tc>
+          <w:tcPr/>
+          <w:p>
+            <w:pPr>
+              <w:pStyle w:val="Compact"/>
+            </w:pPr>
+            <w:r>
+              <w:t xml:space="preserve">Tracks</w:t>
+            </w:r>
+          </w:p>
+        </w:tc>
+        <w:tc>
+          <w:tcPr/>
+          <w:p>
+            <w:pPr>
+              <w:pStyle w:val="Compact"/>
+            </w:pPr>
+            <w:r>
+              <w:t xml:space="preserve">five: Healthcare, Sustainability, Education, Humanity, AI; software only; teams build anything inside a track, as at TreeHacks</w:t>
+            </w:r>
+          </w:p>
+        </w:tc>
+      </w:tr>
+      <w:tr>
+        <w:tc>
+          <w:tcPr/>
+          <w:p>
+            <w:pPr>
+              <w:pStyle w:val="Compact"/>
+            </w:pPr>
+            <w:r>
+              <w:t xml:space="preserve">Support</w:t>
+            </w:r>
+          </w:p>
+        </w:tc>
+        <w:tc>
+          <w:tcPr/>
+          <w:p>
+            <w:pPr>
+              <w:pStyle w:val="Compact"/>
+            </w:pPr>
+            <w:r>
+              <w:t xml:space="preserve">two workshops Saturday, mentor hours, a night mentor on call</w:t>
+            </w:r>
+          </w:p>
+        </w:tc>
+      </w:tr>
+      <w:tr>
+        <w:tc>
+          <w:tcPr/>
+          <w:p>
+            <w:pPr>
+              <w:pStyle w:val="Compact"/>
+            </w:pPr>
+            <w:r>
+              <w:t xml:space="preserve">Judging</w:t>
+            </w:r>
+          </w:p>
+        </w:tc>
+        <w:tc>
+          <w:tcPr/>
+          <w:p>
+            <w:pPr>
+              <w:pStyle w:val="Compact"/>
+            </w:pPr>
+            <w:r>
+              <w:t xml:space="preserve">one three-judge panel per track visits every team; the five track winners, plus one wildcard if the scores call for it, present on stage; the full panel picks the top three</w:t>
+            </w:r>
+          </w:p>
+        </w:tc>
+      </w:tr>
+      <w:tr>
+        <w:tc>
+          <w:tcPr/>
+          <w:p>
+            <w:pPr>
+              <w:pStyle w:val="Compact"/>
+            </w:pPr>
+            <w:r>
+              <w:t xml:space="preserve">Outputs</w:t>
+            </w:r>
+          </w:p>
+        </w:tc>
+        <w:tc>
+          <w:tcPr/>
+          <w:p>
+            <w:pPr>
+              <w:pStyle w:val="Compact"/>
+            </w:pPr>
+            <w:r>
+              <w:t xml:space="preserve">55 prototypes with public project pages, results post, photos and video, a report to sponsors within a week</w:t>
+            </w:r>
+          </w:p>
+        </w:tc>
+      </w:tr>
+      <w:tr>
+        <w:tc>
+          <w:tcPr/>
+          <w:p>
+            <w:pPr>
+              <w:pStyle w:val="Compact"/>
+            </w:pPr>
+            <w:r>
+              <w:t xml:space="preserve">Safety</w:t>
+            </w:r>
+          </w:p>
+        </w:tc>
+        <w:tc>
+          <w:tcPr/>
+          <w:p>
+            <w:pPr>
+              <w:pStyle w:val="Compact"/>
+            </w:pPr>
+            <w:r>
+              <w:t xml:space="preserve">responsible adult on site throughout, overnight adult shift, first aid, security, sign-out log for minors</w:t>
+            </w:r>
+          </w:p>
+        </w:tc>
+      </w:tr>
+    </w:tbl>
+    <w:p>
+      <w:pPr>
+        <w:pStyle w:val="BodyText"/>
+      </w:pPr>
+      <w:r>
+        <w:rPr>
+          <w:b/>
+          <w:bCs/>
+        </w:rPr>
+        <w:t xml:space="preserve">The five tracks.</w:t>
+      </w:r>
+      <w:r>
+        <w:t xml:space="preserve"> </w:t>
+      </w:r>
+      <w:r>
+        <w:t xml:space="preserve">Healthcare · Sustainability · Education · Humanity · AI. Every track has its own winner, and three awards cross all tracks: Most Creative, Most Impactful, Most Technically Complex.</w:t>
+      </w:r>
+    </w:p>
+    <w:p>
+      <w:r>
+        <w:pict>
+          <v:rect style="width:0;height:1.5pt" o:hralign="center" o:hrstd="t" o:hr="t"/>
+        </w:pict>
+      </w:r>
+    </w:p>
+    <w:bookmarkEnd w:id="12"/>
+    <w:bookmarkStart w:id="13" w:name="sponsorship-tiers"/>
+    <w:p>
+      <w:pPr>
+        <w:pStyle w:val="Heading2"/>
+      </w:pPr>
+      <w:r>
+        <w:t xml:space="preserve">Sponsorship tiers</w:t>
+      </w:r>
+    </w:p>
+    <w:tbl>
+      <w:tblPr>
+        <w:tblStyle w:val="Table"/>
+        <w:tblW w:type="auto" w:w="0"/>
+        <w:tblLook w:firstRow="1" w:lastRow="0" w:firstColumn="0" w:lastColumn="0" w:noHBand="0" w:noVBand="0" w:val="0020"/>
+      </w:tblPr>
+      <w:tblGrid>
+        <w:gridCol w:w="1980"/>
+        <w:gridCol w:w="1980"/>
+        <w:gridCol w:w="1980"/>
+        <w:gridCol w:w="1980"/>
+      </w:tblGrid>
+      <w:tr>
+        <w:trPr>
+          <w:tblHeader w:val="on"/>
+        </w:trPr>
+        <w:tc>
+          <w:tcPr/>
+          <w:p>
+            <w:pPr>
+              <w:pStyle w:val="Compact"/>
+            </w:pPr>
+            <w:r>
+              <w:t xml:space="preserve">Tier</w:t>
+            </w:r>
+          </w:p>
+        </w:tc>
+        <w:tc>
+          <w:tcPr/>
+          <w:p>
+            <w:pPr>
+              <w:pStyle w:val="Compact"/>
+            </w:pPr>
+            <w:r>
+              <w:t xml:space="preserve">MNT</w:t>
+            </w:r>
+          </w:p>
+        </w:tc>
+        <w:tc>
+          <w:tcPr/>
+          <w:p>
+            <w:pPr>
+              <w:pStyle w:val="Compact"/>
+            </w:pPr>
+            <w:r>
+              <w:t xml:space="preserve">Slots</w:t>
+            </w:r>
+          </w:p>
+        </w:tc>
+        <w:tc>
+          <w:tcPr/>
+          <w:p>
+            <w:pPr>
+              <w:pStyle w:val="Compact"/>
+            </w:pPr>
+            <w:r>
+              <w:t xml:space="preserve">What you get</w:t>
+            </w:r>
+          </w:p>
+        </w:tc>
+      </w:tr>
+      <w:tr>
+        <w:tc>
+          <w:tcPr/>
+          <w:p>
+            <w:pPr>
+              <w:pStyle w:val="Compact"/>
+            </w:pPr>
+            <w:r>
+              <w:rPr>
+                <w:b/>
+                <w:bCs/>
+              </w:rPr>
+              <w:t xml:space="preserve">Platinum</w:t>
+            </w:r>
+          </w:p>
+        </w:tc>
+        <w:tc>
+          <w:tcPr/>
+          <w:p>
+            <w:pPr>
+              <w:pStyle w:val="Compact"/>
+            </w:pPr>
+            <w:r>
+              <w:t xml:space="preserve">5,000,000 and up, or a venue or service of that value in kind</w:t>
+            </w:r>
+          </w:p>
+        </w:tc>
+        <w:tc>
+          <w:tcPr/>
+          <w:p>
+            <w:pPr>
+              <w:pStyle w:val="Compact"/>
+            </w:pPr>
+            <w:r>
+              <w:t xml:space="preserve">5–6</w:t>
+            </w:r>
+          </w:p>
+        </w:tc>
+        <w:tc>
+          <w:tcPr/>
+          <w:p>
+            <w:pPr>
+              <w:pStyle w:val="Compact"/>
+            </w:pPr>
+            <w:r>
+              <w:t xml:space="preserve">largest logo everywhere, on all 220 shirts and the stage; opening remarks; a 15-minute workshop; a judge on the final panel; you present one of the top-three prizes; a recruiting table and opt-in participant CVs</w:t>
+            </w:r>
+          </w:p>
+        </w:tc>
+      </w:tr>
+      <w:tr>
+        <w:tc>
+          <w:tcPr/>
+          <w:p>
+            <w:pPr>
+              <w:pStyle w:val="Compact"/>
+            </w:pPr>
+            <w:r>
+              <w:rPr>
+                <w:b/>
+                <w:bCs/>
+              </w:rPr>
+              <w:t xml:space="preserve">Gold · Track</w:t>
+            </w:r>
+          </w:p>
+        </w:tc>
+        <w:tc>
+          <w:tcPr/>
+          <w:p>
+            <w:pPr>
+              <w:pStyle w:val="Compact"/>
+            </w:pPr>
+            <w:r>
+              <w:t xml:space="preserve">2,000,000</w:t>
+            </w:r>
+          </w:p>
+        </w:tc>
+        <w:tc>
+          <w:tcPr/>
+          <w:p>
+            <w:pPr>
+              <w:pStyle w:val="Compact"/>
+            </w:pPr>
+            <w:r>
+              <w:t xml:space="preserve">5, one per track</w:t>
+            </w:r>
+          </w:p>
+        </w:tc>
+        <w:tc>
+          <w:tcPr/>
+          <w:p>
+            <w:pPr>
+              <w:pStyle w:val="Compact"/>
+            </w:pPr>
+            <w:r>
+              <w:t xml:space="preserve">a track carries your name ("Healthcare track by [You]"); your 2,000,000 is that track's cash prize, which you hand to the winning team; a judge on its panel; an optional challenge you set; logo on the shirt and website</w:t>
+            </w:r>
+          </w:p>
+        </w:tc>
+      </w:tr>
+      <w:tr>
+        <w:tc>
+          <w:tcPr/>
+          <w:p>
+            <w:pPr>
+              <w:pStyle w:val="Compact"/>
+            </w:pPr>
+            <w:r>
+              <w:rPr>
+                <w:b/>
+                <w:bCs/>
+              </w:rPr>
+              <w:t xml:space="preserve">Silver</w:t>
+            </w:r>
+          </w:p>
+        </w:tc>
+        <w:tc>
+          <w:tcPr/>
+          <w:p>
+            <w:pPr>
+              <w:pStyle w:val="Compact"/>
+            </w:pPr>
+            <w:r>
+              <w:t xml:space="preserve">1,000,000 to 2,000,000, or in kind</w:t>
+            </w:r>
+          </w:p>
+        </w:tc>
+        <w:tc>
+          <w:tcPr/>
+          <w:p>
+            <w:pPr>
+              <w:pStyle w:val="Compact"/>
+            </w:pPr>
+            <w:r>
+              <w:t xml:space="preserve">open</w:t>
+            </w:r>
+          </w:p>
+        </w:tc>
+        <w:tc>
+          <w:tcPr/>
+          <w:p>
+            <w:pPr>
+              <w:pStyle w:val="Compact"/>
+            </w:pPr>
+            <w:r>
+              <w:t xml:space="preserve">food and catering, shirts, printing, devices, cloud credits or media; logo on the website and signage; thanks from the stage ("Meals by [You]" for food)</w:t>
+            </w:r>
+          </w:p>
+        </w:tc>
+      </w:tr>
+    </w:tbl>
+    <w:p>
+      <w:pPr>
+        <w:pStyle w:val="BodyText"/>
+      </w:pPr>
+      <w:r>
+        <w:t xml:space="preserve">Every sponsor receives a logo on the website and results post, a mention in the report, event photographs, and a thank-you from the stage. Wifi is provided by the venue.</w:t>
+      </w:r>
+    </w:p>
+    <w:p>
+      <w:r>
+        <w:pict>
+          <v:rect style="width:0;height:1.5pt" o:hralign="center" o:hrstd="t" o:hr="t"/>
+        </w:pict>
+      </w:r>
+    </w:p>
+    <w:bookmarkEnd w:id="13"/>
+    <w:bookmarkStart w:id="14" w:name="where-the-money-goes"/>
+    <w:p>
+      <w:pPr>
+        <w:pStyle w:val="Heading2"/>
+      </w:pPr>
+      <w:r>
+        <w:t xml:space="preserve">Where the money goes</w:t>
+      </w:r>
+    </w:p>
+    <w:tbl>
+      <w:tblPr>
+        <w:tblStyle w:val="Table"/>
+        <w:tblW w:type="auto" w:w="0"/>
+        <w:tblLook w:firstRow="1" w:lastRow="0" w:firstColumn="0" w:lastColumn="0" w:noHBand="0" w:noVBand="0" w:val="0020"/>
+      </w:tblPr>
+      <w:tblGrid>
+        <w:gridCol w:w="3960"/>
+        <w:gridCol w:w="3960"/>
+      </w:tblGrid>
+      <w:tr>
+        <w:trPr>
+          <w:tblHeader w:val="on"/>
+        </w:trPr>
+        <w:tc>
+          <w:tcPr/>
+          <w:p>
+            <w:pPr>
+              <w:pStyle w:val="Compact"/>
+            </w:pPr>
+            <w:r>
+              <w:t xml:space="preserve">Item</w:t>
+            </w:r>
+          </w:p>
+        </w:tc>
+        <w:tc>
+          <w:tcPr/>
+          <w:p>
+            <w:pPr>
+              <w:pStyle w:val="Compact"/>
+            </w:pPr>
+            <w:r>
+              <w:t xml:space="preserve">MNT</w:t>
+            </w:r>
+          </w:p>
+        </w:tc>
+      </w:tr>
+      <w:tr>
+        <w:tc>
+          <w:tcPr/>
+          <w:p>
+            <w:pPr>
+              <w:pStyle w:val="Compact"/>
+            </w:pPr>
+            <w:r>
+              <w:t xml:space="preserve">Venue, two days including overnight</w:t>
+            </w:r>
+          </w:p>
+        </w:tc>
+        <w:tc>
+          <w:tcPr/>
+          <w:p>
+            <w:pPr>
+              <w:pStyle w:val="Compact"/>
+            </w:pPr>
+            <w:r>
+              <w:t xml:space="preserve">20,000,000</w:t>
+            </w:r>
+          </w:p>
+        </w:tc>
+      </w:tr>
+      <w:tr>
+        <w:tc>
+          <w:tcPr/>
+          <w:p>
+            <w:pPr>
+              <w:pStyle w:val="Compact"/>
+            </w:pPr>
+            <w:r>
+              <w:t xml:space="preserve">Food, five meals and snacks for 220 participants and 45 staff</w:t>
+            </w:r>
+          </w:p>
+        </w:tc>
+        <w:tc>
+          <w:tcPr/>
+          <w:p>
+            <w:pPr>
+              <w:pStyle w:val="Compact"/>
+            </w:pPr>
+            <w:r>
+              <w:t xml:space="preserve">10,000,000</w:t>
+            </w:r>
+          </w:p>
+        </w:tc>
+      </w:tr>
+      <w:tr>
+        <w:tc>
+          <w:tcPr/>
+          <w:p>
+            <w:pPr>
+              <w:pStyle w:val="Compact"/>
+            </w:pPr>
+            <w:r>
+              <w:t xml:space="preserve">Prize pool for the top three, split 50 / 30 / 20</w:t>
+            </w:r>
+          </w:p>
+        </w:tc>
+        <w:tc>
+          <w:tcPr/>
+          <w:p>
+            <w:pPr>
+              <w:pStyle w:val="Compact"/>
+            </w:pPr>
+            <w:r>
+              <w:t xml:space="preserve">5,000,000 minimum, target 15,000,000</w:t>
+            </w:r>
+          </w:p>
+        </w:tc>
+      </w:tr>
+      <w:tr>
+        <w:tc>
+          <w:tcPr/>
+          <w:p>
+            <w:pPr>
+              <w:pStyle w:val="Compact"/>
+            </w:pPr>
+            <w:r>
+              <w:t xml:space="preserve">Track prizes, 2,000,000 for each of five track winners, paid by the five Gold sponsors</w:t>
+            </w:r>
+          </w:p>
+        </w:tc>
+        <w:tc>
+          <w:tcPr/>
+          <w:p>
+            <w:pPr>
+              <w:pStyle w:val="Compact"/>
+            </w:pPr>
+            <w:r>
+              <w:t xml:space="preserve">10,000,000</w:t>
+            </w:r>
+          </w:p>
+        </w:tc>
+      </w:tr>
+      <w:tr>
+        <w:tc>
+          <w:tcPr/>
+          <w:p>
+            <w:pPr>
+              <w:pStyle w:val="Compact"/>
+            </w:pPr>
+            <w:r>
+              <w:t xml:space="preserve">T-shirts, stickers, badges</w:t>
+            </w:r>
+          </w:p>
+        </w:tc>
+        <w:tc>
+          <w:tcPr/>
+          <w:p>
+            <w:pPr>
+              <w:pStyle w:val="Compact"/>
+            </w:pPr>
+            <w:r>
+              <w:t xml:space="preserve">4,400,000</w:t>
+            </w:r>
+          </w:p>
+        </w:tc>
+      </w:tr>
+      <w:tr>
+        <w:tc>
+          <w:tcPr/>
+          <w:p>
+            <w:pPr>
+              <w:pStyle w:val="Compact"/>
+            </w:pPr>
+            <w:r>
+              <w:t xml:space="preserve">Judges, designers, finance support</w:t>
+            </w:r>
+          </w:p>
+        </w:tc>
+        <w:tc>
+          <w:tcPr/>
+          <w:p>
+            <w:pPr>
+              <w:pStyle w:val="Compact"/>
+            </w:pPr>
+            <w:r>
+              <w:t xml:space="preserve">3,000,000</w:t>
+            </w:r>
+          </w:p>
+        </w:tc>
+      </w:tr>
+      <w:tr>
+        <w:tc>
+          <w:tcPr/>
+          <w:p>
+            <w:pPr>
+              <w:pStyle w:val="Compact"/>
+            </w:pPr>
+            <w:r>
+              <w:t xml:space="preserve">Power, supplies, first aid, printing, signage</w:t>
+            </w:r>
+          </w:p>
+        </w:tc>
+        <w:tc>
+          <w:tcPr/>
+          <w:p>
+            <w:pPr>
+              <w:pStyle w:val="Compact"/>
+            </w:pPr>
+            <w:r>
+              <w:t xml:space="preserve">3,200,000</w:t>
+            </w:r>
+          </w:p>
+        </w:tc>
+      </w:tr>
+      <w:tr>
+        <w:tc>
+          <w:tcPr/>
+          <w:p>
+            <w:pPr>
+              <w:pStyle w:val="Compact"/>
+            </w:pPr>
+            <w:r>
+              <w:t xml:space="preserve">Photography, security, cleaning, first aider</w:t>
+            </w:r>
+          </w:p>
+        </w:tc>
+        <w:tc>
+          <w:tcPr/>
+          <w:p>
+            <w:pPr>
+              <w:pStyle w:val="Compact"/>
+            </w:pPr>
+            <w:r>
+              <w:t xml:space="preserve">1,900,000</w:t>
+            </w:r>
+          </w:p>
+        </w:tc>
+      </w:tr>
+      <w:tr>
+        <w:tc>
+          <w:tcPr/>
+          <w:p>
+            <w:pPr>
+              <w:pStyle w:val="Compact"/>
+            </w:pPr>
+            <w:r>
+              <w:t xml:space="preserve">Contingency 10%</w:t>
+            </w:r>
+          </w:p>
+        </w:tc>
+        <w:tc>
+          <w:tcPr/>
+          <w:p>
+            <w:pPr>
+              <w:pStyle w:val="Compact"/>
+            </w:pPr>
+            <w:r>
+              <w:t xml:space="preserve">5,750,000 to 6,750,000</w:t>
+            </w:r>
+          </w:p>
+        </w:tc>
+      </w:tr>
+      <w:tr>
+        <w:tc>
+          <w:tcPr/>
+          <w:p>
+            <w:pPr>
+              <w:pStyle w:val="Compact"/>
+            </w:pPr>
+            <w:r>
+              <w:rPr>
+                <w:b/>
+                <w:bCs/>
+              </w:rPr>
+              <w:t xml:space="preserve">Total</w:t>
+            </w:r>
+          </w:p>
+        </w:tc>
+        <w:tc>
+          <w:tcPr/>
+          <w:p>
+            <w:pPr>
+              <w:pStyle w:val="Compact"/>
+            </w:pPr>
+            <w:r>
+              <w:rPr>
+                <w:b/>
+                <w:bCs/>
+              </w:rPr>
+              <w:t xml:space="preserve">63,000,000 to 74,000,000</w:t>
+            </w:r>
+            <w:r>
+              <w:t xml:space="preserve">, about 20,000,000 less if the hall is in kind</w:t>
+            </w:r>
+          </w:p>
+        </w:tc>
+      </w:tr>
+    </w:tbl>
+    <w:p>
+      <w:pPr>
+        <w:pStyle w:val="BodyText"/>
+      </w:pPr>
+      <w:r>
+        <w:t xml:space="preserve">Participation fees (45,000 MNT for about 220 students) cover about 9,900,000 of this; sponsors cover the rest. All payments go through Uram Enerel's account with receipts. The itemized ledger goes to every sponsor in the final report.</w:t>
+      </w:r>
+    </w:p>
+    <w:p>
+      <w:r>
+        <w:pict>
+          <v:rect style="width:0;height:1.5pt" o:hralign="center" o:hrstd="t" o:hr="t"/>
+        </w:pict>
+      </w:r>
+    </w:p>
+    <w:bookmarkEnd w:id="14"/>
+    <w:bookmarkStart w:id="16" w:name="how-to-say-yes"/>
+    <w:p>
+      <w:pPr>
+        <w:pStyle w:val="Heading2"/>
+      </w:pPr>
+      <w:r>
+        <w:t xml:space="preserve">How to say yes</w:t>
+      </w:r>
+    </w:p>
+    <w:p>
+      <w:pPr>
+        <w:pStyle w:val="Compact"/>
+        <w:numPr>
+          <w:ilvl w:val="0"/>
+          <w:numId w:val="1001"/>
+        </w:numPr>
+      </w:pPr>
+      <w:r>
+        <w:t xml:space="preserve">Tell Goomaral Sandag-Ochir or Anar Tuvshinbayar your tier by</w:t>
+      </w:r>
+      <w:r>
+        <w:t xml:space="preserve"> </w:t>
+      </w:r>
+      <w:r>
+        <w:rPr>
+          <w:b/>
+          <w:bCs/>
+        </w:rPr>
+        <w:t xml:space="preserve">November 15, 2026</w:t>
+      </w:r>
+      <w:r>
+        <w:t xml:space="preserve">.</w:t>
+      </w:r>
+    </w:p>
+    <w:p>
+      <w:pPr>
+        <w:pStyle w:val="Compact"/>
+        <w:numPr>
+          <w:ilvl w:val="0"/>
+          <w:numId w:val="1001"/>
+        </w:numPr>
+      </w:pPr>
+      <w:r>
+        <w:t xml:space="preserve">Uram Enerel sends a one-page contract: amount, payment date, your tier's benefits, logo usage, refund or roll-over if the event is cancelled, no control over judging or program.</w:t>
+      </w:r>
+    </w:p>
+    <w:p>
+      <w:pPr>
+        <w:pStyle w:val="Compact"/>
+        <w:numPr>
+          <w:ilvl w:val="0"/>
+          <w:numId w:val="1001"/>
+        </w:numPr>
+      </w:pPr>
+      <w:r>
+        <w:t xml:space="preserve">Uram Enerel invoices the sponsorship as advertising services with an e-barimt. Under Article 19 of the Law on Advertising, a sponsor's contribution to an advertising distributor under contract counts as advertising payment, so it books as a marketing expense, not a non-deductible donation. Cash prizes carry 5 percent personal income tax, which Uram Enerel withholds.</w:t>
+      </w:r>
+    </w:p>
+    <w:p>
+      <w:pPr>
+        <w:pStyle w:val="Compact"/>
+        <w:numPr>
+          <w:ilvl w:val="0"/>
+          <w:numId w:val="1001"/>
+        </w:numPr>
+      </w:pPr>
+      <w:r>
+        <w:t xml:space="preserve">Send your logo and a 40-word description. Name your judge, and for track sponsors your workshop speaker, by November 20.</w:t>
+      </w:r>
+    </w:p>
+    <w:p>
+      <w:pPr>
+        <w:pStyle w:val="FirstParagraph"/>
+      </w:pPr>
+      <w:r>
+        <w:rPr>
+          <w:b/>
+          <w:bCs/>
+        </w:rPr>
+        <w:t xml:space="preserve">Contacts.</w:t>
+      </w:r>
+      <w:r>
+        <w:t xml:space="preserve"> </w:t>
+      </w:r>
+      <w:r>
+        <w:t xml:space="preserve">Goomaral Sandag-Ochir, founder and organizer · Anar Tuvshinbayar, founder and organizer,</w:t>
+      </w:r>
+      <w:r>
+        <w:t xml:space="preserve"> </w:t>
+      </w:r>
+      <w:hyperlink r:id="rId15">
+        <w:r>
+          <w:rPr>
+            <w:rStyle w:val="Hyperlink"/>
+          </w:rPr>
+          <w:t xml:space="preserve">anartuvshinbayar1@gmail.com</w:t>
+        </w:r>
+      </w:hyperlink>
+      <w:r>
+        <w:t xml:space="preserve"> </w:t>
+      </w:r>
+      <w:r>
+        <w:t xml:space="preserve">· Website: hack-touchgrass.com · Uram Enerel NGO's registration and bank details come with the contract.</w:t>
+      </w:r>
+    </w:p>
+    <w:bookmarkEnd w:id="16"/>
+    <w:bookmarkEnd w:id="17"/>
     <w:sectPr>
       <w:footnotePr>
         <w:numRestart w:val="eachSect"/>
@@ -112,8 +1392,123 @@
       </w:pPr>
     </w:lvl>
   </w:abstractNum>
+  <w:abstractNum w:abstractNumId="99411">
+    <w:nsid w:val="00A99411"/>
+    <w:multiLevelType w:val="multilevel"/>
+    <w:lvl w:ilvl="0">
+      <w:start w:val="1"/>
+      <w:numFmt w:val="decimal"/>
+      <w:lvlText w:val="%1."/>
+      <w:lvlJc w:val="left"/>
+      <w:pPr>
+        <w:ind w:left="720" w:hanging="360"/>
+      </w:pPr>
+    </w:lvl>
+    <w:lvl w:ilvl="1">
+      <w:start w:val="1"/>
+      <w:numFmt w:val="decimal"/>
+      <w:lvlText w:val="%2."/>
+      <w:lvlJc w:val="left"/>
+      <w:pPr>
+        <w:ind w:left="1440" w:hanging="360"/>
+      </w:pPr>
+    </w:lvl>
+    <w:lvl w:ilvl="2">
+      <w:start w:val="1"/>
+      <w:numFmt w:val="decimal"/>
+      <w:lvlText w:val="%3."/>
+      <w:lvlJc w:val="left"/>
+      <w:pPr>
+        <w:ind w:left="2160" w:hanging="360"/>
+      </w:pPr>
+    </w:lvl>
+    <w:lvl w:ilvl="3">
+      <w:start w:val="1"/>
+      <w:numFmt w:val="decimal"/>
+      <w:lvlText w:val="%4."/>
+      <w:lvlJc w:val="left"/>
+      <w:pPr>
+        <w:ind w:left="2880" w:hanging="360"/>
+      </w:pPr>
+    </w:lvl>
+    <w:lvl w:ilvl="4">
+      <w:start w:val="1"/>
+      <w:numFmt w:val="decimal"/>
+      <w:lvlText w:val="%5."/>
+      <w:lvlJc w:val="left"/>
+      <w:pPr>
+        <w:ind w:left="3600" w:hanging="360"/>
+      </w:pPr>
+    </w:lvl>
+    <w:lvl w:ilvl="5">
+      <w:start w:val="1"/>
+      <w:numFmt w:val="decimal"/>
+      <w:lvlText w:val="%6."/>
+      <w:lvlJc w:val="left"/>
+      <w:pPr>
+        <w:ind w:left="4320" w:hanging="360"/>
+      </w:pPr>
+    </w:lvl>
+    <w:lvl w:ilvl="6">
+      <w:start w:val="1"/>
+      <w:numFmt w:val="decimal"/>
+      <w:lvlText w:val="%7."/>
+      <w:lvlJc w:val="left"/>
+      <w:pPr>
+        <w:ind w:left="5040" w:hanging="360"/>
+      </w:pPr>
+    </w:lvl>
+    <w:lvl w:ilvl="7">
+      <w:start w:val="1"/>
+      <w:numFmt w:val="decimal"/>
+      <w:lvlText w:val="%8."/>
+      <w:lvlJc w:val="left"/>
+      <w:pPr>
+        <w:ind w:left="5760" w:hanging="360"/>
+      </w:pPr>
+    </w:lvl>
+    <w:lvl w:ilvl="8">
+      <w:start w:val="1"/>
+      <w:numFmt w:val="decimal"/>
+      <w:lvlText w:val="%9."/>
+      <w:lvlJc w:val="left"/>
+      <w:pPr>
+        <w:ind w:left="6480" w:hanging="360"/>
+      </w:pPr>
+    </w:lvl>
+  </w:abstractNum>
   <w:num w:numId="1000">
     <w:abstractNumId w:val="990"/>
+  </w:num>
+  <w:num w:numId="1001">
+    <w:abstractNumId w:val="99411"/>
+    <w:lvlOverride w:ilvl="0">
+      <w:startOverride w:val="1"/>
+    </w:lvlOverride>
+    <w:lvlOverride w:ilvl="1">
+      <w:startOverride w:val="1"/>
+    </w:lvlOverride>
+    <w:lvlOverride w:ilvl="2">
+      <w:startOverride w:val="1"/>
+    </w:lvlOverride>
+    <w:lvlOverride w:ilvl="3">
+      <w:startOverride w:val="1"/>
+    </w:lvlOverride>
+    <w:lvlOverride w:ilvl="4">
+      <w:startOverride w:val="1"/>
+    </w:lvlOverride>
+    <w:lvlOverride w:ilvl="5">
+      <w:startOverride w:val="1"/>
+    </w:lvlOverride>
+    <w:lvlOverride w:ilvl="6">
+      <w:startOverride w:val="1"/>
+    </w:lvlOverride>
+    <w:lvlOverride w:ilvl="7">
+      <w:startOverride w:val="1"/>
+    </w:lvlOverride>
+    <w:lvlOverride w:ilvl="8">
+      <w:startOverride w:val="1"/>
+    </w:lvlOverride>
   </w:num>
 </w:numbering>
 </file>

</xml_diff>

<commit_message>
Ages 16 to 26
</commit_message>
<xml_diff>
--- a/docs/01-sponsorship-proposal.docx
+++ b/docs/01-sponsorship-proposal.docx
@@ -189,7 +189,7 @@
         <w:t xml:space="preserve"> </w:t>
       </w:r>
       <w:r>
-        <w:t xml:space="preserve">Secondary school and university students aged 14 to 20, from 25+ institutions; participation is 45,000 MNT per person. Mentors from industry and universities; a judging panel of engineers, doctors, educators, AI professionals and sponsor representatives.</w:t>
+        <w:t xml:space="preserve">People aged 16 to 26: high school and university students, gap-year students and young people who already work, from 25+ institutions; participation is 45,000 MNT per person. Mentors from industry and universities; a judging panel of engineers, doctors, educators, AI professionals and sponsor representatives.</w:t>
       </w:r>
     </w:p>
     <w:p>
@@ -472,7 +472,7 @@
               <w:pStyle w:val="Compact"/>
             </w:pPr>
             <w:r>
-              <w:t xml:space="preserve">220+ students aged 14 to 20; 45,000 MNT participation fee; parental consent for under-18s</w:t>
+              <w:t xml:space="preserve">220+ participants aged 16 to 26; 45,000 MNT participation fee; parental consent for under-18s</w:t>
             </w:r>
           </w:p>
         </w:tc>

</xml_diff>

<commit_message>
Gold: 2M into the top-3 pool plus an in-kind prize for the track winner; track cash prizes removed from the budget
</commit_message>
<xml_diff>
--- a/docs/01-sponsorship-proposal.docx
+++ b/docs/01-sponsorship-proposal.docx
@@ -239,7 +239,7 @@
         <w:t xml:space="preserve"> </w:t>
       </w:r>
       <w:r>
-        <w:t xml:space="preserve">sponsors at 2,000,000 MNT, one per track, whose money becomes that track's cash prize; and</w:t>
+        <w:t xml:space="preserve">sponsors at 2,000,000 MNT, one per track, whose money goes into the top-three prize pool and who give their own track's winner a prize in kind (products, credits, a pilot or mentoring); and</w:t>
       </w:r>
       <w:r>
         <w:t xml:space="preserve"> </w:t>
@@ -255,7 +255,7 @@
         <w:t xml:space="preserve"> </w:t>
       </w:r>
       <w:r>
-        <w:t xml:space="preserve">sponsors at 1,000,000 to 2,000,000 MNT or in kind for food, shirts and services. The prize pool for the top three teams starts at 5,000,000 MNT and grows with Platinum commitments; each of the five track winners receives 2,000,000 MNT.</w:t>
+        <w:t xml:space="preserve">sponsors at 1,000,000 to 2,000,000 MNT or in kind for food, shirts and services. The prize pool for the top three teams starts at 5,000,000 MNT and grows with every Gold and Platinum commitment; each of the five track winners receives its track sponsor's prize.</w:t>
       </w:r>
       <w:r>
         <w:t xml:space="preserve"> </w:t>
@@ -789,7 +789,7 @@
               <w:pStyle w:val="Compact"/>
             </w:pPr>
             <w:r>
-              <w:t xml:space="preserve">a track carries your name ("Healthcare track by [You]"); your 2,000,000 is that track's cash prize, which you hand to the winning team; a judge on its panel; an optional challenge you set; logo on the shirt and website</w:t>
+              <w:t xml:space="preserve">a track carries your name ("Healthcare track by [You]"); your 2,000,000 goes into the top-three prize pool, and you give your track's winning team a prize of your own (products, credits, a pilot or mentoring), handed over on stage; a judge on its panel; an optional challenge you set; logo on the shirt and website</w:t>
             </w:r>
           </w:p>
         </w:tc>
@@ -987,18 +987,18 @@
               <w:pStyle w:val="Compact"/>
             </w:pPr>
             <w:r>
-              <w:t xml:space="preserve">Track prizes, 2,000,000 for each of five track winners, paid by the five Gold sponsors</w:t>
-            </w:r>
-          </w:p>
-        </w:tc>
-        <w:tc>
-          <w:tcPr/>
-          <w:p>
-            <w:pPr>
-              <w:pStyle w:val="Compact"/>
-            </w:pPr>
-            <w:r>
-              <w:t xml:space="preserve">10,000,000</w:t>
+              <w:t xml:space="preserve">T-shirts, stickers, badges</w:t>
+            </w:r>
+          </w:p>
+        </w:tc>
+        <w:tc>
+          <w:tcPr/>
+          <w:p>
+            <w:pPr>
+              <w:pStyle w:val="Compact"/>
+            </w:pPr>
+            <w:r>
+              <w:t xml:space="preserve">4,400,000</w:t>
             </w:r>
           </w:p>
         </w:tc>
@@ -1011,18 +1011,18 @@
               <w:pStyle w:val="Compact"/>
             </w:pPr>
             <w:r>
-              <w:t xml:space="preserve">T-shirts, stickers, badges</w:t>
-            </w:r>
-          </w:p>
-        </w:tc>
-        <w:tc>
-          <w:tcPr/>
-          <w:p>
-            <w:pPr>
-              <w:pStyle w:val="Compact"/>
-            </w:pPr>
-            <w:r>
-              <w:t xml:space="preserve">4,400,000</w:t>
+              <w:t xml:space="preserve">Judges, designers, finance support</w:t>
+            </w:r>
+          </w:p>
+        </w:tc>
+        <w:tc>
+          <w:tcPr/>
+          <w:p>
+            <w:pPr>
+              <w:pStyle w:val="Compact"/>
+            </w:pPr>
+            <w:r>
+              <w:t xml:space="preserve">3,000,000</w:t>
             </w:r>
           </w:p>
         </w:tc>
@@ -1035,18 +1035,18 @@
               <w:pStyle w:val="Compact"/>
             </w:pPr>
             <w:r>
-              <w:t xml:space="preserve">Judges, designers, finance support</w:t>
-            </w:r>
-          </w:p>
-        </w:tc>
-        <w:tc>
-          <w:tcPr/>
-          <w:p>
-            <w:pPr>
-              <w:pStyle w:val="Compact"/>
-            </w:pPr>
-            <w:r>
-              <w:t xml:space="preserve">3,000,000</w:t>
+              <w:t xml:space="preserve">Power, supplies, first aid, printing, signage</w:t>
+            </w:r>
+          </w:p>
+        </w:tc>
+        <w:tc>
+          <w:tcPr/>
+          <w:p>
+            <w:pPr>
+              <w:pStyle w:val="Compact"/>
+            </w:pPr>
+            <w:r>
+              <w:t xml:space="preserve">3,200,000</w:t>
             </w:r>
           </w:p>
         </w:tc>
@@ -1059,18 +1059,18 @@
               <w:pStyle w:val="Compact"/>
             </w:pPr>
             <w:r>
-              <w:t xml:space="preserve">Power, supplies, first aid, printing, signage</w:t>
-            </w:r>
-          </w:p>
-        </w:tc>
-        <w:tc>
-          <w:tcPr/>
-          <w:p>
-            <w:pPr>
-              <w:pStyle w:val="Compact"/>
-            </w:pPr>
-            <w:r>
-              <w:t xml:space="preserve">3,200,000</w:t>
+              <w:t xml:space="preserve">Photography, security, cleaning, first aider</w:t>
+            </w:r>
+          </w:p>
+        </w:tc>
+        <w:tc>
+          <w:tcPr/>
+          <w:p>
+            <w:pPr>
+              <w:pStyle w:val="Compact"/>
+            </w:pPr>
+            <w:r>
+              <w:t xml:space="preserve">1,900,000</w:t>
             </w:r>
           </w:p>
         </w:tc>
@@ -1083,30 +1083,6 @@
               <w:pStyle w:val="Compact"/>
             </w:pPr>
             <w:r>
-              <w:t xml:space="preserve">Photography, security, cleaning, first aider</w:t>
-            </w:r>
-          </w:p>
-        </w:tc>
-        <w:tc>
-          <w:tcPr/>
-          <w:p>
-            <w:pPr>
-              <w:pStyle w:val="Compact"/>
-            </w:pPr>
-            <w:r>
-              <w:t xml:space="preserve">1,900,000</w:t>
-            </w:r>
-          </w:p>
-        </w:tc>
-      </w:tr>
-      <w:tr>
-        <w:tc>
-          <w:tcPr/>
-          <w:p>
-            <w:pPr>
-              <w:pStyle w:val="Compact"/>
-            </w:pPr>
-            <w:r>
               <w:t xml:space="preserve">Contingency 10%</w:t>
             </w:r>
           </w:p>
@@ -1118,7 +1094,7 @@
               <w:pStyle w:val="Compact"/>
             </w:pPr>
             <w:r>
-              <w:t xml:space="preserve">5,750,000 to 6,750,000</w:t>
+              <w:t xml:space="preserve">4,750,000 to 5,750,000</w:t>
             </w:r>
           </w:p>
         </w:tc>
@@ -1150,7 +1126,7 @@
                 <w:b/>
                 <w:bCs/>
               </w:rPr>
-              <w:t xml:space="preserve">63,000,000 to 74,000,000</w:t>
+              <w:t xml:space="preserve">52,000,000 to 63,000,000</w:t>
             </w:r>
             <w:r>
               <w:t xml:space="preserve">, about 20,000,000 less if the hall is in kind</w:t>

</xml_diff>

<commit_message>
Revert "Gold: 2M into the top-3 pool plus an in-kind prize for the track winner; track cash prizes removed from the budget"
This reverts commit b67d93606014b1306ff30df3d594109df9cfce3c.
</commit_message>
<xml_diff>
--- a/docs/01-sponsorship-proposal.docx
+++ b/docs/01-sponsorship-proposal.docx
@@ -239,7 +239,7 @@
         <w:t xml:space="preserve"> </w:t>
       </w:r>
       <w:r>
-        <w:t xml:space="preserve">sponsors at 2,000,000 MNT, one per track, whose money goes into the top-three prize pool and who give their own track's winner a prize in kind (products, credits, a pilot or mentoring); and</w:t>
+        <w:t xml:space="preserve">sponsors at 2,000,000 MNT, one per track, whose money becomes that track's cash prize; and</w:t>
       </w:r>
       <w:r>
         <w:t xml:space="preserve"> </w:t>
@@ -255,7 +255,7 @@
         <w:t xml:space="preserve"> </w:t>
       </w:r>
       <w:r>
-        <w:t xml:space="preserve">sponsors at 1,000,000 to 2,000,000 MNT or in kind for food, shirts and services. The prize pool for the top three teams starts at 5,000,000 MNT and grows with every Gold and Platinum commitment; each of the five track winners receives its track sponsor's prize.</w:t>
+        <w:t xml:space="preserve">sponsors at 1,000,000 to 2,000,000 MNT or in kind for food, shirts and services. The prize pool for the top three teams starts at 5,000,000 MNT and grows with Platinum commitments; each of the five track winners receives 2,000,000 MNT.</w:t>
       </w:r>
       <w:r>
         <w:t xml:space="preserve"> </w:t>
@@ -789,7 +789,7 @@
               <w:pStyle w:val="Compact"/>
             </w:pPr>
             <w:r>
-              <w:t xml:space="preserve">a track carries your name ("Healthcare track by [You]"); your 2,000,000 goes into the top-three prize pool, and you give your track's winning team a prize of your own (products, credits, a pilot or mentoring), handed over on stage; a judge on its panel; an optional challenge you set; logo on the shirt and website</w:t>
+              <w:t xml:space="preserve">a track carries your name ("Healthcare track by [You]"); your 2,000,000 is that track's cash prize, which you hand to the winning team; a judge on its panel; an optional challenge you set; logo on the shirt and website</w:t>
             </w:r>
           </w:p>
         </w:tc>
@@ -987,18 +987,18 @@
               <w:pStyle w:val="Compact"/>
             </w:pPr>
             <w:r>
-              <w:t xml:space="preserve">T-shirts, stickers, badges</w:t>
-            </w:r>
-          </w:p>
-        </w:tc>
-        <w:tc>
-          <w:tcPr/>
-          <w:p>
-            <w:pPr>
-              <w:pStyle w:val="Compact"/>
-            </w:pPr>
-            <w:r>
-              <w:t xml:space="preserve">4,400,000</w:t>
+              <w:t xml:space="preserve">Track prizes, 2,000,000 for each of five track winners, paid by the five Gold sponsors</w:t>
+            </w:r>
+          </w:p>
+        </w:tc>
+        <w:tc>
+          <w:tcPr/>
+          <w:p>
+            <w:pPr>
+              <w:pStyle w:val="Compact"/>
+            </w:pPr>
+            <w:r>
+              <w:t xml:space="preserve">10,000,000</w:t>
             </w:r>
           </w:p>
         </w:tc>
@@ -1011,18 +1011,18 @@
               <w:pStyle w:val="Compact"/>
             </w:pPr>
             <w:r>
-              <w:t xml:space="preserve">Judges, designers, finance support</w:t>
-            </w:r>
-          </w:p>
-        </w:tc>
-        <w:tc>
-          <w:tcPr/>
-          <w:p>
-            <w:pPr>
-              <w:pStyle w:val="Compact"/>
-            </w:pPr>
-            <w:r>
-              <w:t xml:space="preserve">3,000,000</w:t>
+              <w:t xml:space="preserve">T-shirts, stickers, badges</w:t>
+            </w:r>
+          </w:p>
+        </w:tc>
+        <w:tc>
+          <w:tcPr/>
+          <w:p>
+            <w:pPr>
+              <w:pStyle w:val="Compact"/>
+            </w:pPr>
+            <w:r>
+              <w:t xml:space="preserve">4,400,000</w:t>
             </w:r>
           </w:p>
         </w:tc>
@@ -1035,18 +1035,18 @@
               <w:pStyle w:val="Compact"/>
             </w:pPr>
             <w:r>
-              <w:t xml:space="preserve">Power, supplies, first aid, printing, signage</w:t>
-            </w:r>
-          </w:p>
-        </w:tc>
-        <w:tc>
-          <w:tcPr/>
-          <w:p>
-            <w:pPr>
-              <w:pStyle w:val="Compact"/>
-            </w:pPr>
-            <w:r>
-              <w:t xml:space="preserve">3,200,000</w:t>
+              <w:t xml:space="preserve">Judges, designers, finance support</w:t>
+            </w:r>
+          </w:p>
+        </w:tc>
+        <w:tc>
+          <w:tcPr/>
+          <w:p>
+            <w:pPr>
+              <w:pStyle w:val="Compact"/>
+            </w:pPr>
+            <w:r>
+              <w:t xml:space="preserve">3,000,000</w:t>
             </w:r>
           </w:p>
         </w:tc>
@@ -1059,18 +1059,18 @@
               <w:pStyle w:val="Compact"/>
             </w:pPr>
             <w:r>
-              <w:t xml:space="preserve">Photography, security, cleaning, first aider</w:t>
-            </w:r>
-          </w:p>
-        </w:tc>
-        <w:tc>
-          <w:tcPr/>
-          <w:p>
-            <w:pPr>
-              <w:pStyle w:val="Compact"/>
-            </w:pPr>
-            <w:r>
-              <w:t xml:space="preserve">1,900,000</w:t>
+              <w:t xml:space="preserve">Power, supplies, first aid, printing, signage</w:t>
+            </w:r>
+          </w:p>
+        </w:tc>
+        <w:tc>
+          <w:tcPr/>
+          <w:p>
+            <w:pPr>
+              <w:pStyle w:val="Compact"/>
+            </w:pPr>
+            <w:r>
+              <w:t xml:space="preserve">3,200,000</w:t>
             </w:r>
           </w:p>
         </w:tc>
@@ -1083,6 +1083,30 @@
               <w:pStyle w:val="Compact"/>
             </w:pPr>
             <w:r>
+              <w:t xml:space="preserve">Photography, security, cleaning, first aider</w:t>
+            </w:r>
+          </w:p>
+        </w:tc>
+        <w:tc>
+          <w:tcPr/>
+          <w:p>
+            <w:pPr>
+              <w:pStyle w:val="Compact"/>
+            </w:pPr>
+            <w:r>
+              <w:t xml:space="preserve">1,900,000</w:t>
+            </w:r>
+          </w:p>
+        </w:tc>
+      </w:tr>
+      <w:tr>
+        <w:tc>
+          <w:tcPr/>
+          <w:p>
+            <w:pPr>
+              <w:pStyle w:val="Compact"/>
+            </w:pPr>
+            <w:r>
               <w:t xml:space="preserve">Contingency 10%</w:t>
             </w:r>
           </w:p>
@@ -1094,7 +1118,7 @@
               <w:pStyle w:val="Compact"/>
             </w:pPr>
             <w:r>
-              <w:t xml:space="preserve">4,750,000 to 5,750,000</w:t>
+              <w:t xml:space="preserve">5,750,000 to 6,750,000</w:t>
             </w:r>
           </w:p>
         </w:tc>
@@ -1126,7 +1150,7 @@
                 <w:b/>
                 <w:bCs/>
               </w:rPr>
-              <w:t xml:space="preserve">52,000,000 to 63,000,000</w:t>
+              <w:t xml:space="preserve">63,000,000 to 74,000,000</w:t>
             </w:r>
             <w:r>
               <w:t xml:space="preserve">, about 20,000,000 less if the hall is in kind</w:t>

</xml_diff>

<commit_message>
Mongolian or English: each team chooses
</commit_message>
<xml_diff>
--- a/docs/01-sponsorship-proposal.docx
+++ b/docs/01-sponsorship-proposal.docx
@@ -64,7 +64,7 @@
         <w:t xml:space="preserve"> </w:t>
       </w:r>
       <w:r>
-        <w:t xml:space="preserve">A 24-hour hackathon where 220+ young people in about 55 teams build working prototypes for real problems. Five tracks on the model of Stanford's TreeHacks: Healthcare, Sustainability, Education, Humanity and AI. Software only. The event runs in English. Teams start Saturday 13:00 and submit Sunday 13:00; professional judges score every team; the best in each track presents on stage.</w:t>
+        <w:t xml:space="preserve">A 24-hour hackathon where 220+ young people in about 55 teams build working prototypes for real problems. Five tracks on the model of Stanford's TreeHacks: Healthcare, Sustainability, Education, Humanity and AI. Software only. Each team chooses to work and present in Mongolian or English. Teams start Saturday 13:00 and submit Sunday 13:00; professional judges score every team; the best in each track presents on stage.</w:t>
       </w:r>
     </w:p>
     <w:p>
@@ -424,7 +424,7 @@
               <w:pStyle w:val="Compact"/>
             </w:pPr>
             <w:r>
-              <w:t xml:space="preserve">24 hours in person, overnight at the venue with adult supervision; teams of 2 to 4; in English</w:t>
+              <w:t xml:space="preserve">24 hours in person, overnight at the venue with adult supervision; teams of 2 to 4; Mongolian or English, each team's choice</w:t>
             </w:r>
           </w:p>
         </w:tc>

</xml_diff>